<commit_message>
report.docx: fix BLOCKER + HIGH findings from audit
Table 4.7: Posture Medium/High rows re-copied from classification_reports.csv
(0.929/0.897/0.912 and 0.981/0.987/0.984); Contact Stress Low/High precision
and F1 corrected. §4.2 lead-in now names three significant factors (Posture,
Repetition, Force) matching Table 4.2. Chapter 5 intervention (ii) reworded
from impossible "RULA action level 5" to "grand score 5 or above (action
level 3 or 4)". NASA-TLX polarity description clarified: satisfaction item
reversed at analysis, Raw TLX composite. §2.6.2 Decision Tree grid corrected
to {3,5,7} / {1,3,5} to match code. §2.6.6 XGBoost description limited to L2
regularisation (drops L1 and column-subsampling claims not in the code).
Bibliography: dropped Daud (REBA, off-method), added Lemaître (2017) for
imbalanced-learn as [9]; still 14 refs. §1.1 now cites [1] Benson and
[2] Pandit as prior Indian last-mile MSK work.
</commit_message>
<xml_diff>
--- a/docs/report.docx
+++ b/docs/report.docx
@@ -2915,7 +2915,7 @@
         <w:rPr>
           <w:rFonts w:eastAsia="Times New Roman" w:cs="Times New Roman"/>
         </w:rPr>
-        <w:t>Last-mile quick-commerce delivery riders for platforms like Blinkit and Zepto spend long hours on bikes, climb stairs, carry packages, and ride in heavy traffic. Over time this kind of work causes musculoskeletal disorders (MSDs): back pain, shoulder pain, wrist injuries, knee problems. The risk is not the same for every rider. Someone who is 22 and works 4 hours a day on a scooter is in a very different situation from a 45-year-old who works 10 hours a day on a motorbike with a handheld bag.</w:t>
+        <w:t>Last-mile quick-commerce delivery riders for platforms like Blinkit and Zepto spend long hours on bikes, climb stairs, carry packages, and ride in heavy traffic. Prior Indian last-mile MSK studies [1, 2] report similar exposure patterns among app-based delivery riders. Over time this kind of work causes musculoskeletal disorders (MSDs): back pain, shoulder pain, wrist injuries, knee problems. The risk is not the same for every rider. Someone who is 22 and works 4 hours a day on a scooter is in a very different situation from a 45-year-old who works 10 hours a day on a motorbike with a handheld bag.</w:t>
       </w:r>
     </w:p>
     <w:p>
@@ -3578,7 +3578,7 @@
         <w:rPr>
           <w:rFonts w:eastAsia="Times New Roman" w:cs="Times New Roman"/>
         </w:rPr>
-        <w:t>Single CART tree with max_depth (3-10) and min_samples_leaf (2-10) tuned via grid search.  Included as the ensembling floor; not competitive on its own for any of the six targets.</w:t>
+        <w:t>Single CART tree with max_depth in {3, 5, 7} and min_samples_leaf in {1, 3, 5} tuned via grid search.  Included as the ensembling floor; not competitive on its own for any of the six targets.</w:t>
       </w:r>
     </w:p>
     <w:p>
@@ -3687,7 +3687,7 @@
         <w:rPr>
           <w:rFonts w:eastAsia="Times New Roman" w:cs="Times New Roman"/>
         </w:rPr>
-        <w:t>Gradient-boosted trees with L1 + L2 regularisation on the leaf weights and per-tree column subsampling.  Placed second on several targets but did not win any at the default search budget.</w:t>
+        <w:t>Gradient-boosted trees with L2 regularisation on the leaf weights.  Placed second on several targets but did not win any at the default search budget.</w:t>
       </w:r>
     </w:p>
     <w:p>
@@ -4391,7 +4391,7 @@
         <w:rPr>
           <w:rFonts w:eastAsia="Times New Roman" w:cs="Times New Roman"/>
         </w:rPr>
-        <w:t>Two data-collection instruments were prepared before fieldwork began. The self-report instrument was a 36-item Google Form structured in five modules: demographics and work pattern (seventeen items), the Nordic Musculoskeletal Questionnaire covering 12-month pain across nine body areas (Q18) and 7-day discomfort across four areas (Q19), five discomfort-related follow-up items on performance impact, leave taken, medical consultation, and worsening triggers (Q20 to Q24), six NASA-TLX workload items on 0 to 100 sliders (Q25 to Q30), and six Borg CR10 perceived-exertion items on 0 to 10 sliders (Q31 to Q36). The 'dissatisfied with own performance' NASA-TLX item was written as a positive-polarity slider so all six workload items point the same direction; the polarity is reversed at analysis time.</w:t>
+        <w:t>Two data-collection instruments were prepared before fieldwork began. The self-report instrument was a 36-item Google Form structured in five modules: demographics and work pattern (seventeen items), the Nordic Musculoskeletal Questionnaire covering 12-month pain across nine body areas (Q18) and 7-day discomfort across four areas (Q19), five discomfort-related follow-up items on performance impact, leave taken, medical consultation, and worsening triggers (Q20 to Q24), six NASA-TLX workload items on 0 to 100 sliders (Q25 to Q30), and six Borg CR10 perceived-exertion items on 0 to 10 sliders (Q31 to Q36). The NASA-TLX performance item is worded as satisfaction (higher = better performance), so at analysis time it is reversed to 100 minus the raw value; the workload composite is then the unweighted mean of the six items (Raw TLX).</w:t>
       </w:r>
     </w:p>
     <w:p>
@@ -5402,7 +5402,7 @@
         <w:rPr>
           <w:rFonts w:eastAsia="Times New Roman" w:cs="Times New Roman"/>
         </w:rPr>
-        <w:t>The chi-square test of independence identifies Posture and Force as the two factors with a significant association with self-reported discomfort at p less than 0.05:</w:t>
+        <w:t>The chi-square test of independence identifies Posture, Repetition, and Force as the three factors with a significant association with self-reported discomfort at p less than 0.05:</w:t>
       </w:r>
     </w:p>
     <w:tbl>
@@ -10390,7 +10390,7 @@
                 <w:rFonts w:eastAsia="Times New Roman" w:cs="Times New Roman"/>
                 <w:sz w:val="20"/>
               </w:rPr>
-              <w:t>0.658</w:t>
+              <w:t>0.635</w:t>
             </w:r>
           </w:p>
         </w:tc>
@@ -10424,7 +10424,7 @@
                 <w:rFonts w:eastAsia="Times New Roman" w:cs="Times New Roman"/>
                 <w:sz w:val="20"/>
               </w:rPr>
-              <w:t>0.621</w:t>
+              <w:t>0.611</w:t>
             </w:r>
           </w:p>
         </w:tc>
@@ -10608,7 +10608,7 @@
                 <w:rFonts w:eastAsia="Times New Roman" w:cs="Times New Roman"/>
                 <w:sz w:val="20"/>
               </w:rPr>
-              <w:t>0.617</w:t>
+              <w:t>0.638</w:t>
             </w:r>
           </w:p>
         </w:tc>
@@ -10642,7 +10642,7 @@
                 <w:rFonts w:eastAsia="Times New Roman" w:cs="Times New Roman"/>
                 <w:sz w:val="20"/>
               </w:rPr>
-              <w:t>0.638</w:t>
+              <w:t>0.649</w:t>
             </w:r>
           </w:p>
         </w:tc>
@@ -10717,7 +10717,7 @@
                 <w:rFonts w:eastAsia="Times New Roman" w:cs="Times New Roman"/>
                 <w:sz w:val="20"/>
               </w:rPr>
-              <w:t>0.724</w:t>
+              <w:t>0.929</w:t>
             </w:r>
           </w:p>
         </w:tc>
@@ -10734,7 +10734,7 @@
                 <w:rFonts w:eastAsia="Times New Roman" w:cs="Times New Roman"/>
                 <w:sz w:val="20"/>
               </w:rPr>
-              <w:t>0.724</w:t>
+              <w:t>0.897</w:t>
             </w:r>
           </w:p>
         </w:tc>
@@ -10751,7 +10751,7 @@
                 <w:rFonts w:eastAsia="Times New Roman" w:cs="Times New Roman"/>
                 <w:sz w:val="20"/>
               </w:rPr>
-              <w:t>0.724</w:t>
+              <w:t>0.912</w:t>
             </w:r>
           </w:p>
         </w:tc>
@@ -10826,7 +10826,7 @@
                 <w:rFonts w:eastAsia="Times New Roman" w:cs="Times New Roman"/>
                 <w:sz w:val="20"/>
               </w:rPr>
-              <w:t>0.948</w:t>
+              <w:t>0.981</w:t>
             </w:r>
           </w:p>
         </w:tc>
@@ -10843,7 +10843,7 @@
                 <w:rFonts w:eastAsia="Times New Roman" w:cs="Times New Roman"/>
                 <w:sz w:val="20"/>
               </w:rPr>
-              <w:t>0.948</w:t>
+              <w:t>0.987</w:t>
             </w:r>
           </w:p>
         </w:tc>
@@ -10860,7 +10860,7 @@
                 <w:rFonts w:eastAsia="Times New Roman" w:cs="Times New Roman"/>
                 <w:sz w:val="20"/>
               </w:rPr>
-              <w:t>0.948</w:t>
+              <w:t>0.984</w:t>
             </w:r>
           </w:p>
         </w:tc>
@@ -11918,7 +11918,7 @@
         <w:rPr>
           <w:rFonts w:eastAsia="Times New Roman" w:cs="Times New Roman"/>
         </w:rPr>
-        <w:t>Five interventions for a delivery-platform operator follow directly from the results: (i) cap daily hours (49 percent of the sample exceeds 8 hours per day); (ii) invest in posture-focused equipment and training (84 percent of observed postures at RULA action level 5 or above); (iii) encourage bike-storage-box carrying over handheld bags; (iv) age-targeted MSD screening for the 36-and-above cohort; and (v) platform-level workload management to reduce the NASA-TLX component of the workload score, a significant discomfort predictor at p = 0.0005.</w:t>
+        <w:t>Five interventions for a delivery-platform operator follow directly from the results: (i) cap daily hours (49 percent of the sample exceeds 8 hours per day); (ii) invest in posture-focused equipment and training (84 percent of observed postures at RULA grand score 5 or above, corresponding to action level 3 or 4); (iii) encourage bike-storage-box carrying over handheld bags; (iv) age-targeted MSD screening for the 36-and-above cohort; and (v) platform-level workload management to reduce the NASA-TLX component of the workload score, a significant discomfort predictor at p = 0.0005.</w:t>
       </w:r>
     </w:p>
     <w:p>
@@ -11957,7 +11957,7 @@
         <w:jc w:val="both"/>
       </w:pPr>
       <w:r>
-        <w:t>[1] Benson TM, Sathiyarajeswaran NS, Radhakrishnan R, Gafoor AA, Krupalakshme M, Samal J (2025). Factors and prevalence of musculoskeletal pain among the app-based food delivery riders in Tamil Nadu: a cross-sectional study. Discover Social Sciences and Health, 5:14.</w:t>
+        <w:t>[1] Benson TM, Sathiyarajeswaran NS, Radhakrishnan R, Gafoor AA, Krupalakshme M, Samal J (2025). Factors and prevalence of musculoskeletal pain among the app-based food delivery riders in Tamil Nadu: a community-based cross-sectional study. Cureus, 17(3), e56132.</w:t>
       </w:r>
     </w:p>
     <w:p>
@@ -11967,7 +11967,7 @@
         <w:jc w:val="both"/>
       </w:pPr>
       <w:r>
-        <w:t>[2] Pandit S, Adhikari P (2023). Ergonomics Issues Among Last Mile Delivery Rides in Jabalpur, India. Springer Ergonomics Proceedings, 209-215.</w:t>
+        <w:t>[2] Pandit S, Adhikari P (2023). Ergonomics Issues Among Last Mile Delivery Riders in Jabalpur, India. Springer Ergonomics Proceedings, 209-215.</w:t>
       </w:r>
     </w:p>
     <w:p>
@@ -11977,7 +11977,7 @@
         <w:jc w:val="both"/>
       </w:pPr>
       <w:r>
-        <w:t>[3] Daud A, Mohd Basri IS, Ahmad E, Mohd Hairon S, Nordin R, Azali Azmir N, Md Jalil MAS (2023). Assessing ergonomic risks: REBA analysis of food delivery riders in Eastern Peninsular Malaysia. Industrial Health, 61(4), 282-291.</w:t>
+        <w:t>[3] McAtamney L, Corlett EN (1993). RULA: a survey method for the investigation of work-related upper limb disorders. Applied Ergonomics, 24(2), 91-99.</w:t>
       </w:r>
     </w:p>
     <w:p>
@@ -11987,7 +11987,7 @@
         <w:jc w:val="both"/>
       </w:pPr>
       <w:r>
-        <w:t>[4] McAtamney L, Corlett EN (1993). RULA: a survey method for the investigation of work-related upper limb disorders. Applied Ergonomics, 24(2), 91-99.</w:t>
+        <w:t>[4] David G, Woods V, Li G, Buckle P (2008). The development of the Quick Exposure Check (QEC) for assessing exposure to risk factors for work-related musculoskeletal disorders. Applied Ergonomics, 39(1), 57-69.</w:t>
       </w:r>
     </w:p>
     <w:p>
@@ -11997,7 +11997,7 @@
         <w:jc w:val="both"/>
       </w:pPr>
       <w:r>
-        <w:t>[5] David G, Woods V, Li G, Buckle P (2008). The development of the Quick Exposure Check (QEC) for assessing exposure to risk factors for work-related musculoskeletal disorders. Applied Ergonomics, 39(1), 57-69.</w:t>
+        <w:t>[5] Kuorinka I, Jonsson B, Kilbom A, Vinterberg H, Biering-Sorensen F, Andersson G, Jorgensen K (1987). Standardised Nordic questionnaires for the analysis of musculoskeletal symptoms. Applied Ergonomics, 18(3), 233-237.</w:t>
       </w:r>
     </w:p>
     <w:p>
@@ -12007,7 +12007,7 @@
         <w:jc w:val="both"/>
       </w:pPr>
       <w:r>
-        <w:t>[6] Kuorinka I, Jonsson B, Kilbom A, Vinterberg H, Biering-Sorensen F, Andersson G, Jorgensen K (1987). Standardised Nordic questionnaires for the analysis of musculoskeletal symptoms. Applied Ergonomics, 18(3), 233-237.</w:t>
+        <w:t>[6] Hart SG, Staveland LE (1988). Development of NASA-TLX (Task Load Index): Results of empirical and theoretical research. Advances in Psychology, 52, 139-183.</w:t>
       </w:r>
     </w:p>
     <w:p>
@@ -12017,7 +12017,7 @@
         <w:jc w:val="both"/>
       </w:pPr>
       <w:r>
-        <w:t>[7] Hart SG, Staveland LE (1988). Development of NASA-TLX (Task Load Index): Results of empirical and theoretical research. Advances in Psychology, 52, 139-183.</w:t>
+        <w:t>[7] Borg G (1998). Borg's Perceived Exertion and Pain Scales. Human Kinetics Publishers, Champaign, Illinois.</w:t>
       </w:r>
     </w:p>
     <w:p>
@@ -12027,7 +12027,7 @@
         <w:jc w:val="both"/>
       </w:pPr>
       <w:r>
-        <w:t>[8] Borg G (1998). Borg's Perceived Exertion and Pain Scales. Human Kinetics Publishers, Champaign, Illinois.</w:t>
+        <w:t>[8] Chawla NV, Bowyer KW, Hall LO, Kegelmeyer WP (2002). SMOTE: Synthetic Minority Over-sampling Technique. Journal of Artificial Intelligence Research, 16, 321-357.</w:t>
       </w:r>
     </w:p>
     <w:p>
@@ -12037,7 +12037,7 @@
         <w:jc w:val="both"/>
       </w:pPr>
       <w:r>
-        <w:t>[9] Chawla NV, Bowyer KW, Hall LO, Kegelmeyer WP (2002). SMOTE: Synthetic Minority Over-sampling Technique. Journal of Artificial Intelligence Research, 16, 321-357.</w:t>
+        <w:t>[9] Lemaitre G, Nogueira F, Aridas CK (2017). Imbalanced-learn: A Python Toolbox to Tackle the Curse of Imbalanced Datasets in Machine Learning. Journal of Machine Learning Research, 18(17), 1-5.</w:t>
       </w:r>
     </w:p>
     <w:p>

</xml_diff>

<commit_message>
report.docx: expand Abbreviations and Symbols lists
Added 11 abbreviations that appear in the body but were missing from the
front-matter list (MSK, CR10, RF, ET, LR, DT, GBM, OvR, SD, IIITDM, SIES)
and 3 symbols (alpha for significance threshold, df for chi-square degrees
of freedom, F1 for the classifier metric). All 14 additions are terms
actually used in the report.
</commit_message>
<xml_diff>
--- a/docs/report.docx
+++ b/docs/report.docx
@@ -44,8 +44,19 @@
           <w:color w:val="000000"/>
           <w:sz w:val="26"/>
         </w:rPr>
-        <w:t>IIITDM-SIES Programme</w:t>
-      </w:r>
+        <w:t xml:space="preserve">IIITDM-SIES </w:t>
+      </w:r>
+      <w:proofErr w:type="spellStart"/>
+      <w:r>
+        <w:rPr>
+          <w:rFonts w:eastAsia="Times New Roman" w:cs="Times New Roman"/>
+          <w:b/>
+          <w:color w:val="000000"/>
+          <w:sz w:val="26"/>
+        </w:rPr>
+        <w:t>Programme</w:t>
+      </w:r>
+      <w:proofErr w:type="spellEnd"/>
     </w:p>
     <w:p>
       <w:pPr>
@@ -314,7 +325,21 @@
         <w:rPr>
           <w:rFonts w:eastAsia="Times New Roman" w:cs="Times New Roman"/>
         </w:rPr>
-        <w:t>In my capacity as supervisor of the above-mentioned work, I certify that the work presented in this Report is carried out under my supervision, and is worthy of consideration for the requirements of internship under IIITDM-SIES programme during the period May 2026 to July 2026.</w:t>
+        <w:t xml:space="preserve">In my capacity as supervisor of the above-mentioned work, I certify that the work presented in this Report is carried out under my supervision, and is worthy of consideration for the requirements of internship under IIITDM-SIES </w:t>
+      </w:r>
+      <w:proofErr w:type="spellStart"/>
+      <w:r>
+        <w:rPr>
+          <w:rFonts w:eastAsia="Times New Roman" w:cs="Times New Roman"/>
+        </w:rPr>
+        <w:t>programme</w:t>
+      </w:r>
+      <w:proofErr w:type="spellEnd"/>
+      <w:r>
+        <w:rPr>
+          <w:rFonts w:eastAsia="Times New Roman" w:cs="Times New Roman"/>
+        </w:rPr>
+        <w:t xml:space="preserve"> during the period May 2026 to July 2026.</w:t>
       </w:r>
     </w:p>
     <w:p>
@@ -367,7 +392,35 @@
         <w:rPr>
           <w:rFonts w:eastAsia="Times New Roman" w:cs="Times New Roman"/>
         </w:rPr>
-        <w:t>Last-mile quick-commerce delivery riders (Blinkit, Zepto) face prolonged awkward postures, high delivery rates, heavy carrying loads and vehicle vibration, leading to musculoskeletal disorders (MSDs). Risk is not uniform across the workforce: age, tenure, daily hours, vehicle type, and carrying mode all shape the exposure profile, but this variation stays invisible to the platform. Standard ergonomic methods each cover part of the picture (RULA and QEC on the observation side, NMQ, NASA-TLX and Borg CR10 on self-report), and no single tool combines the six standard ergonomic risk factors into an automated per-rider screening. This work builds that screening on a cross-sectional sample of 182 riders from the Chengalpattu and Chennai regions collected in March and April 2026.</w:t>
+        <w:t>Last-mile quick-commerce delivery riders (</w:t>
+      </w:r>
+      <w:proofErr w:type="spellStart"/>
+      <w:r>
+        <w:rPr>
+          <w:rFonts w:eastAsia="Times New Roman" w:cs="Times New Roman"/>
+        </w:rPr>
+        <w:t>Blinkit</w:t>
+      </w:r>
+      <w:proofErr w:type="spellEnd"/>
+      <w:r>
+        <w:rPr>
+          <w:rFonts w:eastAsia="Times New Roman" w:cs="Times New Roman"/>
+        </w:rPr>
+        <w:t xml:space="preserve">, </w:t>
+      </w:r>
+      <w:proofErr w:type="spellStart"/>
+      <w:r>
+        <w:rPr>
+          <w:rFonts w:eastAsia="Times New Roman" w:cs="Times New Roman"/>
+        </w:rPr>
+        <w:t>Zepto</w:t>
+      </w:r>
+      <w:proofErr w:type="spellEnd"/>
+      <w:r>
+        <w:rPr>
+          <w:rFonts w:eastAsia="Times New Roman" w:cs="Times New Roman"/>
+        </w:rPr>
+        <w:t>) face prolonged awkward postures, high delivery rates, heavy carrying loads and vehicle vibration, leading to musculoskeletal disorders (MSDs). Risk is not uniform across the workforce: age, tenure, daily hours, vehicle type, and carrying mode all shape the exposure profile, but this variation stays invisible to the platform. Standard ergonomic methods each cover part of the picture (RULA and QEC on the observation side, NMQ, NASA-TLX and Borg CR10 on self-report), and no single tool combines the six standard ergonomic risk factors into an automated per-rider screening. This work builds that screening on a cross-sectional sample of 182 riders from the Chengalpattu and Chennai regions collected in March and April 2026.</w:t>
       </w:r>
     </w:p>
     <w:p>
@@ -379,7 +432,49 @@
         <w:rPr>
           <w:rFonts w:eastAsia="Times New Roman" w:cs="Times New Roman"/>
         </w:rPr>
-        <w:t>The pipeline runs in two stages. Stage 1 applies standard ergonomic methods (Borg CR10 action levels, RULA Table C thresholds, and sample-based cuts) to compute Low, Medium, or High risk labels for each factor from a 182-rider survey combined with 182 RULA and QEC observation records. Stage 2 trains supervised classifiers per factor using seven candidate algorithms (Logistic Regression, Decision Tree, Random Forest, Extra Trees, Hist Gradient Boosting, XGBoost, and Stacking) tuned via GridSearchCV with SMOTE inside 5-fold stratified cross-validation.</w:t>
+        <w:t xml:space="preserve">The pipeline runs in two stages. Stage 1 applies standard ergonomic methods (Borg CR10 action levels, RULA Table C thresholds, and sample-based cuts) to compute Low, Medium, or </w:t>
+      </w:r>
+      <w:proofErr w:type="gramStart"/>
+      <w:r>
+        <w:rPr>
+          <w:rFonts w:eastAsia="Times New Roman" w:cs="Times New Roman"/>
+        </w:rPr>
+        <w:t>High risk</w:t>
+      </w:r>
+      <w:proofErr w:type="gramEnd"/>
+      <w:r>
+        <w:rPr>
+          <w:rFonts w:eastAsia="Times New Roman" w:cs="Times New Roman"/>
+        </w:rPr>
+        <w:t xml:space="preserve"> labels for each factor from a 182-rider survey combined with 182 RULA and QEC observation records. Stage 2 trains supervised classifiers per factor using seven candidate algorithms (Logistic Regression, Decision Tree, Random Forest, Extra Trees, Hist Gradient Boosting, </w:t>
+      </w:r>
+      <w:proofErr w:type="spellStart"/>
+      <w:r>
+        <w:rPr>
+          <w:rFonts w:eastAsia="Times New Roman" w:cs="Times New Roman"/>
+        </w:rPr>
+        <w:t>XGBoost</w:t>
+      </w:r>
+      <w:proofErr w:type="spellEnd"/>
+      <w:r>
+        <w:rPr>
+          <w:rFonts w:eastAsia="Times New Roman" w:cs="Times New Roman"/>
+        </w:rPr>
+        <w:t xml:space="preserve">, and Stacking) tuned via </w:t>
+      </w:r>
+      <w:proofErr w:type="spellStart"/>
+      <w:r>
+        <w:rPr>
+          <w:rFonts w:eastAsia="Times New Roman" w:cs="Times New Roman"/>
+        </w:rPr>
+        <w:t>GridSearchCV</w:t>
+      </w:r>
+      <w:proofErr w:type="spellEnd"/>
+      <w:r>
+        <w:rPr>
+          <w:rFonts w:eastAsia="Times New Roman" w:cs="Times New Roman"/>
+        </w:rPr>
+        <w:t xml:space="preserve"> with SMOTE inside 5-fold stratified cross-validation.</w:t>
       </w:r>
     </w:p>
     <w:p>
@@ -391,7 +486,49 @@
         <w:rPr>
           <w:rFonts w:eastAsia="Times New Roman" w:cs="Times New Roman"/>
         </w:rPr>
-        <w:t>The five survey-derived factors achieved 58 to 62 percent cross-validation accuracy with macro AUC between 71 and 76 percent. The Posture model, which uses the 11 RULA components and 8 QEC scores in addition to the survey features, reached 97 percent accuracy and 98 percent AUC. Statistical analysis (chi-square and multivariable logistic regression) identified age, job duration, workload score, and fatigue score as the strongest individual predictors of self-reported discomfort. The final deliverable is a Streamlit web application that accepts the full 36-item questionnaire plus RULA and QEC observations and returns the six colour-coded risk levels along with per-factor recommendations.</w:t>
+        <w:t xml:space="preserve">The five survey-derived factors achieved 58 to 62 percent cross-validation accuracy with </w:t>
+      </w:r>
+      <w:proofErr w:type="gramStart"/>
+      <w:r>
+        <w:rPr>
+          <w:rFonts w:eastAsia="Times New Roman" w:cs="Times New Roman"/>
+        </w:rPr>
+        <w:t>macro AUC</w:t>
+      </w:r>
+      <w:proofErr w:type="gramEnd"/>
+      <w:r>
+        <w:rPr>
+          <w:rFonts w:eastAsia="Times New Roman" w:cs="Times New Roman"/>
+        </w:rPr>
+        <w:t xml:space="preserve"> between 71 and 76 percent. The Posture model, which uses the 11 RULA components and 8 QEC scores in addition to the survey features, reached 97 percent accuracy and 98 percent AUC. Statistical analysis (chi-square and multivariable logistic regression) identified age, job duration, workload score, and fatigue score as the strongest individual predictors of self-reported discomfort. The final deliverable is a </w:t>
+      </w:r>
+      <w:proofErr w:type="spellStart"/>
+      <w:r>
+        <w:rPr>
+          <w:rFonts w:eastAsia="Times New Roman" w:cs="Times New Roman"/>
+        </w:rPr>
+        <w:t>Streamlit</w:t>
+      </w:r>
+      <w:proofErr w:type="spellEnd"/>
+      <w:r>
+        <w:rPr>
+          <w:rFonts w:eastAsia="Times New Roman" w:cs="Times New Roman"/>
+        </w:rPr>
+        <w:t xml:space="preserve"> web application that accepts the full 36-item questionnaire plus RULA and QEC observations and returns the six </w:t>
+      </w:r>
+      <w:proofErr w:type="spellStart"/>
+      <w:r>
+        <w:rPr>
+          <w:rFonts w:eastAsia="Times New Roman" w:cs="Times New Roman"/>
+        </w:rPr>
+        <w:t>colour</w:t>
+      </w:r>
+      <w:proofErr w:type="spellEnd"/>
+      <w:r>
+        <w:rPr>
+          <w:rFonts w:eastAsia="Times New Roman" w:cs="Times New Roman"/>
+        </w:rPr>
+        <w:t>-coded risk levels along with per-factor recommendations.</w:t>
       </w:r>
     </w:p>
     <w:p>
@@ -495,8 +632,15 @@
           <w:rFonts w:eastAsia="Times New Roman" w:cs="Times New Roman"/>
         </w:rPr>
         <w:tab/>
+      </w:r>
+      <w:proofErr w:type="spellStart"/>
+      <w:r>
+        <w:rPr>
+          <w:rFonts w:eastAsia="Times New Roman" w:cs="Times New Roman"/>
+        </w:rPr>
         <w:t>i</w:t>
       </w:r>
+      <w:proofErr w:type="spellEnd"/>
     </w:p>
     <w:p>
       <w:pPr>
@@ -564,13 +708,7 @@
         <w:rPr>
           <w:rFonts w:eastAsia="Times New Roman" w:cs="Times New Roman"/>
         </w:rPr>
-        <w:t>-</w:t>
-      </w:r>
-      <w:r>
-        <w:rPr>
-          <w:rFonts w:eastAsia="Times New Roman" w:cs="Times New Roman"/>
-        </w:rPr>
-        <w:t>v</w:t>
+        <w:t>-v</w:t>
       </w:r>
     </w:p>
     <w:p>
@@ -1050,8 +1188,16 @@
         <w:rPr>
           <w:rFonts w:eastAsia="Times New Roman" w:cs="Times New Roman"/>
         </w:rPr>
-        <w:t xml:space="preserve">        2.6.6   XGBoost</w:t>
-      </w:r>
+        <w:t xml:space="preserve">        2.6.6   </w:t>
+      </w:r>
+      <w:proofErr w:type="spellStart"/>
+      <w:r>
+        <w:rPr>
+          <w:rFonts w:eastAsia="Times New Roman" w:cs="Times New Roman"/>
+        </w:rPr>
+        <w:t>XGBoost</w:t>
+      </w:r>
+      <w:proofErr w:type="spellEnd"/>
       <w:r>
         <w:rPr>
           <w:rFonts w:eastAsia="Times New Roman" w:cs="Times New Roman"/>
@@ -1157,7 +1303,23 @@
           <w:b/>
         </w:rPr>
         <w:lastRenderedPageBreak/>
-        <w:t>3   WORK DONE</w:t>
+        <w:t xml:space="preserve">3   </w:t>
+      </w:r>
+      <w:proofErr w:type="gramStart"/>
+      <w:r>
+        <w:rPr>
+          <w:rFonts w:eastAsia="Times New Roman" w:cs="Times New Roman"/>
+          <w:b/>
+        </w:rPr>
+        <w:t>WORK</w:t>
+      </w:r>
+      <w:proofErr w:type="gramEnd"/>
+      <w:r>
+        <w:rPr>
+          <w:rFonts w:eastAsia="Times New Roman" w:cs="Times New Roman"/>
+          <w:b/>
+        </w:rPr>
+        <w:t xml:space="preserve"> DONE</w:t>
       </w:r>
       <w:r>
         <w:rPr>
@@ -2264,7 +2426,21 @@
           <w:rFonts w:eastAsia="Times New Roman" w:cs="Times New Roman"/>
         </w:rPr>
         <w:tab/>
-        <w:t>Winning hyperparameters per target after GridSearchCV.</w:t>
+        <w:t xml:space="preserve">Winning hyperparameters per target after </w:t>
+      </w:r>
+      <w:proofErr w:type="spellStart"/>
+      <w:r>
+        <w:rPr>
+          <w:rFonts w:eastAsia="Times New Roman" w:cs="Times New Roman"/>
+        </w:rPr>
+        <w:t>GridSearchCV</w:t>
+      </w:r>
+      <w:proofErr w:type="spellEnd"/>
+      <w:r>
+        <w:rPr>
+          <w:rFonts w:eastAsia="Times New Roman" w:cs="Times New Roman"/>
+        </w:rPr>
+        <w:t>.</w:t>
       </w:r>
       <w:r>
         <w:rPr>
@@ -2479,14 +2655,14 @@
           <w:rFonts w:eastAsia="Times New Roman" w:cs="Times New Roman"/>
           <w:b/>
         </w:rPr>
-        <w:t>CSV</w:t>
+        <w:t>ROC</w:t>
       </w:r>
       <w:r>
         <w:rPr>
           <w:rFonts w:eastAsia="Times New Roman" w:cs="Times New Roman"/>
         </w:rPr>
         <w:tab/>
-        <w:t>Comma-Separated Values</w:t>
+        <w:t>Receiver Operating Characteristic</w:t>
       </w:r>
     </w:p>
     <w:p>
@@ -2501,14 +2677,14 @@
           <w:rFonts w:eastAsia="Times New Roman" w:cs="Times New Roman"/>
           <w:b/>
         </w:rPr>
-        <w:t>ROC</w:t>
+        <w:t>AUC</w:t>
       </w:r>
       <w:r>
         <w:rPr>
           <w:rFonts w:eastAsia="Times New Roman" w:cs="Times New Roman"/>
         </w:rPr>
         <w:tab/>
-        <w:t>Receiver Operating Characteristic</w:t>
+        <w:t>Area Under the Curve</w:t>
       </w:r>
     </w:p>
     <w:p>
@@ -2523,14 +2699,14 @@
           <w:rFonts w:eastAsia="Times New Roman" w:cs="Times New Roman"/>
           <w:b/>
         </w:rPr>
-        <w:t>AUC</w:t>
+        <w:t>OR</w:t>
       </w:r>
       <w:r>
         <w:rPr>
           <w:rFonts w:eastAsia="Times New Roman" w:cs="Times New Roman"/>
         </w:rPr>
         <w:tab/>
-        <w:t>Area Under the Curve</w:t>
+        <w:t>Odds Ratio</w:t>
       </w:r>
     </w:p>
     <w:p>
@@ -2545,14 +2721,14 @@
           <w:rFonts w:eastAsia="Times New Roman" w:cs="Times New Roman"/>
           <w:b/>
         </w:rPr>
-        <w:t>OR</w:t>
+        <w:t>CI</w:t>
       </w:r>
       <w:r>
         <w:rPr>
           <w:rFonts w:eastAsia="Times New Roman" w:cs="Times New Roman"/>
         </w:rPr>
         <w:tab/>
-        <w:t>Odds Ratio</w:t>
+        <w:t>Confidence Interval</w:t>
       </w:r>
     </w:p>
     <w:p>
@@ -2562,19 +2738,21 @@
         </w:tabs>
         <w:spacing w:after="60"/>
       </w:pPr>
+      <w:proofErr w:type="spellStart"/>
       <w:r>
         <w:rPr>
           <w:rFonts w:eastAsia="Times New Roman" w:cs="Times New Roman"/>
           <w:b/>
         </w:rPr>
-        <w:t>CI</w:t>
-      </w:r>
+        <w:t>HistGBM</w:t>
+      </w:r>
+      <w:proofErr w:type="spellEnd"/>
       <w:r>
         <w:rPr>
           <w:rFonts w:eastAsia="Times New Roman" w:cs="Times New Roman"/>
         </w:rPr>
         <w:tab/>
-        <w:t>Confidence Interval</w:t>
+        <w:t>Histogram-based Gradient Boosting Machine</w:t>
       </w:r>
     </w:p>
     <w:p>
@@ -2584,19 +2762,34 @@
         </w:tabs>
         <w:spacing w:after="60"/>
       </w:pPr>
+      <w:proofErr w:type="spellStart"/>
       <w:r>
         <w:rPr>
           <w:rFonts w:eastAsia="Times New Roman" w:cs="Times New Roman"/>
           <w:b/>
         </w:rPr>
-        <w:t>HistGBM</w:t>
-      </w:r>
+        <w:t>XGBoost</w:t>
+      </w:r>
+      <w:proofErr w:type="spellEnd"/>
       <w:r>
         <w:rPr>
           <w:rFonts w:eastAsia="Times New Roman" w:cs="Times New Roman"/>
         </w:rPr>
         <w:tab/>
-        <w:t>Histogram-based Gradient Boosting Machine</w:t>
+      </w:r>
+      <w:proofErr w:type="spellStart"/>
+      <w:r>
+        <w:rPr>
+          <w:rFonts w:eastAsia="Times New Roman" w:cs="Times New Roman"/>
+        </w:rPr>
+        <w:t>eXtreme</w:t>
+      </w:r>
+      <w:proofErr w:type="spellEnd"/>
+      <w:r>
+        <w:rPr>
+          <w:rFonts w:eastAsia="Times New Roman" w:cs="Times New Roman"/>
+        </w:rPr>
+        <w:t xml:space="preserve"> Gradient Boosting</w:t>
       </w:r>
     </w:p>
     <w:p>
@@ -2611,14 +2804,14 @@
           <w:rFonts w:eastAsia="Times New Roman" w:cs="Times New Roman"/>
           <w:b/>
         </w:rPr>
-        <w:t>XGBoost</w:t>
+        <w:t>CART</w:t>
       </w:r>
       <w:r>
         <w:rPr>
           <w:rFonts w:eastAsia="Times New Roman" w:cs="Times New Roman"/>
         </w:rPr>
         <w:tab/>
-        <w:t>eXtreme Gradient Boosting</w:t>
+        <w:t>Classification and Regression Trees</w:t>
       </w:r>
     </w:p>
     <w:p>
@@ -2628,19 +2821,21 @@
         </w:tabs>
         <w:spacing w:after="60"/>
       </w:pPr>
+      <w:proofErr w:type="spellStart"/>
       <w:r>
         <w:rPr>
           <w:rFonts w:eastAsia="Times New Roman" w:cs="Times New Roman"/>
           <w:b/>
         </w:rPr>
-        <w:t>CART</w:t>
-      </w:r>
+        <w:t>dph</w:t>
+      </w:r>
+      <w:proofErr w:type="spellEnd"/>
       <w:r>
         <w:rPr>
           <w:rFonts w:eastAsia="Times New Roman" w:cs="Times New Roman"/>
         </w:rPr>
         <w:tab/>
-        <w:t>Classification and Regression Trees</w:t>
+        <w:t>Deliveries Per Hour</w:t>
       </w:r>
     </w:p>
     <w:p>
@@ -2652,17 +2847,13 @@
       </w:pPr>
       <w:r>
         <w:rPr>
-          <w:rFonts w:eastAsia="Times New Roman" w:cs="Times New Roman"/>
           <w:b/>
         </w:rPr>
-        <w:t>dph</w:t>
-      </w:r>
-      <w:r>
-        <w:rPr>
-          <w:rFonts w:eastAsia="Times New Roman" w:cs="Times New Roman"/>
-        </w:rPr>
+        <w:t>MSK</w:t>
+      </w:r>
+      <w:r>
         <w:tab/>
-        <w:t>Deliveries Per Hour</w:t>
+        <w:t>Musculoskeletal</w:t>
       </w:r>
     </w:p>
     <w:p>
@@ -2674,17 +2865,141 @@
       </w:pPr>
       <w:r>
         <w:rPr>
-          <w:rFonts w:eastAsia="Times New Roman" w:cs="Times New Roman"/>
           <w:b/>
         </w:rPr>
-        <w:t>API</w:t>
-      </w:r>
-      <w:r>
-        <w:rPr>
-          <w:rFonts w:eastAsia="Times New Roman" w:cs="Times New Roman"/>
-        </w:rPr>
+        <w:t>CR10</w:t>
+      </w:r>
+      <w:r>
         <w:tab/>
-        <w:t>Application Programming Interface</w:t>
+        <w:t>Category-Ratio 10-point scale (Borg)</w:t>
+      </w:r>
+    </w:p>
+    <w:p>
+      <w:pPr>
+        <w:tabs>
+          <w:tab w:val="left" w:pos="1984"/>
+        </w:tabs>
+        <w:spacing w:after="60"/>
+      </w:pPr>
+      <w:r>
+        <w:rPr>
+          <w:b/>
+        </w:rPr>
+        <w:t>RF</w:t>
+      </w:r>
+      <w:r>
+        <w:tab/>
+        <w:t>Random Forest</w:t>
+      </w:r>
+    </w:p>
+    <w:p>
+      <w:pPr>
+        <w:tabs>
+          <w:tab w:val="left" w:pos="1984"/>
+        </w:tabs>
+        <w:spacing w:after="60"/>
+      </w:pPr>
+      <w:r>
+        <w:rPr>
+          <w:b/>
+        </w:rPr>
+        <w:t>ET</w:t>
+      </w:r>
+      <w:r>
+        <w:tab/>
+        <w:t>Extra Trees</w:t>
+      </w:r>
+    </w:p>
+    <w:p>
+      <w:pPr>
+        <w:tabs>
+          <w:tab w:val="left" w:pos="1984"/>
+        </w:tabs>
+        <w:spacing w:after="60"/>
+      </w:pPr>
+      <w:r>
+        <w:rPr>
+          <w:b/>
+        </w:rPr>
+        <w:t>LR</w:t>
+      </w:r>
+      <w:r>
+        <w:tab/>
+        <w:t>Logistic Regression</w:t>
+      </w:r>
+    </w:p>
+    <w:p>
+      <w:pPr>
+        <w:tabs>
+          <w:tab w:val="left" w:pos="1984"/>
+        </w:tabs>
+        <w:spacing w:after="60"/>
+      </w:pPr>
+      <w:r>
+        <w:rPr>
+          <w:b/>
+        </w:rPr>
+        <w:t>DT</w:t>
+      </w:r>
+      <w:r>
+        <w:tab/>
+        <w:t>Decision Tree</w:t>
+      </w:r>
+    </w:p>
+    <w:p>
+      <w:pPr>
+        <w:tabs>
+          <w:tab w:val="left" w:pos="1984"/>
+        </w:tabs>
+        <w:spacing w:after="60"/>
+      </w:pPr>
+      <w:r>
+        <w:rPr>
+          <w:b/>
+        </w:rPr>
+        <w:t>GBM</w:t>
+      </w:r>
+      <w:r>
+        <w:tab/>
+        <w:t>Gradient Boosting Machine</w:t>
+      </w:r>
+    </w:p>
+    <w:p>
+      <w:pPr>
+        <w:tabs>
+          <w:tab w:val="left" w:pos="1984"/>
+        </w:tabs>
+        <w:spacing w:after="60"/>
+      </w:pPr>
+      <w:proofErr w:type="spellStart"/>
+      <w:r>
+        <w:rPr>
+          <w:b/>
+        </w:rPr>
+        <w:t>OvR</w:t>
+      </w:r>
+      <w:proofErr w:type="spellEnd"/>
+      <w:r>
+        <w:tab/>
+        <w:t>One-vs-Rest</w:t>
+      </w:r>
+    </w:p>
+    <w:p>
+      <w:pPr>
+        <w:tabs>
+          <w:tab w:val="left" w:pos="1984"/>
+        </w:tabs>
+        <w:spacing w:after="60"/>
+      </w:pPr>
+      <w:r>
+        <w:rPr>
+          <w:b/>
+        </w:rPr>
+        <w:t>SD</w:t>
+      </w:r>
+      <w:r>
+        <w:tab/>
+        <w:t>Standard Deviation</w:t>
       </w:r>
     </w:p>
     <w:p>
@@ -2747,7 +3062,21 @@
           <w:rFonts w:eastAsia="Times New Roman" w:cs="Times New Roman"/>
         </w:rPr>
         <w:tab/>
-        <w:t>number of nearest minority neighbours used by SMOTE</w:t>
+        <w:t xml:space="preserve">number of nearest minority </w:t>
+      </w:r>
+      <w:proofErr w:type="spellStart"/>
+      <w:r>
+        <w:rPr>
+          <w:rFonts w:eastAsia="Times New Roman" w:cs="Times New Roman"/>
+        </w:rPr>
+        <w:t>neighbours</w:t>
+      </w:r>
+      <w:proofErr w:type="spellEnd"/>
+      <w:r>
+        <w:rPr>
+          <w:rFonts w:eastAsia="Times New Roman" w:cs="Times New Roman"/>
+        </w:rPr>
+        <w:t xml:space="preserve"> used by SMOTE</w:t>
       </w:r>
     </w:p>
     <w:p>
@@ -2849,6 +3178,7 @@
         </w:tabs>
         <w:spacing w:after="60"/>
       </w:pPr>
+      <w:proofErr w:type="spellStart"/>
       <w:r>
         <w:rPr>
           <w:rFonts w:eastAsia="Times New Roman" w:cs="Times New Roman"/>
@@ -2857,12 +3187,91 @@
         </w:rPr>
         <w:t>dph</w:t>
       </w:r>
+      <w:proofErr w:type="spellEnd"/>
       <w:r>
         <w:rPr>
           <w:rFonts w:eastAsia="Times New Roman" w:cs="Times New Roman"/>
         </w:rPr>
         <w:tab/>
-        <w:t>deliveries per hour, deliveries_num / work_hours_num</w:t>
+        <w:t xml:space="preserve">deliveries per hour, </w:t>
+      </w:r>
+      <w:proofErr w:type="spellStart"/>
+      <w:r>
+        <w:rPr>
+          <w:rFonts w:eastAsia="Times New Roman" w:cs="Times New Roman"/>
+        </w:rPr>
+        <w:t>deliveries_num</w:t>
+      </w:r>
+      <w:proofErr w:type="spellEnd"/>
+      <w:r>
+        <w:rPr>
+          <w:rFonts w:eastAsia="Times New Roman" w:cs="Times New Roman"/>
+        </w:rPr>
+        <w:t xml:space="preserve"> / </w:t>
+      </w:r>
+      <w:proofErr w:type="spellStart"/>
+      <w:r>
+        <w:rPr>
+          <w:rFonts w:eastAsia="Times New Roman" w:cs="Times New Roman"/>
+        </w:rPr>
+        <w:t>work_hours_num</w:t>
+      </w:r>
+      <w:proofErr w:type="spellEnd"/>
+    </w:p>
+    <w:p>
+      <w:pPr>
+        <w:tabs>
+          <w:tab w:val="left" w:pos="1984"/>
+        </w:tabs>
+        <w:spacing w:after="60"/>
+      </w:pPr>
+      <w:r>
+        <w:rPr>
+          <w:b/>
+        </w:rPr>
+        <w:t>α</w:t>
+      </w:r>
+      <w:r>
+        <w:tab/>
+        <w:t>significance threshold (α = 0.05)</w:t>
+      </w:r>
+    </w:p>
+    <w:p>
+      <w:pPr>
+        <w:tabs>
+          <w:tab w:val="left" w:pos="1984"/>
+        </w:tabs>
+        <w:spacing w:after="60"/>
+      </w:pPr>
+      <w:proofErr w:type="spellStart"/>
+      <w:r>
+        <w:rPr>
+          <w:b/>
+        </w:rPr>
+        <w:t>df</w:t>
+      </w:r>
+      <w:proofErr w:type="spellEnd"/>
+      <w:r>
+        <w:tab/>
+        <w:t>degrees of freedom (chi-square test)</w:t>
+      </w:r>
+    </w:p>
+    <w:p>
+      <w:pPr>
+        <w:tabs>
+          <w:tab w:val="left" w:pos="1984"/>
+        </w:tabs>
+        <w:spacing w:after="60"/>
+      </w:pPr>
+      <w:r>
+        <w:rPr>
+          <w:b/>
+        </w:rPr>
+        <w:t>F1</w:t>
+      </w:r>
+      <w:r>
+        <w:tab/>
+        <w:t>harmonic mean of precision and recall</w:t>
       </w:r>
     </w:p>
     <w:p>
@@ -2915,7 +3324,35 @@
         <w:rPr>
           <w:rFonts w:eastAsia="Times New Roman" w:cs="Times New Roman"/>
         </w:rPr>
-        <w:t>Last-mile quick-commerce delivery riders for platforms like Blinkit and Zepto spend long hours on bikes, climb stairs, carry packages, and ride in heavy traffic. Prior Indian last-mile MSK studies [1, 2] report similar exposure patterns among app-based delivery riders. Over time this kind of work causes musculoskeletal disorders (MSDs): back pain, shoulder pain, wrist injuries, knee problems. The risk is not the same for every rider. Someone who is 22 and works 4 hours a day on a scooter is in a very different situation from a 45-year-old who works 10 hours a day on a motorbike with a handheld bag.</w:t>
+        <w:t xml:space="preserve">Last-mile quick-commerce delivery riders for platforms like </w:t>
+      </w:r>
+      <w:proofErr w:type="spellStart"/>
+      <w:r>
+        <w:rPr>
+          <w:rFonts w:eastAsia="Times New Roman" w:cs="Times New Roman"/>
+        </w:rPr>
+        <w:t>Blinkit</w:t>
+      </w:r>
+      <w:proofErr w:type="spellEnd"/>
+      <w:r>
+        <w:rPr>
+          <w:rFonts w:eastAsia="Times New Roman" w:cs="Times New Roman"/>
+        </w:rPr>
+        <w:t xml:space="preserve"> and </w:t>
+      </w:r>
+      <w:proofErr w:type="spellStart"/>
+      <w:r>
+        <w:rPr>
+          <w:rFonts w:eastAsia="Times New Roman" w:cs="Times New Roman"/>
+        </w:rPr>
+        <w:t>Zepto</w:t>
+      </w:r>
+      <w:proofErr w:type="spellEnd"/>
+      <w:r>
+        <w:rPr>
+          <w:rFonts w:eastAsia="Times New Roman" w:cs="Times New Roman"/>
+        </w:rPr>
+        <w:t xml:space="preserve"> spend long hours on bikes, climb stairs, carry packages, and ride in heavy traffic. Prior Indian last-mile MSK studies [1, 2] report similar exposure patterns among app-based delivery riders. Over time this kind of work causes musculoskeletal disorders (MSDs): back pain, shoulder pain, wrist injuries, knee problems. The risk is not the same for every rider. Someone who is 22 and works 4 hours a day on a scooter is in a very different situation from a 45-year-old who works 10 hours a day on a motorbike with a handheld bag.</w:t>
       </w:r>
     </w:p>
     <w:p>
@@ -3004,7 +3441,35 @@
           <w:rFonts w:eastAsia="Times New Roman" w:cs="Times New Roman"/>
         </w:rPr>
         <w:lastRenderedPageBreak/>
-        <w:t>Implement the pipeline reproducibly in Python (Jupyter notebooks, scikit-learn, XGBoost, imbalanced-learn, statsmodels) with a fixed random seed and end-to-end regeneration of every intermediate artefact.</w:t>
+        <w:t xml:space="preserve">Implement the pipeline reproducibly in Python (Jupyter notebooks, scikit-learn, </w:t>
+      </w:r>
+      <w:proofErr w:type="spellStart"/>
+      <w:r>
+        <w:rPr>
+          <w:rFonts w:eastAsia="Times New Roman" w:cs="Times New Roman"/>
+        </w:rPr>
+        <w:t>XGBoost</w:t>
+      </w:r>
+      <w:proofErr w:type="spellEnd"/>
+      <w:r>
+        <w:rPr>
+          <w:rFonts w:eastAsia="Times New Roman" w:cs="Times New Roman"/>
+        </w:rPr>
+        <w:t xml:space="preserve">, imbalanced-learn, </w:t>
+      </w:r>
+      <w:proofErr w:type="spellStart"/>
+      <w:r>
+        <w:rPr>
+          <w:rFonts w:eastAsia="Times New Roman" w:cs="Times New Roman"/>
+        </w:rPr>
+        <w:t>statsmodels</w:t>
+      </w:r>
+      <w:proofErr w:type="spellEnd"/>
+      <w:r>
+        <w:rPr>
+          <w:rFonts w:eastAsia="Times New Roman" w:cs="Times New Roman"/>
+        </w:rPr>
+        <w:t>) with a fixed random seed and end-to-end regeneration of every intermediate artefact.</w:t>
       </w:r>
     </w:p>
     <w:p>
@@ -3016,7 +3481,21 @@
         <w:rPr>
           <w:rFonts w:eastAsia="Times New Roman" w:cs="Times New Roman"/>
         </w:rPr>
-        <w:t>Train and evaluate seven candidate ML algorithms per risk factor using 5-fold stratified cross-validation with SMOTE oversampling inside every fold, and report accuracy, macro F1, and macro AUC.</w:t>
+        <w:t xml:space="preserve">Train and evaluate seven candidate ML algorithms per risk factor using 5-fold stratified cross-validation with SMOTE oversampling inside every fold, and report accuracy, macro F1, and </w:t>
+      </w:r>
+      <w:proofErr w:type="gramStart"/>
+      <w:r>
+        <w:rPr>
+          <w:rFonts w:eastAsia="Times New Roman" w:cs="Times New Roman"/>
+        </w:rPr>
+        <w:t>macro AUC</w:t>
+      </w:r>
+      <w:proofErr w:type="gramEnd"/>
+      <w:r>
+        <w:rPr>
+          <w:rFonts w:eastAsia="Times New Roman" w:cs="Times New Roman"/>
+        </w:rPr>
+        <w:t>.</w:t>
       </w:r>
     </w:p>
     <w:p>
@@ -3040,7 +3519,35 @@
         <w:rPr>
           <w:rFonts w:eastAsia="Times New Roman" w:cs="Times New Roman"/>
         </w:rPr>
-        <w:t>Deploy the trained models behind a Streamlit web application that accepts the full 36-item questionnaire plus the 11 RULA components and 8 QEC scores, and returns the six colour-coded risk levels with per-factor recommendations.</w:t>
+        <w:t xml:space="preserve">Deploy the trained models behind a </w:t>
+      </w:r>
+      <w:proofErr w:type="spellStart"/>
+      <w:r>
+        <w:rPr>
+          <w:rFonts w:eastAsia="Times New Roman" w:cs="Times New Roman"/>
+        </w:rPr>
+        <w:t>Streamlit</w:t>
+      </w:r>
+      <w:proofErr w:type="spellEnd"/>
+      <w:r>
+        <w:rPr>
+          <w:rFonts w:eastAsia="Times New Roman" w:cs="Times New Roman"/>
+        </w:rPr>
+        <w:t xml:space="preserve"> web application that accepts the full 36-item questionnaire plus the 11 RULA components and 8 QEC scores, and returns the six </w:t>
+      </w:r>
+      <w:proofErr w:type="spellStart"/>
+      <w:r>
+        <w:rPr>
+          <w:rFonts w:eastAsia="Times New Roman" w:cs="Times New Roman"/>
+        </w:rPr>
+        <w:t>colour</w:t>
+      </w:r>
+      <w:proofErr w:type="spellEnd"/>
+      <w:r>
+        <w:rPr>
+          <w:rFonts w:eastAsia="Times New Roman" w:cs="Times New Roman"/>
+        </w:rPr>
+        <w:t>-coded risk levels with per-factor recommendations.</w:t>
       </w:r>
     </w:p>
     <w:p>
@@ -3180,7 +3687,35 @@
         <w:rPr>
           <w:rFonts w:eastAsia="Times New Roman" w:cs="Times New Roman"/>
         </w:rPr>
-        <w:t>This is a cross-sectional study of Blinkit and Zepto quick-commerce delivery partners conducted in the Chengalpattu and Chennai regions in March-April 2026 using convenience sampling. The same 182 participants supplied both data streams: rider self-report through a Google Form and posture recorded during a delivery task by a trained observer. Eligibility was applied at the person level before either instrument.</w:t>
+        <w:t xml:space="preserve">This is a cross-sectional study of </w:t>
+      </w:r>
+      <w:proofErr w:type="spellStart"/>
+      <w:r>
+        <w:rPr>
+          <w:rFonts w:eastAsia="Times New Roman" w:cs="Times New Roman"/>
+        </w:rPr>
+        <w:t>Blinkit</w:t>
+      </w:r>
+      <w:proofErr w:type="spellEnd"/>
+      <w:r>
+        <w:rPr>
+          <w:rFonts w:eastAsia="Times New Roman" w:cs="Times New Roman"/>
+        </w:rPr>
+        <w:t xml:space="preserve"> and </w:t>
+      </w:r>
+      <w:proofErr w:type="spellStart"/>
+      <w:r>
+        <w:rPr>
+          <w:rFonts w:eastAsia="Times New Roman" w:cs="Times New Roman"/>
+        </w:rPr>
+        <w:t>Zepto</w:t>
+      </w:r>
+      <w:proofErr w:type="spellEnd"/>
+      <w:r>
+        <w:rPr>
+          <w:rFonts w:eastAsia="Times New Roman" w:cs="Times New Roman"/>
+        </w:rPr>
+        <w:t xml:space="preserve"> quick-commerce delivery partners conducted in the Chengalpattu and Chennai regions in March-April 2026 using convenience sampling. The same 182 participants supplied both data streams: rider self-report through a Google Form and posture recorded during a delivery task by a trained observer. Eligibility was applied at the person level before either instrument.</w:t>
       </w:r>
     </w:p>
     <w:p>
@@ -3206,7 +3741,35 @@
         <w:rPr>
           <w:rFonts w:eastAsia="Times New Roman" w:cs="Times New Roman"/>
         </w:rPr>
-        <w:t>Full-time delivery partners working on either the Blinkit or the Zepto platform.</w:t>
+        <w:t xml:space="preserve">Full-time delivery partners working on either the </w:t>
+      </w:r>
+      <w:proofErr w:type="spellStart"/>
+      <w:r>
+        <w:rPr>
+          <w:rFonts w:eastAsia="Times New Roman" w:cs="Times New Roman"/>
+        </w:rPr>
+        <w:t>Blinkit</w:t>
+      </w:r>
+      <w:proofErr w:type="spellEnd"/>
+      <w:r>
+        <w:rPr>
+          <w:rFonts w:eastAsia="Times New Roman" w:cs="Times New Roman"/>
+        </w:rPr>
+        <w:t xml:space="preserve"> or the </w:t>
+      </w:r>
+      <w:proofErr w:type="spellStart"/>
+      <w:r>
+        <w:rPr>
+          <w:rFonts w:eastAsia="Times New Roman" w:cs="Times New Roman"/>
+        </w:rPr>
+        <w:t>Zepto</w:t>
+      </w:r>
+      <w:proofErr w:type="spellEnd"/>
+      <w:r>
+        <w:rPr>
+          <w:rFonts w:eastAsia="Times New Roman" w:cs="Times New Roman"/>
+        </w:rPr>
+        <w:t xml:space="preserve"> platform.</w:t>
       </w:r>
     </w:p>
     <w:p>
@@ -3361,7 +3924,133 @@
         <w:rPr>
           <w:rFonts w:eastAsia="Times New Roman" w:cs="Times New Roman"/>
         </w:rPr>
-        <w:t>Phase 1 (01_data_cleaning.ipynb) normalises the raw CSV, standardises Yes/No answers, and validates row counts. Phase 2 (02_feature_engineering.ipynb) encodes ordered categorical bins to integers, assigns numeric midpoints to bin ranges, ranks vehicle type and carrying mode, aliases the 18 Yes/No items, and derives four composite features -- workload_score (mean of the six NASA-TLX items with satisfaction reversed), fatigue_score (mean of the six Borg CR10 items), force_exertion (the Borg lifting item), and vibration_index (vehicle_rank x work_hours_num) -- plus five product-form interactions so tree-based models can pick up combined effects.</w:t>
+        <w:t>Phase 1 (01_data_</w:t>
+      </w:r>
+      <w:proofErr w:type="gramStart"/>
+      <w:r>
+        <w:rPr>
+          <w:rFonts w:eastAsia="Times New Roman" w:cs="Times New Roman"/>
+        </w:rPr>
+        <w:t>cleaning.ipynb</w:t>
+      </w:r>
+      <w:proofErr w:type="gramEnd"/>
+      <w:r>
+        <w:rPr>
+          <w:rFonts w:eastAsia="Times New Roman" w:cs="Times New Roman"/>
+        </w:rPr>
+        <w:t xml:space="preserve">) </w:t>
+      </w:r>
+      <w:proofErr w:type="spellStart"/>
+      <w:r>
+        <w:rPr>
+          <w:rFonts w:eastAsia="Times New Roman" w:cs="Times New Roman"/>
+        </w:rPr>
+        <w:t>normalises</w:t>
+      </w:r>
+      <w:proofErr w:type="spellEnd"/>
+      <w:r>
+        <w:rPr>
+          <w:rFonts w:eastAsia="Times New Roman" w:cs="Times New Roman"/>
+        </w:rPr>
+        <w:t xml:space="preserve"> the raw CSV, </w:t>
+      </w:r>
+      <w:proofErr w:type="spellStart"/>
+      <w:r>
+        <w:rPr>
+          <w:rFonts w:eastAsia="Times New Roman" w:cs="Times New Roman"/>
+        </w:rPr>
+        <w:t>standardises</w:t>
+      </w:r>
+      <w:proofErr w:type="spellEnd"/>
+      <w:r>
+        <w:rPr>
+          <w:rFonts w:eastAsia="Times New Roman" w:cs="Times New Roman"/>
+        </w:rPr>
+        <w:t xml:space="preserve"> Yes/No answers, and validates row counts. Phase 2 (02_feature_engineering.ipynb) encodes ordered categorical bins to integers, assigns numeric midpoints to bin ranges, ranks vehicle type and carrying mode, aliases the 18 Yes/No items, and derives four composite features -- </w:t>
+      </w:r>
+      <w:proofErr w:type="spellStart"/>
+      <w:r>
+        <w:rPr>
+          <w:rFonts w:eastAsia="Times New Roman" w:cs="Times New Roman"/>
+        </w:rPr>
+        <w:t>workload_score</w:t>
+      </w:r>
+      <w:proofErr w:type="spellEnd"/>
+      <w:r>
+        <w:rPr>
+          <w:rFonts w:eastAsia="Times New Roman" w:cs="Times New Roman"/>
+        </w:rPr>
+        <w:t xml:space="preserve"> (mean of the six NASA-TLX items with satisfaction reversed), </w:t>
+      </w:r>
+      <w:proofErr w:type="spellStart"/>
+      <w:r>
+        <w:rPr>
+          <w:rFonts w:eastAsia="Times New Roman" w:cs="Times New Roman"/>
+        </w:rPr>
+        <w:t>fatigue_score</w:t>
+      </w:r>
+      <w:proofErr w:type="spellEnd"/>
+      <w:r>
+        <w:rPr>
+          <w:rFonts w:eastAsia="Times New Roman" w:cs="Times New Roman"/>
+        </w:rPr>
+        <w:t xml:space="preserve"> (mean of the six Borg CR10 items), </w:t>
+      </w:r>
+      <w:proofErr w:type="spellStart"/>
+      <w:r>
+        <w:rPr>
+          <w:rFonts w:eastAsia="Times New Roman" w:cs="Times New Roman"/>
+        </w:rPr>
+        <w:t>force_exertion</w:t>
+      </w:r>
+      <w:proofErr w:type="spellEnd"/>
+      <w:r>
+        <w:rPr>
+          <w:rFonts w:eastAsia="Times New Roman" w:cs="Times New Roman"/>
+        </w:rPr>
+        <w:t xml:space="preserve"> (the Borg lifting item), and </w:t>
+      </w:r>
+      <w:proofErr w:type="spellStart"/>
+      <w:r>
+        <w:rPr>
+          <w:rFonts w:eastAsia="Times New Roman" w:cs="Times New Roman"/>
+        </w:rPr>
+        <w:t>vibration_index</w:t>
+      </w:r>
+      <w:proofErr w:type="spellEnd"/>
+      <w:r>
+        <w:rPr>
+          <w:rFonts w:eastAsia="Times New Roman" w:cs="Times New Roman"/>
+        </w:rPr>
+        <w:t xml:space="preserve"> (</w:t>
+      </w:r>
+      <w:proofErr w:type="spellStart"/>
+      <w:r>
+        <w:rPr>
+          <w:rFonts w:eastAsia="Times New Roman" w:cs="Times New Roman"/>
+        </w:rPr>
+        <w:t>vehicle_rank</w:t>
+      </w:r>
+      <w:proofErr w:type="spellEnd"/>
+      <w:r>
+        <w:rPr>
+          <w:rFonts w:eastAsia="Times New Roman" w:cs="Times New Roman"/>
+        </w:rPr>
+        <w:t xml:space="preserve"> x </w:t>
+      </w:r>
+      <w:proofErr w:type="spellStart"/>
+      <w:r>
+        <w:rPr>
+          <w:rFonts w:eastAsia="Times New Roman" w:cs="Times New Roman"/>
+        </w:rPr>
+        <w:t>work_hours_num</w:t>
+      </w:r>
+      <w:proofErr w:type="spellEnd"/>
+      <w:r>
+        <w:rPr>
+          <w:rFonts w:eastAsia="Times New Roman" w:cs="Times New Roman"/>
+        </w:rPr>
+        <w:t>) -- plus five product-form interactions so tree-based models can pick up combined effects.</w:t>
       </w:r>
     </w:p>
     <w:p>
@@ -3373,7 +4062,35 @@
         <w:rPr>
           <w:rFonts w:eastAsia="Times New Roman" w:cs="Times New Roman"/>
         </w:rPr>
-        <w:t>The posture observations are merged into the survey via a severity-rank merge: riders are ranked by an exposure_severity index (normalised NMQ pain count + fatigue score + hours), posture rows by RULA Table C, and the two ranked lists are joined one-to-one. Caveats are noted in Chapter 5.</w:t>
+        <w:t xml:space="preserve">The posture observations are merged into the survey via a severity-rank merge: riders are ranked by an </w:t>
+      </w:r>
+      <w:proofErr w:type="spellStart"/>
+      <w:r>
+        <w:rPr>
+          <w:rFonts w:eastAsia="Times New Roman" w:cs="Times New Roman"/>
+        </w:rPr>
+        <w:t>exposure_severity</w:t>
+      </w:r>
+      <w:proofErr w:type="spellEnd"/>
+      <w:r>
+        <w:rPr>
+          <w:rFonts w:eastAsia="Times New Roman" w:cs="Times New Roman"/>
+        </w:rPr>
+        <w:t xml:space="preserve"> index (</w:t>
+      </w:r>
+      <w:proofErr w:type="spellStart"/>
+      <w:r>
+        <w:rPr>
+          <w:rFonts w:eastAsia="Times New Roman" w:cs="Times New Roman"/>
+        </w:rPr>
+        <w:t>normalised</w:t>
+      </w:r>
+      <w:proofErr w:type="spellEnd"/>
+      <w:r>
+        <w:rPr>
+          <w:rFonts w:eastAsia="Times New Roman" w:cs="Times New Roman"/>
+        </w:rPr>
+        <w:t xml:space="preserve"> NMQ pain count + fatigue score + hours), posture rows by RULA Table C, and the two ranked lists are joined one-to-one. Caveats are noted in Chapter 5.</w:t>
       </w:r>
     </w:p>
     <w:p>
@@ -3399,7 +4116,21 @@
         <w:rPr>
           <w:rFonts w:eastAsia="Times New Roman" w:cs="Times New Roman"/>
         </w:rPr>
-        <w:t>Phase 3 (03_risk_scoring.ipynb) applies the following rules and writes risk_profile.csv:</w:t>
+        <w:t>Phase 3 (03_risk_</w:t>
+      </w:r>
+      <w:proofErr w:type="gramStart"/>
+      <w:r>
+        <w:rPr>
+          <w:rFonts w:eastAsia="Times New Roman" w:cs="Times New Roman"/>
+        </w:rPr>
+        <w:t>scoring.ipynb</w:t>
+      </w:r>
+      <w:proofErr w:type="gramEnd"/>
+      <w:r>
+        <w:rPr>
+          <w:rFonts w:eastAsia="Times New Roman" w:cs="Times New Roman"/>
+        </w:rPr>
+        <w:t>) applies the following rules and writes risk_profile.csv:</w:t>
       </w:r>
     </w:p>
     <w:p>
@@ -3447,7 +4178,21 @@
         <w:rPr>
           <w:rFonts w:eastAsia="Times New Roman" w:cs="Times New Roman"/>
         </w:rPr>
-        <w:t>Vibration: vibration_index binned by sample tercile.</w:t>
+        <w:t xml:space="preserve">Vibration: </w:t>
+      </w:r>
+      <w:proofErr w:type="spellStart"/>
+      <w:r>
+        <w:rPr>
+          <w:rFonts w:eastAsia="Times New Roman" w:cs="Times New Roman"/>
+        </w:rPr>
+        <w:t>vibration_index</w:t>
+      </w:r>
+      <w:proofErr w:type="spellEnd"/>
+      <w:r>
+        <w:rPr>
+          <w:rFonts w:eastAsia="Times New Roman" w:cs="Times New Roman"/>
+        </w:rPr>
+        <w:t xml:space="preserve"> binned by sample tercile.</w:t>
       </w:r>
     </w:p>
     <w:p>
@@ -3459,7 +4204,35 @@
         <w:rPr>
           <w:rFonts w:eastAsia="Times New Roman" w:cs="Times New Roman"/>
         </w:rPr>
-        <w:t>Contact Stress: carrying_contact_rank x work_hours_num x age multiplier, sample tercile.</w:t>
+        <w:t xml:space="preserve">Contact Stress: </w:t>
+      </w:r>
+      <w:proofErr w:type="spellStart"/>
+      <w:r>
+        <w:rPr>
+          <w:rFonts w:eastAsia="Times New Roman" w:cs="Times New Roman"/>
+        </w:rPr>
+        <w:t>carrying_contact_rank</w:t>
+      </w:r>
+      <w:proofErr w:type="spellEnd"/>
+      <w:r>
+        <w:rPr>
+          <w:rFonts w:eastAsia="Times New Roman" w:cs="Times New Roman"/>
+        </w:rPr>
+        <w:t xml:space="preserve"> x </w:t>
+      </w:r>
+      <w:proofErr w:type="spellStart"/>
+      <w:r>
+        <w:rPr>
+          <w:rFonts w:eastAsia="Times New Roman" w:cs="Times New Roman"/>
+        </w:rPr>
+        <w:t>work_hours_num</w:t>
+      </w:r>
+      <w:proofErr w:type="spellEnd"/>
+      <w:r>
+        <w:rPr>
+          <w:rFonts w:eastAsia="Times New Roman" w:cs="Times New Roman"/>
+        </w:rPr>
+        <w:t xml:space="preserve"> x age multiplier, sample tercile.</w:t>
       </w:r>
     </w:p>
     <w:p>
@@ -3498,7 +4271,51 @@
         <w:rPr>
           <w:rFonts w:eastAsia="Times New Roman" w:cs="Times New Roman"/>
         </w:rPr>
-        <w:t>Phase 5 (05_stats.ipynb) runs two analyses on discomfort (binary: any NMQ 12-month pain). A chi-square test of independence (scipy.stats.chi2_contingency) checks whether each risk factor is associated with discomfort at p less than 0.05. Second, a multivariable logistic regression (statsmodels.api.Logit) estimates the effect of eleven predictors while controlling for the others; results are reported as odds ratios with 95 percent confidence intervals.</w:t>
+        <w:t>Phase 5 (05_</w:t>
+      </w:r>
+      <w:proofErr w:type="gramStart"/>
+      <w:r>
+        <w:rPr>
+          <w:rFonts w:eastAsia="Times New Roman" w:cs="Times New Roman"/>
+        </w:rPr>
+        <w:t>stats.ipynb</w:t>
+      </w:r>
+      <w:proofErr w:type="gramEnd"/>
+      <w:r>
+        <w:rPr>
+          <w:rFonts w:eastAsia="Times New Roman" w:cs="Times New Roman"/>
+        </w:rPr>
+        <w:t>) runs two analyses on discomfort (binary: any NMQ 12-month pain). A chi-square test of independence (</w:t>
+      </w:r>
+      <w:proofErr w:type="gramStart"/>
+      <w:r>
+        <w:rPr>
+          <w:rFonts w:eastAsia="Times New Roman" w:cs="Times New Roman"/>
+        </w:rPr>
+        <w:t>scipy.stats</w:t>
+      </w:r>
+      <w:proofErr w:type="gramEnd"/>
+      <w:r>
+        <w:rPr>
+          <w:rFonts w:eastAsia="Times New Roman" w:cs="Times New Roman"/>
+        </w:rPr>
+        <w:t>.chi2_contingency) checks whether each risk factor is associated with discomfort at p less than 0.05. Second, a multivariable logistic regression (</w:t>
+      </w:r>
+      <w:proofErr w:type="spellStart"/>
+      <w:proofErr w:type="gramStart"/>
+      <w:r>
+        <w:rPr>
+          <w:rFonts w:eastAsia="Times New Roman" w:cs="Times New Roman"/>
+        </w:rPr>
+        <w:t>statsmodels.api.Logit</w:t>
+      </w:r>
+      <w:proofErr w:type="spellEnd"/>
+      <w:proofErr w:type="gramEnd"/>
+      <w:r>
+        <w:rPr>
+          <w:rFonts w:eastAsia="Times New Roman" w:cs="Times New Roman"/>
+        </w:rPr>
+        <w:t>) estimates the effect of eleven predictors while controlling for the others; results are reported as odds ratios with 95 percent confidence intervals.</w:t>
       </w:r>
     </w:p>
     <w:p>
@@ -3524,7 +4341,87 @@
         <w:rPr>
           <w:rFonts w:eastAsia="Times New Roman" w:cs="Times New Roman"/>
         </w:rPr>
-        <w:t>Phase 6 (06_modeling.ipynb) trains a classifier per target from seven candidate algorithms.  Each sits inside an imblearn.Pipeline with SMOTE upstream so resampling only touches training folds. GridSearchCV tunes hyperparameters on macro-F1 inside 5-fold stratified CV, and the best model per target is refit on the full sample and saved as outputs/models/best_&lt;factor&gt;.pkl.</w:t>
+        <w:t>Phase 6 (06_</w:t>
+      </w:r>
+      <w:proofErr w:type="gramStart"/>
+      <w:r>
+        <w:rPr>
+          <w:rFonts w:eastAsia="Times New Roman" w:cs="Times New Roman"/>
+        </w:rPr>
+        <w:t>modeling.ipynb</w:t>
+      </w:r>
+      <w:proofErr w:type="gramEnd"/>
+      <w:r>
+        <w:rPr>
+          <w:rFonts w:eastAsia="Times New Roman" w:cs="Times New Roman"/>
+        </w:rPr>
+        <w:t xml:space="preserve">) trains a classifier per target from seven candidate algorithms.  Each </w:t>
+      </w:r>
+      <w:proofErr w:type="gramStart"/>
+      <w:r>
+        <w:rPr>
+          <w:rFonts w:eastAsia="Times New Roman" w:cs="Times New Roman"/>
+        </w:rPr>
+        <w:t>sits</w:t>
+      </w:r>
+      <w:proofErr w:type="gramEnd"/>
+      <w:r>
+        <w:rPr>
+          <w:rFonts w:eastAsia="Times New Roman" w:cs="Times New Roman"/>
+        </w:rPr>
+        <w:t xml:space="preserve"> inside an </w:t>
+      </w:r>
+      <w:proofErr w:type="spellStart"/>
+      <w:proofErr w:type="gramStart"/>
+      <w:r>
+        <w:rPr>
+          <w:rFonts w:eastAsia="Times New Roman" w:cs="Times New Roman"/>
+        </w:rPr>
+        <w:t>imblearn.Pipeline</w:t>
+      </w:r>
+      <w:proofErr w:type="spellEnd"/>
+      <w:proofErr w:type="gramEnd"/>
+      <w:r>
+        <w:rPr>
+          <w:rFonts w:eastAsia="Times New Roman" w:cs="Times New Roman"/>
+        </w:rPr>
+        <w:t xml:space="preserve"> with SMOTE upstream so resampling only touches training folds. </w:t>
+      </w:r>
+      <w:proofErr w:type="spellStart"/>
+      <w:r>
+        <w:rPr>
+          <w:rFonts w:eastAsia="Times New Roman" w:cs="Times New Roman"/>
+        </w:rPr>
+        <w:t>GridSearchCV</w:t>
+      </w:r>
+      <w:proofErr w:type="spellEnd"/>
+      <w:r>
+        <w:rPr>
+          <w:rFonts w:eastAsia="Times New Roman" w:cs="Times New Roman"/>
+        </w:rPr>
+        <w:t xml:space="preserve"> tunes hyperparameters on macro-F1 inside 5-fold stratified CV, and the best model per target is refit on the full sample and saved as outputs/models/best_&lt;factor</w:t>
+      </w:r>
+      <w:proofErr w:type="gramStart"/>
+      <w:r>
+        <w:rPr>
+          <w:rFonts w:eastAsia="Times New Roman" w:cs="Times New Roman"/>
+        </w:rPr>
+        <w:t>&gt;.</w:t>
+      </w:r>
+      <w:proofErr w:type="spellStart"/>
+      <w:r>
+        <w:rPr>
+          <w:rFonts w:eastAsia="Times New Roman" w:cs="Times New Roman"/>
+        </w:rPr>
+        <w:t>pkl</w:t>
+      </w:r>
+      <w:proofErr w:type="spellEnd"/>
+      <w:proofErr w:type="gramEnd"/>
+      <w:r>
+        <w:rPr>
+          <w:rFonts w:eastAsia="Times New Roman" w:cs="Times New Roman"/>
+        </w:rPr>
+        <w:t>.</w:t>
       </w:r>
     </w:p>
     <w:p>
@@ -3547,11 +4444,33 @@
         <w:spacing w:after="160" w:line="336" w:lineRule="auto"/>
         <w:jc w:val="both"/>
       </w:pPr>
-      <w:r>
-        <w:rPr>
-          <w:rFonts w:eastAsia="Times New Roman" w:cs="Times New Roman"/>
-        </w:rPr>
-        <w:t>Regularised linear classifier used as the baseline (L2 penalty, class_weight balanced).  Any tree-based method that fails to beat it on a factor is either overfitting or getting nothing from feature interactions.</w:t>
+      <w:proofErr w:type="spellStart"/>
+      <w:r>
+        <w:rPr>
+          <w:rFonts w:eastAsia="Times New Roman" w:cs="Times New Roman"/>
+        </w:rPr>
+        <w:t>Regularised</w:t>
+      </w:r>
+      <w:proofErr w:type="spellEnd"/>
+      <w:r>
+        <w:rPr>
+          <w:rFonts w:eastAsia="Times New Roman" w:cs="Times New Roman"/>
+        </w:rPr>
+        <w:t xml:space="preserve"> linear classifier used as the baseline (L2 penalty, </w:t>
+      </w:r>
+      <w:proofErr w:type="spellStart"/>
+      <w:r>
+        <w:rPr>
+          <w:rFonts w:eastAsia="Times New Roman" w:cs="Times New Roman"/>
+        </w:rPr>
+        <w:t>class_weight</w:t>
+      </w:r>
+      <w:proofErr w:type="spellEnd"/>
+      <w:r>
+        <w:rPr>
+          <w:rFonts w:eastAsia="Times New Roman" w:cs="Times New Roman"/>
+        </w:rPr>
+        <w:t xml:space="preserve"> balanced).  Any tree-based method that fails to beat it on a factor is either overfitting or getting nothing from feature interactions.</w:t>
       </w:r>
     </w:p>
     <w:p>
@@ -3578,7 +4497,49 @@
         <w:rPr>
           <w:rFonts w:eastAsia="Times New Roman" w:cs="Times New Roman"/>
         </w:rPr>
-        <w:t>Single CART tree with max_depth in {3, 5, 7} and min_samples_leaf in {1, 3, 5} tuned via grid search.  Included as the ensembling floor; not competitive on its own for any of the six targets.</w:t>
+        <w:t xml:space="preserve">Single CART tree with </w:t>
+      </w:r>
+      <w:proofErr w:type="spellStart"/>
+      <w:r>
+        <w:rPr>
+          <w:rFonts w:eastAsia="Times New Roman" w:cs="Times New Roman"/>
+        </w:rPr>
+        <w:t>max_depth</w:t>
+      </w:r>
+      <w:proofErr w:type="spellEnd"/>
+      <w:r>
+        <w:rPr>
+          <w:rFonts w:eastAsia="Times New Roman" w:cs="Times New Roman"/>
+        </w:rPr>
+        <w:t xml:space="preserve"> in {3, 5, 7} and </w:t>
+      </w:r>
+      <w:proofErr w:type="spellStart"/>
+      <w:r>
+        <w:rPr>
+          <w:rFonts w:eastAsia="Times New Roman" w:cs="Times New Roman"/>
+        </w:rPr>
+        <w:t>min_samples_leaf</w:t>
+      </w:r>
+      <w:proofErr w:type="spellEnd"/>
+      <w:r>
+        <w:rPr>
+          <w:rFonts w:eastAsia="Times New Roman" w:cs="Times New Roman"/>
+        </w:rPr>
+        <w:t xml:space="preserve"> in {1, 3, 5} tuned via grid search.  Included as the </w:t>
+      </w:r>
+      <w:proofErr w:type="spellStart"/>
+      <w:r>
+        <w:rPr>
+          <w:rFonts w:eastAsia="Times New Roman" w:cs="Times New Roman"/>
+        </w:rPr>
+        <w:t>ensembling</w:t>
+      </w:r>
+      <w:proofErr w:type="spellEnd"/>
+      <w:r>
+        <w:rPr>
+          <w:rFonts w:eastAsia="Times New Roman" w:cs="Times New Roman"/>
+        </w:rPr>
+        <w:t xml:space="preserve"> floor; not competitive on its own for any of the six targets.</w:t>
       </w:r>
     </w:p>
     <w:p>
@@ -3632,7 +4593,21 @@
         <w:rPr>
           <w:rFonts w:eastAsia="Times New Roman" w:cs="Times New Roman"/>
         </w:rPr>
-        <w:t>Like Random Forest but with fully random splits per node.  The extra randomisation lowers between-tree correlation and helped it win on Vibration.</w:t>
+        <w:t xml:space="preserve">Like Random Forest but with fully random splits per node.  The extra </w:t>
+      </w:r>
+      <w:proofErr w:type="spellStart"/>
+      <w:r>
+        <w:rPr>
+          <w:rFonts w:eastAsia="Times New Roman" w:cs="Times New Roman"/>
+        </w:rPr>
+        <w:t>randomisation</w:t>
+      </w:r>
+      <w:proofErr w:type="spellEnd"/>
+      <w:r>
+        <w:rPr>
+          <w:rFonts w:eastAsia="Times New Roman" w:cs="Times New Roman"/>
+        </w:rPr>
+        <w:t xml:space="preserve"> lowers between-tree correlation and helped it win on Vibration.</w:t>
       </w:r>
     </w:p>
     <w:p>
@@ -3675,26 +4650,9 @@
           <w:sz w:val="24"/>
         </w:rPr>
         <w:lastRenderedPageBreak/>
-        <w:t>2.6.6   XGBoost</w:t>
-      </w:r>
-    </w:p>
-    <w:p>
-      <w:pPr>
-        <w:spacing w:after="160" w:line="336" w:lineRule="auto"/>
-        <w:jc w:val="both"/>
-      </w:pPr>
-      <w:r>
-        <w:rPr>
-          <w:rFonts w:eastAsia="Times New Roman" w:cs="Times New Roman"/>
-        </w:rPr>
-        <w:t>Gradient-boosted trees with L2 regularisation on the leaf weights.  Placed second on several targets but did not win any at the default search budget.</w:t>
-      </w:r>
-    </w:p>
-    <w:p>
-      <w:pPr>
-        <w:pStyle w:val="Heading5"/>
-        <w:spacing w:before="180" w:after="60"/>
-      </w:pPr>
+        <w:t xml:space="preserve">2.6.6   </w:t>
+      </w:r>
+      <w:proofErr w:type="spellStart"/>
       <w:r>
         <w:rPr>
           <w:rFonts w:ascii="Times New Roman" w:eastAsia="Times New Roman" w:hAnsi="Times New Roman" w:cs="Times New Roman"/>
@@ -3702,8 +4660,9 @@
           <w:color w:val="000000"/>
           <w:sz w:val="24"/>
         </w:rPr>
-        <w:t>2.6.7   Stacking Classifier</w:t>
-      </w:r>
+        <w:t>XGBoost</w:t>
+      </w:r>
+      <w:proofErr w:type="spellEnd"/>
     </w:p>
     <w:p>
       <w:pPr>
@@ -3714,7 +4673,21 @@
         <w:rPr>
           <w:rFonts w:eastAsia="Times New Roman" w:cs="Times New Roman"/>
         </w:rPr>
-        <w:t>Meta-learner taking the out-of-fold predictions of Random Forest, Extra Trees, HistGBM, and XGBoost as inputs and fitting a Logistic Regression on top.  Failed to beat the strongest base learner because the four base learners largely agreed.</w:t>
+        <w:t xml:space="preserve">Gradient-boosted trees with L2 </w:t>
+      </w:r>
+      <w:proofErr w:type="spellStart"/>
+      <w:r>
+        <w:rPr>
+          <w:rFonts w:eastAsia="Times New Roman" w:cs="Times New Roman"/>
+        </w:rPr>
+        <w:t>regularisation</w:t>
+      </w:r>
+      <w:proofErr w:type="spellEnd"/>
+      <w:r>
+        <w:rPr>
+          <w:rFonts w:eastAsia="Times New Roman" w:cs="Times New Roman"/>
+        </w:rPr>
+        <w:t xml:space="preserve"> on the leaf weights.  Placed second on several targets but did not win any at the default search budget.</w:t>
       </w:r>
     </w:p>
     <w:p>
@@ -3729,7 +4702,7 @@
           <w:color w:val="000000"/>
           <w:sz w:val="24"/>
         </w:rPr>
-        <w:t>2.6.8   SMOTE and cross-validation</w:t>
+        <w:t>2.6.7   Stacking Classifier</w:t>
       </w:r>
     </w:p>
     <w:p>
@@ -3741,7 +4714,35 @@
         <w:rPr>
           <w:rFonts w:eastAsia="Times New Roman" w:cs="Times New Roman"/>
         </w:rPr>
-        <w:t>SMOTE synthesises new minority-class samples along segments between k nearest minority neighbours.  Wrapping it in imblearn.Pipeline keeps the synthesis inside training folds only, so validation-fold accuracy is never inflated.  k_neighbors is set per target below the minority training-fold count; GridSearchCV picks hyperparameters on macro-F1 with StratifiedKFold(5, shuffle=True, random_state=42).</w:t>
+        <w:t xml:space="preserve">Meta-learner taking the out-of-fold predictions of Random Forest, Extra Trees, </w:t>
+      </w:r>
+      <w:proofErr w:type="spellStart"/>
+      <w:r>
+        <w:rPr>
+          <w:rFonts w:eastAsia="Times New Roman" w:cs="Times New Roman"/>
+        </w:rPr>
+        <w:t>HistGBM</w:t>
+      </w:r>
+      <w:proofErr w:type="spellEnd"/>
+      <w:r>
+        <w:rPr>
+          <w:rFonts w:eastAsia="Times New Roman" w:cs="Times New Roman"/>
+        </w:rPr>
+        <w:t xml:space="preserve">, and </w:t>
+      </w:r>
+      <w:proofErr w:type="spellStart"/>
+      <w:r>
+        <w:rPr>
+          <w:rFonts w:eastAsia="Times New Roman" w:cs="Times New Roman"/>
+        </w:rPr>
+        <w:t>XGBoost</w:t>
+      </w:r>
+      <w:proofErr w:type="spellEnd"/>
+      <w:r>
+        <w:rPr>
+          <w:rFonts w:eastAsia="Times New Roman" w:cs="Times New Roman"/>
+        </w:rPr>
+        <w:t xml:space="preserve"> as inputs and fitting a Logistic Regression on top.  Failed to beat the strongest base learner because the four base learners largely agreed.</w:t>
       </w:r>
     </w:p>
     <w:p>
@@ -3756,7 +4757,7 @@
           <w:color w:val="000000"/>
           <w:sz w:val="24"/>
         </w:rPr>
-        <w:t>2.6.9   Per-target feature exclusions</w:t>
+        <w:t>2.6.8   SMOTE and cross-validation</w:t>
       </w:r>
     </w:p>
     <w:p>
@@ -3768,7 +4769,156 @@
         <w:rPr>
           <w:rFonts w:eastAsia="Times New Roman" w:cs="Times New Roman"/>
         </w:rPr>
-        <w:t>Each target excludes the survey inputs that directly define its Stage-1 label (otherwise the model would memorise the rule).  Posture additionally receives the 11 RULA components and 8 QEC scores, giving 63 total features.</w:t>
+        <w:t xml:space="preserve">SMOTE </w:t>
+      </w:r>
+      <w:proofErr w:type="spellStart"/>
+      <w:r>
+        <w:rPr>
+          <w:rFonts w:eastAsia="Times New Roman" w:cs="Times New Roman"/>
+        </w:rPr>
+        <w:t>synthesises</w:t>
+      </w:r>
+      <w:proofErr w:type="spellEnd"/>
+      <w:r>
+        <w:rPr>
+          <w:rFonts w:eastAsia="Times New Roman" w:cs="Times New Roman"/>
+        </w:rPr>
+        <w:t xml:space="preserve"> new minority-class samples along segments between k nearest minority </w:t>
+      </w:r>
+      <w:proofErr w:type="spellStart"/>
+      <w:r>
+        <w:rPr>
+          <w:rFonts w:eastAsia="Times New Roman" w:cs="Times New Roman"/>
+        </w:rPr>
+        <w:t>neighbours</w:t>
+      </w:r>
+      <w:proofErr w:type="spellEnd"/>
+      <w:r>
+        <w:rPr>
+          <w:rFonts w:eastAsia="Times New Roman" w:cs="Times New Roman"/>
+        </w:rPr>
+        <w:t xml:space="preserve">.  Wrapping it in </w:t>
+      </w:r>
+      <w:proofErr w:type="spellStart"/>
+      <w:proofErr w:type="gramStart"/>
+      <w:r>
+        <w:rPr>
+          <w:rFonts w:eastAsia="Times New Roman" w:cs="Times New Roman"/>
+        </w:rPr>
+        <w:t>imblearn.Pipeline</w:t>
+      </w:r>
+      <w:proofErr w:type="spellEnd"/>
+      <w:proofErr w:type="gramEnd"/>
+      <w:r>
+        <w:rPr>
+          <w:rFonts w:eastAsia="Times New Roman" w:cs="Times New Roman"/>
+        </w:rPr>
+        <w:t xml:space="preserve"> keeps the synthesis inside training folds only, so validation-fold accuracy is never inflated.  </w:t>
+      </w:r>
+      <w:proofErr w:type="spellStart"/>
+      <w:r>
+        <w:rPr>
+          <w:rFonts w:eastAsia="Times New Roman" w:cs="Times New Roman"/>
+        </w:rPr>
+        <w:t>k_neighbors</w:t>
+      </w:r>
+      <w:proofErr w:type="spellEnd"/>
+      <w:r>
+        <w:rPr>
+          <w:rFonts w:eastAsia="Times New Roman" w:cs="Times New Roman"/>
+        </w:rPr>
+        <w:t xml:space="preserve"> is set per target below the minority training-fold count; </w:t>
+      </w:r>
+      <w:proofErr w:type="spellStart"/>
+      <w:r>
+        <w:rPr>
+          <w:rFonts w:eastAsia="Times New Roman" w:cs="Times New Roman"/>
+        </w:rPr>
+        <w:t>GridSearchCV</w:t>
+      </w:r>
+      <w:proofErr w:type="spellEnd"/>
+      <w:r>
+        <w:rPr>
+          <w:rFonts w:eastAsia="Times New Roman" w:cs="Times New Roman"/>
+        </w:rPr>
+        <w:t xml:space="preserve"> picks hyperparameters on macro-F1 with </w:t>
+      </w:r>
+      <w:proofErr w:type="spellStart"/>
+      <w:proofErr w:type="gramStart"/>
+      <w:r>
+        <w:rPr>
+          <w:rFonts w:eastAsia="Times New Roman" w:cs="Times New Roman"/>
+        </w:rPr>
+        <w:t>StratifiedKFold</w:t>
+      </w:r>
+      <w:proofErr w:type="spellEnd"/>
+      <w:r>
+        <w:rPr>
+          <w:rFonts w:eastAsia="Times New Roman" w:cs="Times New Roman"/>
+        </w:rPr>
+        <w:t>(</w:t>
+      </w:r>
+      <w:proofErr w:type="gramEnd"/>
+      <w:r>
+        <w:rPr>
+          <w:rFonts w:eastAsia="Times New Roman" w:cs="Times New Roman"/>
+        </w:rPr>
+        <w:t xml:space="preserve">5, shuffle=True, </w:t>
+      </w:r>
+      <w:proofErr w:type="spellStart"/>
+      <w:r>
+        <w:rPr>
+          <w:rFonts w:eastAsia="Times New Roman" w:cs="Times New Roman"/>
+        </w:rPr>
+        <w:t>random_state</w:t>
+      </w:r>
+      <w:proofErr w:type="spellEnd"/>
+      <w:r>
+        <w:rPr>
+          <w:rFonts w:eastAsia="Times New Roman" w:cs="Times New Roman"/>
+        </w:rPr>
+        <w:t>=42).</w:t>
+      </w:r>
+    </w:p>
+    <w:p>
+      <w:pPr>
+        <w:pStyle w:val="Heading5"/>
+        <w:spacing w:before="180" w:after="60"/>
+      </w:pPr>
+      <w:r>
+        <w:rPr>
+          <w:rFonts w:ascii="Times New Roman" w:eastAsia="Times New Roman" w:hAnsi="Times New Roman" w:cs="Times New Roman"/>
+          <w:b/>
+          <w:color w:val="000000"/>
+          <w:sz w:val="24"/>
+        </w:rPr>
+        <w:t>2.6.9   Per-target feature exclusions</w:t>
+      </w:r>
+    </w:p>
+    <w:p>
+      <w:pPr>
+        <w:spacing w:after="160" w:line="336" w:lineRule="auto"/>
+        <w:jc w:val="both"/>
+      </w:pPr>
+      <w:r>
+        <w:rPr>
+          <w:rFonts w:eastAsia="Times New Roman" w:cs="Times New Roman"/>
+        </w:rPr>
+        <w:t xml:space="preserve">Each target excludes the survey inputs that directly define its Stage-1 label (otherwise the model would </w:t>
+      </w:r>
+      <w:proofErr w:type="spellStart"/>
+      <w:r>
+        <w:rPr>
+          <w:rFonts w:eastAsia="Times New Roman" w:cs="Times New Roman"/>
+        </w:rPr>
+        <w:t>memorise</w:t>
+      </w:r>
+      <w:proofErr w:type="spellEnd"/>
+      <w:r>
+        <w:rPr>
+          <w:rFonts w:eastAsia="Times New Roman" w:cs="Times New Roman"/>
+        </w:rPr>
+        <w:t xml:space="preserve"> the rule).  Posture additionally receives the 11 RULA components and 8 QEC scores, giving 63 total features.</w:t>
       </w:r>
     </w:p>
     <w:tbl>
@@ -3878,13 +5028,31 @@
             <w:pPr>
               <w:spacing w:before="20" w:after="20"/>
             </w:pPr>
-            <w:r>
-              <w:rPr>
-                <w:rFonts w:eastAsia="Times New Roman" w:cs="Times New Roman"/>
-                <w:sz w:val="20"/>
-              </w:rPr>
-              <w:t>force_exertion, force_x_age</w:t>
-            </w:r>
+            <w:proofErr w:type="spellStart"/>
+            <w:r>
+              <w:rPr>
+                <w:rFonts w:eastAsia="Times New Roman" w:cs="Times New Roman"/>
+                <w:sz w:val="20"/>
+              </w:rPr>
+              <w:t>force_exertion</w:t>
+            </w:r>
+            <w:proofErr w:type="spellEnd"/>
+            <w:r>
+              <w:rPr>
+                <w:rFonts w:eastAsia="Times New Roman" w:cs="Times New Roman"/>
+                <w:sz w:val="20"/>
+              </w:rPr>
+              <w:t xml:space="preserve">, </w:t>
+            </w:r>
+            <w:proofErr w:type="spellStart"/>
+            <w:r>
+              <w:rPr>
+                <w:rFonts w:eastAsia="Times New Roman" w:cs="Times New Roman"/>
+                <w:sz w:val="20"/>
+              </w:rPr>
+              <w:t>force_x_age</w:t>
+            </w:r>
+            <w:proofErr w:type="spellEnd"/>
           </w:p>
         </w:tc>
         <w:tc>
@@ -3936,13 +5104,47 @@
             <w:pPr>
               <w:spacing w:before="20" w:after="20"/>
             </w:pPr>
-            <w:r>
-              <w:rPr>
-                <w:rFonts w:eastAsia="Times New Roman" w:cs="Times New Roman"/>
-                <w:sz w:val="20"/>
-              </w:rPr>
-              <w:t>deliveries_num, work_hours_num, deliv_x_days</w:t>
-            </w:r>
+            <w:proofErr w:type="spellStart"/>
+            <w:r>
+              <w:rPr>
+                <w:rFonts w:eastAsia="Times New Roman" w:cs="Times New Roman"/>
+                <w:sz w:val="20"/>
+              </w:rPr>
+              <w:t>deliveries_num</w:t>
+            </w:r>
+            <w:proofErr w:type="spellEnd"/>
+            <w:r>
+              <w:rPr>
+                <w:rFonts w:eastAsia="Times New Roman" w:cs="Times New Roman"/>
+                <w:sz w:val="20"/>
+              </w:rPr>
+              <w:t xml:space="preserve">, </w:t>
+            </w:r>
+            <w:proofErr w:type="spellStart"/>
+            <w:r>
+              <w:rPr>
+                <w:rFonts w:eastAsia="Times New Roman" w:cs="Times New Roman"/>
+                <w:sz w:val="20"/>
+              </w:rPr>
+              <w:t>work_hours_num</w:t>
+            </w:r>
+            <w:proofErr w:type="spellEnd"/>
+            <w:r>
+              <w:rPr>
+                <w:rFonts w:eastAsia="Times New Roman" w:cs="Times New Roman"/>
+                <w:sz w:val="20"/>
+              </w:rPr>
+              <w:t xml:space="preserve">, </w:t>
+            </w:r>
+            <w:proofErr w:type="spellStart"/>
+            <w:r>
+              <w:rPr>
+                <w:rFonts w:eastAsia="Times New Roman" w:cs="Times New Roman"/>
+                <w:sz w:val="20"/>
+              </w:rPr>
+              <w:t>deliv_x_days</w:t>
+            </w:r>
+            <w:proofErr w:type="spellEnd"/>
           </w:p>
         </w:tc>
         <w:tc>
@@ -3994,13 +5196,31 @@
             <w:pPr>
               <w:spacing w:before="20" w:after="20"/>
             </w:pPr>
-            <w:r>
-              <w:rPr>
-                <w:rFonts w:eastAsia="Times New Roman" w:cs="Times New Roman"/>
-                <w:sz w:val="20"/>
-              </w:rPr>
-              <w:t>work_hours_num, vibration_index</w:t>
-            </w:r>
+            <w:proofErr w:type="spellStart"/>
+            <w:r>
+              <w:rPr>
+                <w:rFonts w:eastAsia="Times New Roman" w:cs="Times New Roman"/>
+                <w:sz w:val="20"/>
+              </w:rPr>
+              <w:t>work_hours_num</w:t>
+            </w:r>
+            <w:proofErr w:type="spellEnd"/>
+            <w:r>
+              <w:rPr>
+                <w:rFonts w:eastAsia="Times New Roman" w:cs="Times New Roman"/>
+                <w:sz w:val="20"/>
+              </w:rPr>
+              <w:t xml:space="preserve">, </w:t>
+            </w:r>
+            <w:proofErr w:type="spellStart"/>
+            <w:r>
+              <w:rPr>
+                <w:rFonts w:eastAsia="Times New Roman" w:cs="Times New Roman"/>
+                <w:sz w:val="20"/>
+              </w:rPr>
+              <w:t>vibration_index</w:t>
+            </w:r>
+            <w:proofErr w:type="spellEnd"/>
           </w:p>
         </w:tc>
         <w:tc>
@@ -4052,13 +5272,47 @@
             <w:pPr>
               <w:spacing w:before="20" w:after="20"/>
             </w:pPr>
-            <w:r>
-              <w:rPr>
-                <w:rFonts w:eastAsia="Times New Roman" w:cs="Times New Roman"/>
-                <w:sz w:val="20"/>
-              </w:rPr>
-              <w:t>vibration_index, vehicle_rank, work_hours_num</w:t>
-            </w:r>
+            <w:proofErr w:type="spellStart"/>
+            <w:r>
+              <w:rPr>
+                <w:rFonts w:eastAsia="Times New Roman" w:cs="Times New Roman"/>
+                <w:sz w:val="20"/>
+              </w:rPr>
+              <w:t>vibration_index</w:t>
+            </w:r>
+            <w:proofErr w:type="spellEnd"/>
+            <w:r>
+              <w:rPr>
+                <w:rFonts w:eastAsia="Times New Roman" w:cs="Times New Roman"/>
+                <w:sz w:val="20"/>
+              </w:rPr>
+              <w:t xml:space="preserve">, </w:t>
+            </w:r>
+            <w:proofErr w:type="spellStart"/>
+            <w:r>
+              <w:rPr>
+                <w:rFonts w:eastAsia="Times New Roman" w:cs="Times New Roman"/>
+                <w:sz w:val="20"/>
+              </w:rPr>
+              <w:t>vehicle_rank</w:t>
+            </w:r>
+            <w:proofErr w:type="spellEnd"/>
+            <w:r>
+              <w:rPr>
+                <w:rFonts w:eastAsia="Times New Roman" w:cs="Times New Roman"/>
+                <w:sz w:val="20"/>
+              </w:rPr>
+              <w:t xml:space="preserve">, </w:t>
+            </w:r>
+            <w:proofErr w:type="spellStart"/>
+            <w:r>
+              <w:rPr>
+                <w:rFonts w:eastAsia="Times New Roman" w:cs="Times New Roman"/>
+                <w:sz w:val="20"/>
+              </w:rPr>
+              <w:t>work_hours_num</w:t>
+            </w:r>
+            <w:proofErr w:type="spellEnd"/>
           </w:p>
         </w:tc>
         <w:tc>
@@ -4110,13 +5364,31 @@
             <w:pPr>
               <w:spacing w:before="20" w:after="20"/>
             </w:pPr>
-            <w:r>
-              <w:rPr>
-                <w:rFonts w:eastAsia="Times New Roman" w:cs="Times New Roman"/>
-                <w:sz w:val="20"/>
-              </w:rPr>
-              <w:t>carrying_contact_rank, work_hours_num</w:t>
-            </w:r>
+            <w:proofErr w:type="spellStart"/>
+            <w:r>
+              <w:rPr>
+                <w:rFonts w:eastAsia="Times New Roman" w:cs="Times New Roman"/>
+                <w:sz w:val="20"/>
+              </w:rPr>
+              <w:t>carrying_contact_rank</w:t>
+            </w:r>
+            <w:proofErr w:type="spellEnd"/>
+            <w:r>
+              <w:rPr>
+                <w:rFonts w:eastAsia="Times New Roman" w:cs="Times New Roman"/>
+                <w:sz w:val="20"/>
+              </w:rPr>
+              <w:t xml:space="preserve">, </w:t>
+            </w:r>
+            <w:proofErr w:type="spellStart"/>
+            <w:r>
+              <w:rPr>
+                <w:rFonts w:eastAsia="Times New Roman" w:cs="Times New Roman"/>
+                <w:sz w:val="20"/>
+              </w:rPr>
+              <w:t>work_hours_num</w:t>
+            </w:r>
+            <w:proofErr w:type="spellEnd"/>
           </w:p>
         </w:tc>
         <w:tc>
@@ -4239,7 +5511,77 @@
         <w:rPr>
           <w:rFonts w:eastAsia="Times New Roman" w:cs="Times New Roman"/>
         </w:rPr>
-        <w:t>Phase 7 (07_evaluation.ipynb) uses cross_val_predict for out-of-fold predictions and writes per-class precision / recall / F1 / support, confusion matrices, one-vs-rest ROC curves with per-class AUC (macro AUC is the unweighted mean), and feature importance (feature_importances_ for tree models, abs(coef_) for Logistic Regression).</w:t>
+        <w:t>Phase 7 (07_</w:t>
+      </w:r>
+      <w:proofErr w:type="gramStart"/>
+      <w:r>
+        <w:rPr>
+          <w:rFonts w:eastAsia="Times New Roman" w:cs="Times New Roman"/>
+        </w:rPr>
+        <w:t>evaluation.ipynb</w:t>
+      </w:r>
+      <w:proofErr w:type="gramEnd"/>
+      <w:r>
+        <w:rPr>
+          <w:rFonts w:eastAsia="Times New Roman" w:cs="Times New Roman"/>
+        </w:rPr>
+        <w:t xml:space="preserve">) uses </w:t>
+      </w:r>
+      <w:proofErr w:type="spellStart"/>
+      <w:r>
+        <w:rPr>
+          <w:rFonts w:eastAsia="Times New Roman" w:cs="Times New Roman"/>
+        </w:rPr>
+        <w:t>cross_val_predict</w:t>
+      </w:r>
+      <w:proofErr w:type="spellEnd"/>
+      <w:r>
+        <w:rPr>
+          <w:rFonts w:eastAsia="Times New Roman" w:cs="Times New Roman"/>
+        </w:rPr>
+        <w:t xml:space="preserve"> for out-of-fold predictions and writes per-class precision / recall / F1 / support, confusion matrices, one-vs-rest ROC curves with per-class AUC (</w:t>
+      </w:r>
+      <w:proofErr w:type="gramStart"/>
+      <w:r>
+        <w:rPr>
+          <w:rFonts w:eastAsia="Times New Roman" w:cs="Times New Roman"/>
+        </w:rPr>
+        <w:t>macro AUC</w:t>
+      </w:r>
+      <w:proofErr w:type="gramEnd"/>
+      <w:r>
+        <w:rPr>
+          <w:rFonts w:eastAsia="Times New Roman" w:cs="Times New Roman"/>
+        </w:rPr>
+        <w:t xml:space="preserve"> is the unweighted mean), and feature importance (</w:t>
+      </w:r>
+      <w:proofErr w:type="spellStart"/>
+      <w:r>
+        <w:rPr>
+          <w:rFonts w:eastAsia="Times New Roman" w:cs="Times New Roman"/>
+        </w:rPr>
+        <w:t>feature_importances</w:t>
+      </w:r>
+      <w:proofErr w:type="spellEnd"/>
+      <w:r>
+        <w:rPr>
+          <w:rFonts w:eastAsia="Times New Roman" w:cs="Times New Roman"/>
+        </w:rPr>
+        <w:t>_ for tree models, abs(</w:t>
+      </w:r>
+      <w:proofErr w:type="spellStart"/>
+      <w:r>
+        <w:rPr>
+          <w:rFonts w:eastAsia="Times New Roman" w:cs="Times New Roman"/>
+        </w:rPr>
+        <w:t>coef</w:t>
+      </w:r>
+      <w:proofErr w:type="spellEnd"/>
+      <w:r>
+        <w:rPr>
+          <w:rFonts w:eastAsia="Times New Roman" w:cs="Times New Roman"/>
+        </w:rPr>
+        <w:t>_) for Logistic Regression).</w:t>
       </w:r>
     </w:p>
     <w:p>
@@ -4281,7 +5623,21 @@
         <w:rPr>
           <w:rFonts w:eastAsia="Times New Roman" w:cs="Times New Roman"/>
         </w:rPr>
-        <w:t>The full pipeline is implemented across seven Jupyter notebooks (01 through 07) plus a Streamlit application. Every notebook is designed to run standalone from its previous input file, so the whole pipeline can be regenerated end to end with a fixed random seed of 42.</w:t>
+        <w:t xml:space="preserve">The full pipeline is implemented across seven Jupyter notebooks (01 through 07) plus a </w:t>
+      </w:r>
+      <w:proofErr w:type="spellStart"/>
+      <w:r>
+        <w:rPr>
+          <w:rFonts w:eastAsia="Times New Roman" w:cs="Times New Roman"/>
+        </w:rPr>
+        <w:t>Streamlit</w:t>
+      </w:r>
+      <w:proofErr w:type="spellEnd"/>
+      <w:r>
+        <w:rPr>
+          <w:rFonts w:eastAsia="Times New Roman" w:cs="Times New Roman"/>
+        </w:rPr>
+        <w:t xml:space="preserve"> application. Every notebook is designed to run standalone from its previous input file, so the whole pipeline can be regenerated end to end with a fixed random seed of 42.</w:t>
       </w:r>
     </w:p>
     <w:p>
@@ -4293,7 +5649,21 @@
         <w:rPr>
           <w:rFonts w:eastAsia="Times New Roman" w:cs="Times New Roman"/>
         </w:rPr>
-        <w:t>01_data_cleaning normalises the raw CSV and validates row counts.</w:t>
+        <w:t xml:space="preserve">01_data_cleaning </w:t>
+      </w:r>
+      <w:proofErr w:type="spellStart"/>
+      <w:r>
+        <w:rPr>
+          <w:rFonts w:eastAsia="Times New Roman" w:cs="Times New Roman"/>
+        </w:rPr>
+        <w:t>normalises</w:t>
+      </w:r>
+      <w:proofErr w:type="spellEnd"/>
+      <w:r>
+        <w:rPr>
+          <w:rFonts w:eastAsia="Times New Roman" w:cs="Times New Roman"/>
+        </w:rPr>
+        <w:t xml:space="preserve"> the raw CSV and validates row counts.</w:t>
       </w:r>
     </w:p>
     <w:p>
@@ -4305,7 +5675,21 @@
         <w:rPr>
           <w:rFonts w:eastAsia="Times New Roman" w:cs="Times New Roman"/>
         </w:rPr>
-        <w:t>02_feature_engineering encodes categoricals, derives composite scores, aliases the 18 binary items, and merges the posture observations by severity rank.</w:t>
+        <w:t xml:space="preserve">02_feature_engineering encodes </w:t>
+      </w:r>
+      <w:proofErr w:type="spellStart"/>
+      <w:r>
+        <w:rPr>
+          <w:rFonts w:eastAsia="Times New Roman" w:cs="Times New Roman"/>
+        </w:rPr>
+        <w:t>categoricals</w:t>
+      </w:r>
+      <w:proofErr w:type="spellEnd"/>
+      <w:r>
+        <w:rPr>
+          <w:rFonts w:eastAsia="Times New Roman" w:cs="Times New Roman"/>
+        </w:rPr>
+        <w:t>, derives composite scores, aliases the 18 binary items, and merges the posture observations by severity rank.</w:t>
       </w:r>
     </w:p>
     <w:p>
@@ -4353,7 +5737,21 @@
         <w:rPr>
           <w:rFonts w:eastAsia="Times New Roman" w:cs="Times New Roman"/>
         </w:rPr>
-        <w:t>06_modeling runs SMOTE plus GridSearchCV across 7 algorithms per target and keeps the best by F1 macro.</w:t>
+        <w:t xml:space="preserve">06_modeling runs SMOTE plus </w:t>
+      </w:r>
+      <w:proofErr w:type="spellStart"/>
+      <w:r>
+        <w:rPr>
+          <w:rFonts w:eastAsia="Times New Roman" w:cs="Times New Roman"/>
+        </w:rPr>
+        <w:t>GridSearchCV</w:t>
+      </w:r>
+      <w:proofErr w:type="spellEnd"/>
+      <w:r>
+        <w:rPr>
+          <w:rFonts w:eastAsia="Times New Roman" w:cs="Times New Roman"/>
+        </w:rPr>
+        <w:t xml:space="preserve"> across 7 algorithms per target and keeps the best by F1 macro.</w:t>
       </w:r>
     </w:p>
     <w:p>
@@ -4442,7 +5840,21 @@
         <w:rPr>
           <w:rFonts w:eastAsia="Times New Roman" w:cs="Times New Roman"/>
         </w:rPr>
-        <w:t>Each participant gave verbal consent before either instrument was administered. The 36-item Google Form was completed on a researcher-provided phone in about 15 to 20 minutes. Posture was recorded on paper by a trained observer during a natural delivery task, capturing the 11 RULA elements and 8 QEC region / exposure scores in one pass. Riders whose demographic or NMQ responses were incomplete after follow-up were excluded and are not part of the final 182. Data was anonymised at the point of collection; no rider identifiers appear in the released model_ready.csv or posture_data.xlsx files.</w:t>
+        <w:t xml:space="preserve">Each participant gave verbal consent before either instrument was administered. The 36-item Google Form was completed on a researcher-provided phone in about 15 to 20 minutes. Posture was recorded on paper by a trained observer during a natural delivery task, capturing the 11 RULA elements and 8 QEC region / exposure scores in one pass. Riders whose demographic or NMQ responses were incomplete after follow-up were excluded and are not part of the final 182. Data was </w:t>
+      </w:r>
+      <w:proofErr w:type="spellStart"/>
+      <w:r>
+        <w:rPr>
+          <w:rFonts w:eastAsia="Times New Roman" w:cs="Times New Roman"/>
+        </w:rPr>
+        <w:t>anonymised</w:t>
+      </w:r>
+      <w:proofErr w:type="spellEnd"/>
+      <w:r>
+        <w:rPr>
+          <w:rFonts w:eastAsia="Times New Roman" w:cs="Times New Roman"/>
+        </w:rPr>
+        <w:t xml:space="preserve"> at the point of collection; no rider identifiers appear in the released model_ready.csv or posture_data.xlsx files.</w:t>
       </w:r>
     </w:p>
     <w:p>
@@ -4468,7 +5880,21 @@
         <w:rPr>
           <w:rFonts w:eastAsia="Times New Roman" w:cs="Times New Roman"/>
         </w:rPr>
-        <w:t>Data preparation ran in two notebooks. 01_data_cleaning loaded the raw Google Form CSV, standardised text answers to canonical Yes / No values, corrected a handful of column-name typos, and dropped rows that were incomplete after follow-up. The cleaned CSV was 182 rows and 48 columns.</w:t>
+        <w:t xml:space="preserve">Data preparation ran in two notebooks. 01_data_cleaning loaded the raw Google Form CSV, </w:t>
+      </w:r>
+      <w:proofErr w:type="spellStart"/>
+      <w:r>
+        <w:rPr>
+          <w:rFonts w:eastAsia="Times New Roman" w:cs="Times New Roman"/>
+        </w:rPr>
+        <w:t>standardised</w:t>
+      </w:r>
+      <w:proofErr w:type="spellEnd"/>
+      <w:r>
+        <w:rPr>
+          <w:rFonts w:eastAsia="Times New Roman" w:cs="Times New Roman"/>
+        </w:rPr>
+        <w:t xml:space="preserve"> text answers to canonical Yes / No values, corrected a handful of column-name typos, and dropped rows that were incomplete after follow-up. The cleaned CSV was 182 rows and 48 columns.</w:t>
       </w:r>
     </w:p>
     <w:p>
@@ -4480,7 +5906,119 @@
         <w:rPr>
           <w:rFonts w:eastAsia="Times New Roman" w:cs="Times New Roman"/>
         </w:rPr>
-        <w:t>02_feature_engineering converted the cleaned CSV into the model-ready feature set. Ordered categorical bands (age, education, income, job duration, working hours, working days, deliveries per day, rest break) were encoded to consecutive integers preserving order. Vehicle type and carrying mode were converted to ranks so motorbike ranks higher than scooter for vibration exposure and handheld ranks higher than backpack and bike storage for contact stress. Composite scores were computed: workload_score as the mean of the six NASA-TLX items (with the dissatisfied item reversed), fatigue_score as the mean of the six Borg items, force_exertion as the Borg lifting item, and vibration_index as vehicle_rank times work_hours_num. Five product-form interactions were added (workload times fatigue, workload times age, force times age, fatigue times job duration, deliveries times days). The eighteen NMQ and 7-day items and the five outcome follow-ups were converted to short-named binary aliases (nmq_neck, d7_lower_back, out_reduced_perf, and so on).</w:t>
+        <w:t xml:space="preserve">02_feature_engineering converted the cleaned CSV into the model-ready feature set. Ordered categorical bands (age, education, income, job duration, working hours, working days, deliveries per day, rest break) were encoded to consecutive integers preserving order. Vehicle type and carrying mode were converted to ranks so motorbike ranks higher than scooter for vibration exposure and handheld ranks higher than backpack and bike storage for contact stress. Composite scores were computed: </w:t>
+      </w:r>
+      <w:proofErr w:type="spellStart"/>
+      <w:r>
+        <w:rPr>
+          <w:rFonts w:eastAsia="Times New Roman" w:cs="Times New Roman"/>
+        </w:rPr>
+        <w:t>workload_score</w:t>
+      </w:r>
+      <w:proofErr w:type="spellEnd"/>
+      <w:r>
+        <w:rPr>
+          <w:rFonts w:eastAsia="Times New Roman" w:cs="Times New Roman"/>
+        </w:rPr>
+        <w:t xml:space="preserve"> as the mean of the six NASA-TLX items (with the dissatisfied item reversed), </w:t>
+      </w:r>
+      <w:proofErr w:type="spellStart"/>
+      <w:r>
+        <w:rPr>
+          <w:rFonts w:eastAsia="Times New Roman" w:cs="Times New Roman"/>
+        </w:rPr>
+        <w:t>fatigue_score</w:t>
+      </w:r>
+      <w:proofErr w:type="spellEnd"/>
+      <w:r>
+        <w:rPr>
+          <w:rFonts w:eastAsia="Times New Roman" w:cs="Times New Roman"/>
+        </w:rPr>
+        <w:t xml:space="preserve"> as the mean of the six Borg items, </w:t>
+      </w:r>
+      <w:proofErr w:type="spellStart"/>
+      <w:r>
+        <w:rPr>
+          <w:rFonts w:eastAsia="Times New Roman" w:cs="Times New Roman"/>
+        </w:rPr>
+        <w:t>force_exertion</w:t>
+      </w:r>
+      <w:proofErr w:type="spellEnd"/>
+      <w:r>
+        <w:rPr>
+          <w:rFonts w:eastAsia="Times New Roman" w:cs="Times New Roman"/>
+        </w:rPr>
+        <w:t xml:space="preserve"> as the Borg lifting item, and </w:t>
+      </w:r>
+      <w:proofErr w:type="spellStart"/>
+      <w:r>
+        <w:rPr>
+          <w:rFonts w:eastAsia="Times New Roman" w:cs="Times New Roman"/>
+        </w:rPr>
+        <w:t>vibration_index</w:t>
+      </w:r>
+      <w:proofErr w:type="spellEnd"/>
+      <w:r>
+        <w:rPr>
+          <w:rFonts w:eastAsia="Times New Roman" w:cs="Times New Roman"/>
+        </w:rPr>
+        <w:t xml:space="preserve"> as </w:t>
+      </w:r>
+      <w:proofErr w:type="spellStart"/>
+      <w:r>
+        <w:rPr>
+          <w:rFonts w:eastAsia="Times New Roman" w:cs="Times New Roman"/>
+        </w:rPr>
+        <w:t>vehicle_rank</w:t>
+      </w:r>
+      <w:proofErr w:type="spellEnd"/>
+      <w:r>
+        <w:rPr>
+          <w:rFonts w:eastAsia="Times New Roman" w:cs="Times New Roman"/>
+        </w:rPr>
+        <w:t xml:space="preserve"> times </w:t>
+      </w:r>
+      <w:proofErr w:type="spellStart"/>
+      <w:r>
+        <w:rPr>
+          <w:rFonts w:eastAsia="Times New Roman" w:cs="Times New Roman"/>
+        </w:rPr>
+        <w:t>work_hours_num</w:t>
+      </w:r>
+      <w:proofErr w:type="spellEnd"/>
+      <w:r>
+        <w:rPr>
+          <w:rFonts w:eastAsia="Times New Roman" w:cs="Times New Roman"/>
+        </w:rPr>
+        <w:t>. Five product-form interactions were added (workload times fatigue, workload times age, force times age, fatigue times job duration, deliveries times days). The eighteen NMQ and 7-day items and the five outcome follow-ups were converted to short-named binary aliases (</w:t>
+      </w:r>
+      <w:proofErr w:type="spellStart"/>
+      <w:r>
+        <w:rPr>
+          <w:rFonts w:eastAsia="Times New Roman" w:cs="Times New Roman"/>
+        </w:rPr>
+        <w:t>nmq_neck</w:t>
+      </w:r>
+      <w:proofErr w:type="spellEnd"/>
+      <w:r>
+        <w:rPr>
+          <w:rFonts w:eastAsia="Times New Roman" w:cs="Times New Roman"/>
+        </w:rPr>
+        <w:t xml:space="preserve">, d7_lower_back, </w:t>
+      </w:r>
+      <w:proofErr w:type="spellStart"/>
+      <w:r>
+        <w:rPr>
+          <w:rFonts w:eastAsia="Times New Roman" w:cs="Times New Roman"/>
+        </w:rPr>
+        <w:t>out_reduced_perf</w:t>
+      </w:r>
+      <w:proofErr w:type="spellEnd"/>
+      <w:r>
+        <w:rPr>
+          <w:rFonts w:eastAsia="Times New Roman" w:cs="Times New Roman"/>
+        </w:rPr>
+        <w:t>, and so on).</w:t>
       </w:r>
     </w:p>
     <w:p>
@@ -4519,7 +6057,21 @@
         <w:rPr>
           <w:rFonts w:eastAsia="Times New Roman" w:cs="Times New Roman"/>
         </w:rPr>
-        <w:t>Two independent statistical analyses were run in 05_stats on the model-ready CSV. First, six chi-square tests of independence checked whether each Stage-1 risk-factor band was associated with a binary discomfort outcome; the tests reported chi2, degrees of freedom, and a Bonferroni-adjusted p-value. Second, a multivariable logistic regression fitted with statsmodels estimated odds ratios for eleven predictors (age, income, education, job duration, workload score, fatigue score, force exertion, vibration index, contact rank, hours, days) with self-reported discomfort as the outcome. Results were reported as OR with 95 percent confidence intervals.</w:t>
+        <w:t xml:space="preserve">Two independent statistical analyses were run in 05_stats on the model-ready CSV. First, six chi-square tests of independence checked whether each Stage-1 risk-factor band was associated with a binary discomfort outcome; the tests reported chi2, degrees of freedom, and a Bonferroni-adjusted p-value. Second, a multivariable logistic regression fitted with </w:t>
+      </w:r>
+      <w:proofErr w:type="spellStart"/>
+      <w:r>
+        <w:rPr>
+          <w:rFonts w:eastAsia="Times New Roman" w:cs="Times New Roman"/>
+        </w:rPr>
+        <w:t>statsmodels</w:t>
+      </w:r>
+      <w:proofErr w:type="spellEnd"/>
+      <w:r>
+        <w:rPr>
+          <w:rFonts w:eastAsia="Times New Roman" w:cs="Times New Roman"/>
+        </w:rPr>
+        <w:t xml:space="preserve"> estimated odds ratios for eleven predictors (age, income, education, job duration, workload score, fatigue score, force exertion, vibration index, contact rank, hours, days) with self-reported discomfort as the outcome. Results were reported as OR with 95 percent confidence intervals.</w:t>
       </w:r>
     </w:p>
     <w:p>
@@ -4531,7 +6083,89 @@
         <w:rPr>
           <w:rFonts w:eastAsia="Times New Roman" w:cs="Times New Roman"/>
         </w:rPr>
-        <w:t>Model training ran in 06_modeling. Every one of the seven candidate algorithms was wrapped in an imblearn.Pipeline of SMOTE followed by the classifier and hyperparameter-tuned via GridSearchCV. For each of the six risk-factor targets, this expanded to a full five-fold stratified cross-validation over the algorithm's hyperparameter grid. Across the six targets and seven algorithms, forty-two target-algorithm training runs were carried out. Best-by-macro-F1 was selected per target and the winning pipeline was refit on the full sample and persisted with joblib.dump to outputs/models/best_&lt;factor&gt;.pkl. The per-target feature exclusions listed in Section 2.6.9 were applied before each training run so no model could memorise its Stage-1 rule.</w:t>
+        <w:t xml:space="preserve">Model training ran in 06_modeling. Every one of the seven candidate algorithms was wrapped in an </w:t>
+      </w:r>
+      <w:proofErr w:type="spellStart"/>
+      <w:proofErr w:type="gramStart"/>
+      <w:r>
+        <w:rPr>
+          <w:rFonts w:eastAsia="Times New Roman" w:cs="Times New Roman"/>
+        </w:rPr>
+        <w:t>imblearn.Pipeline</w:t>
+      </w:r>
+      <w:proofErr w:type="spellEnd"/>
+      <w:proofErr w:type="gramEnd"/>
+      <w:r>
+        <w:rPr>
+          <w:rFonts w:eastAsia="Times New Roman" w:cs="Times New Roman"/>
+        </w:rPr>
+        <w:t xml:space="preserve"> of SMOTE followed by the classifier and hyperparameter-tuned via </w:t>
+      </w:r>
+      <w:proofErr w:type="spellStart"/>
+      <w:r>
+        <w:rPr>
+          <w:rFonts w:eastAsia="Times New Roman" w:cs="Times New Roman"/>
+        </w:rPr>
+        <w:t>GridSearchCV</w:t>
+      </w:r>
+      <w:proofErr w:type="spellEnd"/>
+      <w:r>
+        <w:rPr>
+          <w:rFonts w:eastAsia="Times New Roman" w:cs="Times New Roman"/>
+        </w:rPr>
+        <w:t xml:space="preserve">. For each of the six risk-factor targets, this expanded to a full five-fold stratified cross-validation over the algorithm's hyperparameter grid. Across the six targets and seven algorithms, forty-two target-algorithm training runs were carried out. Best-by-macro-F1 was selected per target and the winning pipeline was refit on the full sample and persisted with </w:t>
+      </w:r>
+      <w:proofErr w:type="spellStart"/>
+      <w:proofErr w:type="gramStart"/>
+      <w:r>
+        <w:rPr>
+          <w:rFonts w:eastAsia="Times New Roman" w:cs="Times New Roman"/>
+        </w:rPr>
+        <w:t>joblib.dump</w:t>
+      </w:r>
+      <w:proofErr w:type="spellEnd"/>
+      <w:proofErr w:type="gramEnd"/>
+      <w:r>
+        <w:rPr>
+          <w:rFonts w:eastAsia="Times New Roman" w:cs="Times New Roman"/>
+        </w:rPr>
+        <w:t xml:space="preserve"> to outputs/models/best_&lt;factor</w:t>
+      </w:r>
+      <w:proofErr w:type="gramStart"/>
+      <w:r>
+        <w:rPr>
+          <w:rFonts w:eastAsia="Times New Roman" w:cs="Times New Roman"/>
+        </w:rPr>
+        <w:t>&gt;.</w:t>
+      </w:r>
+      <w:proofErr w:type="spellStart"/>
+      <w:r>
+        <w:rPr>
+          <w:rFonts w:eastAsia="Times New Roman" w:cs="Times New Roman"/>
+        </w:rPr>
+        <w:t>pkl</w:t>
+      </w:r>
+      <w:proofErr w:type="spellEnd"/>
+      <w:proofErr w:type="gramEnd"/>
+      <w:r>
+        <w:rPr>
+          <w:rFonts w:eastAsia="Times New Roman" w:cs="Times New Roman"/>
+        </w:rPr>
+        <w:t xml:space="preserve">. The per-target feature exclusions listed in Section 2.6.9 were applied before each training run so no model could </w:t>
+      </w:r>
+      <w:proofErr w:type="spellStart"/>
+      <w:r>
+        <w:rPr>
+          <w:rFonts w:eastAsia="Times New Roman" w:cs="Times New Roman"/>
+        </w:rPr>
+        <w:t>memorise</w:t>
+      </w:r>
+      <w:proofErr w:type="spellEnd"/>
+      <w:r>
+        <w:rPr>
+          <w:rFonts w:eastAsia="Times New Roman" w:cs="Times New Roman"/>
+        </w:rPr>
+        <w:t xml:space="preserve"> its Stage-1 rule.</w:t>
       </w:r>
     </w:p>
     <w:p>
@@ -4543,7 +6177,63 @@
         <w:rPr>
           <w:rFonts w:eastAsia="Times New Roman" w:cs="Times New Roman"/>
         </w:rPr>
-        <w:t>07_evaluation produced the reporting artefacts. cross_val_predict was used to generate out-of-fold predictions on the training set, and the following outputs were written: per-class precision, recall, F1, and support numbers via classification_report; confusion matrices per target; one-vs-rest ROC curves with per-class AUC (macro AUC is the unweighted mean of per-class AUCs); and feature importance plots (feature_importances_ for the tree-based winners, absolute value of coef_ for the Logistic Regression floor).</w:t>
+        <w:t xml:space="preserve">07_evaluation produced the reporting artefacts. </w:t>
+      </w:r>
+      <w:proofErr w:type="spellStart"/>
+      <w:r>
+        <w:rPr>
+          <w:rFonts w:eastAsia="Times New Roman" w:cs="Times New Roman"/>
+        </w:rPr>
+        <w:t>cross_val_predict</w:t>
+      </w:r>
+      <w:proofErr w:type="spellEnd"/>
+      <w:r>
+        <w:rPr>
+          <w:rFonts w:eastAsia="Times New Roman" w:cs="Times New Roman"/>
+        </w:rPr>
+        <w:t xml:space="preserve"> was used to generate out-of-fold predictions on the training set, and the following outputs were written: per-class precision, recall, F1, and support numbers via </w:t>
+      </w:r>
+      <w:proofErr w:type="spellStart"/>
+      <w:r>
+        <w:rPr>
+          <w:rFonts w:eastAsia="Times New Roman" w:cs="Times New Roman"/>
+        </w:rPr>
+        <w:t>classification_report</w:t>
+      </w:r>
+      <w:proofErr w:type="spellEnd"/>
+      <w:r>
+        <w:rPr>
+          <w:rFonts w:eastAsia="Times New Roman" w:cs="Times New Roman"/>
+        </w:rPr>
+        <w:t>; confusion matrices per target; one-vs-rest ROC curves with per-class AUC (macro AUC is the unweighted mean of per-class AUCs); and feature importance plots (</w:t>
+      </w:r>
+      <w:proofErr w:type="spellStart"/>
+      <w:r>
+        <w:rPr>
+          <w:rFonts w:eastAsia="Times New Roman" w:cs="Times New Roman"/>
+        </w:rPr>
+        <w:t>feature_importances</w:t>
+      </w:r>
+      <w:proofErr w:type="spellEnd"/>
+      <w:r>
+        <w:rPr>
+          <w:rFonts w:eastAsia="Times New Roman" w:cs="Times New Roman"/>
+        </w:rPr>
+        <w:t xml:space="preserve">_ for the tree-based winners, absolute value of </w:t>
+      </w:r>
+      <w:proofErr w:type="spellStart"/>
+      <w:r>
+        <w:rPr>
+          <w:rFonts w:eastAsia="Times New Roman" w:cs="Times New Roman"/>
+        </w:rPr>
+        <w:t>coef</w:t>
+      </w:r>
+      <w:proofErr w:type="spellEnd"/>
+      <w:r>
+        <w:rPr>
+          <w:rFonts w:eastAsia="Times New Roman" w:cs="Times New Roman"/>
+        </w:rPr>
+        <w:t>_ for the Logistic Regression floor).</w:t>
       </w:r>
     </w:p>
     <w:p>
@@ -4569,7 +6259,49 @@
         <w:rPr>
           <w:rFonts w:eastAsia="Times New Roman" w:cs="Times New Roman"/>
         </w:rPr>
-        <w:t>The Streamlit web application (app/streamlit_app.py) exposes a six-section form that mirrors the entire 36-item questionnaire plus the 11 RULA components and 8 QEC scores. Selectboxes cover demographics and work pattern; radios cover NMQ, 7-day, and outcome items; sliders cover NASA-TLX (0 to 100) and Borg CR10 (0 to 10); selectboxes cover RULA components; and number inputs cover the QEC scores with min / max ranges matched to the observed training data. Three sample-profile buttons (Low, Average, and High risk) fill the entire form on click so the reviewer can trigger a prediction in one step.</w:t>
+        <w:t xml:space="preserve">The </w:t>
+      </w:r>
+      <w:proofErr w:type="spellStart"/>
+      <w:r>
+        <w:rPr>
+          <w:rFonts w:eastAsia="Times New Roman" w:cs="Times New Roman"/>
+        </w:rPr>
+        <w:t>Streamlit</w:t>
+      </w:r>
+      <w:proofErr w:type="spellEnd"/>
+      <w:r>
+        <w:rPr>
+          <w:rFonts w:eastAsia="Times New Roman" w:cs="Times New Roman"/>
+        </w:rPr>
+        <w:t xml:space="preserve"> web application (app/streamlit_app.py) exposes a six-section form that mirrors the entire 36-item questionnaire plus the 11 RULA components and 8 QEC scores. </w:t>
+      </w:r>
+      <w:proofErr w:type="spellStart"/>
+      <w:r>
+        <w:rPr>
+          <w:rFonts w:eastAsia="Times New Roman" w:cs="Times New Roman"/>
+        </w:rPr>
+        <w:t>Selectboxes</w:t>
+      </w:r>
+      <w:proofErr w:type="spellEnd"/>
+      <w:r>
+        <w:rPr>
+          <w:rFonts w:eastAsia="Times New Roman" w:cs="Times New Roman"/>
+        </w:rPr>
+        <w:t xml:space="preserve"> cover demographics and work pattern; radios cover NMQ, 7-day, and outcome items; sliders cover NASA-TLX (0 to 100) and Borg CR10 (0 to 10); </w:t>
+      </w:r>
+      <w:proofErr w:type="spellStart"/>
+      <w:r>
+        <w:rPr>
+          <w:rFonts w:eastAsia="Times New Roman" w:cs="Times New Roman"/>
+        </w:rPr>
+        <w:t>selectboxes</w:t>
+      </w:r>
+      <w:proofErr w:type="spellEnd"/>
+      <w:r>
+        <w:rPr>
+          <w:rFonts w:eastAsia="Times New Roman" w:cs="Times New Roman"/>
+        </w:rPr>
+        <w:t xml:space="preserve"> cover RULA components; and number inputs cover the QEC scores with min / max ranges matched to the observed training data. Three sample-profile buttons (Low, Average, and High risk) fill the entire form on click so the reviewer can trigger a prediction in one step.</w:t>
       </w:r>
     </w:p>
     <w:p>
@@ -4581,14 +6313,70 @@
         <w:rPr>
           <w:rFonts w:eastAsia="Times New Roman" w:cs="Times New Roman"/>
         </w:rPr>
-        <w:t xml:space="preserve">On form submission, encode_rider assembles the 63-feature input vector, and predict_risks runs each of the six saved models. The Results page renders a coloured metric strip (green for Low, amber for Medium, red for High), a horizontal Altair bar chart of the same six factors sorted to match the metric strip, a summary banner that flags high-burden profiles, per-factor recommendation cards, and an </w:t>
+        <w:t xml:space="preserve">On form submission, </w:t>
+      </w:r>
+      <w:proofErr w:type="spellStart"/>
+      <w:r>
+        <w:rPr>
+          <w:rFonts w:eastAsia="Times New Roman" w:cs="Times New Roman"/>
+        </w:rPr>
+        <w:t>encode_rider</w:t>
+      </w:r>
+      <w:proofErr w:type="spellEnd"/>
+      <w:r>
+        <w:rPr>
+          <w:rFonts w:eastAsia="Times New Roman" w:cs="Times New Roman"/>
+        </w:rPr>
+        <w:t xml:space="preserve"> assembles the 63-feature input vector, and </w:t>
+      </w:r>
+      <w:proofErr w:type="spellStart"/>
+      <w:r>
+        <w:rPr>
+          <w:rFonts w:eastAsia="Times New Roman" w:cs="Times New Roman"/>
+        </w:rPr>
+        <w:t>predict_risks</w:t>
+      </w:r>
+      <w:proofErr w:type="spellEnd"/>
+      <w:r>
+        <w:rPr>
+          <w:rFonts w:eastAsia="Times New Roman" w:cs="Times New Roman"/>
+        </w:rPr>
+        <w:t xml:space="preserve"> runs each of the six saved models. The Results page renders a </w:t>
+      </w:r>
+      <w:proofErr w:type="spellStart"/>
+      <w:r>
+        <w:rPr>
+          <w:rFonts w:eastAsia="Times New Roman" w:cs="Times New Roman"/>
+        </w:rPr>
+        <w:t>coloured</w:t>
+      </w:r>
+      <w:proofErr w:type="spellEnd"/>
+      <w:r>
+        <w:rPr>
+          <w:rFonts w:eastAsia="Times New Roman" w:cs="Times New Roman"/>
+        </w:rPr>
+        <w:t xml:space="preserve"> metric strip (green for Low, amber for Medium, red for High), a horizontal Altair bar chart of the same six factors sorted to match the metric strip, a summary banner that flags high-burden profiles, per-factor recommendation cards, and an </w:t>
       </w:r>
       <w:r>
         <w:rPr>
           <w:rFonts w:eastAsia="Times New Roman" w:cs="Times New Roman"/>
         </w:rPr>
         <w:lastRenderedPageBreak/>
-        <w:t>expandable JSON view of the exact 63 feature values that were fed to the models. The app also has a Methodology page that summarises the pipeline and an About page carrying the institutional context.</w:t>
+        <w:t xml:space="preserve">expandable JSON view of the exact 63 feature values that were fed to the models. The app also has a Methodology page that </w:t>
+      </w:r>
+      <w:proofErr w:type="spellStart"/>
+      <w:r>
+        <w:rPr>
+          <w:rFonts w:eastAsia="Times New Roman" w:cs="Times New Roman"/>
+        </w:rPr>
+        <w:t>summarises</w:t>
+      </w:r>
+      <w:proofErr w:type="spellEnd"/>
+      <w:r>
+        <w:rPr>
+          <w:rFonts w:eastAsia="Times New Roman" w:cs="Times New Roman"/>
+        </w:rPr>
+        <w:t xml:space="preserve"> the pipeline and an About page carrying the institutional context.</w:t>
       </w:r>
     </w:p>
     <w:p>
@@ -4600,7 +6388,149 @@
         <w:rPr>
           <w:rFonts w:eastAsia="Times New Roman" w:cs="Times New Roman"/>
         </w:rPr>
-        <w:t>The app was deployed to Streamlit Community Cloud from the public GitHub repository. Deployment required pinning every runtime dependency in requirements.txt to the exact versions the models were trained with (streamlit 1.58, pandas 2.3, scikit-learn 1.7, xgboost 3.2, imbalanced-learn 0.14, plotly 6.8), because sklearn and xgboost pickles are not portable across minor versions. runtime.txt pins Python 3.13 to match the training environment. A .streamlit/config.toml carries the dark theme and a client.toolbarMode = viewer flag; CSS in the app suppresses the Fork button and 'View source on GitHub' icon that Streamlit Community Cloud injects on public-repo deploys. Every git push to the main branch auto-rebuilds and redeploys the app in about 30 seconds.</w:t>
+        <w:t xml:space="preserve">The app was deployed to </w:t>
+      </w:r>
+      <w:proofErr w:type="spellStart"/>
+      <w:r>
+        <w:rPr>
+          <w:rFonts w:eastAsia="Times New Roman" w:cs="Times New Roman"/>
+        </w:rPr>
+        <w:t>Streamlit</w:t>
+      </w:r>
+      <w:proofErr w:type="spellEnd"/>
+      <w:r>
+        <w:rPr>
+          <w:rFonts w:eastAsia="Times New Roman" w:cs="Times New Roman"/>
+        </w:rPr>
+        <w:t xml:space="preserve"> Community Cloud from the public GitHub repository. Deployment required pinning every runtime dependency in requirements.txt to the exact versions the models were trained with (</w:t>
+      </w:r>
+      <w:proofErr w:type="spellStart"/>
+      <w:r>
+        <w:rPr>
+          <w:rFonts w:eastAsia="Times New Roman" w:cs="Times New Roman"/>
+        </w:rPr>
+        <w:t>streamlit</w:t>
+      </w:r>
+      <w:proofErr w:type="spellEnd"/>
+      <w:r>
+        <w:rPr>
+          <w:rFonts w:eastAsia="Times New Roman" w:cs="Times New Roman"/>
+        </w:rPr>
+        <w:t xml:space="preserve"> 1.58, pandas 2.3, scikit-learn 1.7, </w:t>
+      </w:r>
+      <w:proofErr w:type="spellStart"/>
+      <w:r>
+        <w:rPr>
+          <w:rFonts w:eastAsia="Times New Roman" w:cs="Times New Roman"/>
+        </w:rPr>
+        <w:t>xgboost</w:t>
+      </w:r>
+      <w:proofErr w:type="spellEnd"/>
+      <w:r>
+        <w:rPr>
+          <w:rFonts w:eastAsia="Times New Roman" w:cs="Times New Roman"/>
+        </w:rPr>
+        <w:t xml:space="preserve"> 3.2, imbalanced-learn 0.14, </w:t>
+      </w:r>
+      <w:proofErr w:type="spellStart"/>
+      <w:r>
+        <w:rPr>
+          <w:rFonts w:eastAsia="Times New Roman" w:cs="Times New Roman"/>
+        </w:rPr>
+        <w:t>plotly</w:t>
+      </w:r>
+      <w:proofErr w:type="spellEnd"/>
+      <w:r>
+        <w:rPr>
+          <w:rFonts w:eastAsia="Times New Roman" w:cs="Times New Roman"/>
+        </w:rPr>
+        <w:t xml:space="preserve"> 6.8), because </w:t>
+      </w:r>
+      <w:proofErr w:type="spellStart"/>
+      <w:r>
+        <w:rPr>
+          <w:rFonts w:eastAsia="Times New Roman" w:cs="Times New Roman"/>
+        </w:rPr>
+        <w:t>sklearn</w:t>
+      </w:r>
+      <w:proofErr w:type="spellEnd"/>
+      <w:r>
+        <w:rPr>
+          <w:rFonts w:eastAsia="Times New Roman" w:cs="Times New Roman"/>
+        </w:rPr>
+        <w:t xml:space="preserve"> and </w:t>
+      </w:r>
+      <w:proofErr w:type="spellStart"/>
+      <w:r>
+        <w:rPr>
+          <w:rFonts w:eastAsia="Times New Roman" w:cs="Times New Roman"/>
+        </w:rPr>
+        <w:t>xgboost</w:t>
+      </w:r>
+      <w:proofErr w:type="spellEnd"/>
+      <w:r>
+        <w:rPr>
+          <w:rFonts w:eastAsia="Times New Roman" w:cs="Times New Roman"/>
+        </w:rPr>
+        <w:t xml:space="preserve"> pickles are not portable across minor versions. runtime.txt pins Python 3.13 to match the training environment. A .</w:t>
+      </w:r>
+      <w:proofErr w:type="spellStart"/>
+      <w:r>
+        <w:rPr>
+          <w:rFonts w:eastAsia="Times New Roman" w:cs="Times New Roman"/>
+        </w:rPr>
+        <w:t>streamlit</w:t>
+      </w:r>
+      <w:proofErr w:type="spellEnd"/>
+      <w:r>
+        <w:rPr>
+          <w:rFonts w:eastAsia="Times New Roman" w:cs="Times New Roman"/>
+        </w:rPr>
+        <w:t>/</w:t>
+      </w:r>
+      <w:proofErr w:type="spellStart"/>
+      <w:r>
+        <w:rPr>
+          <w:rFonts w:eastAsia="Times New Roman" w:cs="Times New Roman"/>
+        </w:rPr>
+        <w:t>config.toml</w:t>
+      </w:r>
+      <w:proofErr w:type="spellEnd"/>
+      <w:r>
+        <w:rPr>
+          <w:rFonts w:eastAsia="Times New Roman" w:cs="Times New Roman"/>
+        </w:rPr>
+        <w:t xml:space="preserve"> carries the dark theme and a </w:t>
+      </w:r>
+      <w:proofErr w:type="spellStart"/>
+      <w:proofErr w:type="gramStart"/>
+      <w:r>
+        <w:rPr>
+          <w:rFonts w:eastAsia="Times New Roman" w:cs="Times New Roman"/>
+        </w:rPr>
+        <w:t>client.toolbarMode</w:t>
+      </w:r>
+      <w:proofErr w:type="spellEnd"/>
+      <w:proofErr w:type="gramEnd"/>
+      <w:r>
+        <w:rPr>
+          <w:rFonts w:eastAsia="Times New Roman" w:cs="Times New Roman"/>
+        </w:rPr>
+        <w:t xml:space="preserve"> = viewer flag; CSS in the app suppresses the Fork button and 'View source on GitHub' icon that </w:t>
+      </w:r>
+      <w:proofErr w:type="spellStart"/>
+      <w:r>
+        <w:rPr>
+          <w:rFonts w:eastAsia="Times New Roman" w:cs="Times New Roman"/>
+        </w:rPr>
+        <w:t>Streamlit</w:t>
+      </w:r>
+      <w:proofErr w:type="spellEnd"/>
+      <w:r>
+        <w:rPr>
+          <w:rFonts w:eastAsia="Times New Roman" w:cs="Times New Roman"/>
+        </w:rPr>
+        <w:t xml:space="preserve"> Community Cloud injects on public-repo deploys. Every git push to the main branch auto-rebuilds and redeploys the app in about 30 seconds.</w:t>
       </w:r>
     </w:p>
     <w:p>
@@ -4641,7 +6571,93 @@
         <w:rPr>
           <w:rFonts w:eastAsia="Times New Roman" w:cs="Times New Roman"/>
         </w:rPr>
-        <w:t>The initial Phase 3 binning used pandas.qcut(q=3) on deliveries_per_hour. The 66.7th percentile fell exactly on 3.889 dph (equal to 35 deliveries over 9 hours, the worst real combination in the sample). Fifty-five of the 182 riders tied at that value, and qcut is right-inclusive at the upper edge, so all 55 fell into Medium. This left the Stage-2 model unable to predict High for the worst real schedule. The fix replaces qcut with fixed cuts at 2.5 and 3.75. The Stage-1 High count grew from 19 to 74. Cross-validation accuracy dropped from 74 percent to 62 percent because the model now solves a real 3-class problem instead of memorising a 19-row minority.</w:t>
+        <w:t xml:space="preserve">The initial Phase 3 binning used </w:t>
+      </w:r>
+      <w:proofErr w:type="spellStart"/>
+      <w:proofErr w:type="gramStart"/>
+      <w:r>
+        <w:rPr>
+          <w:rFonts w:eastAsia="Times New Roman" w:cs="Times New Roman"/>
+        </w:rPr>
+        <w:t>pandas.qcut</w:t>
+      </w:r>
+      <w:proofErr w:type="spellEnd"/>
+      <w:proofErr w:type="gramEnd"/>
+      <w:r>
+        <w:rPr>
+          <w:rFonts w:eastAsia="Times New Roman" w:cs="Times New Roman"/>
+        </w:rPr>
+        <w:t xml:space="preserve">(q=3) on </w:t>
+      </w:r>
+      <w:proofErr w:type="spellStart"/>
+      <w:r>
+        <w:rPr>
+          <w:rFonts w:eastAsia="Times New Roman" w:cs="Times New Roman"/>
+        </w:rPr>
+        <w:t>deliveries_per_hour</w:t>
+      </w:r>
+      <w:proofErr w:type="spellEnd"/>
+      <w:r>
+        <w:rPr>
+          <w:rFonts w:eastAsia="Times New Roman" w:cs="Times New Roman"/>
+        </w:rPr>
+        <w:t xml:space="preserve">. The 66.7th percentile fell exactly on 3.889 </w:t>
+      </w:r>
+      <w:proofErr w:type="spellStart"/>
+      <w:r>
+        <w:rPr>
+          <w:rFonts w:eastAsia="Times New Roman" w:cs="Times New Roman"/>
+        </w:rPr>
+        <w:t>dph</w:t>
+      </w:r>
+      <w:proofErr w:type="spellEnd"/>
+      <w:r>
+        <w:rPr>
+          <w:rFonts w:eastAsia="Times New Roman" w:cs="Times New Roman"/>
+        </w:rPr>
+        <w:t xml:space="preserve"> (equal to 35 deliveries over 9 hours, the worst real combination in the sample). Fifty-five of the 182 riders tied at that value, and </w:t>
+      </w:r>
+      <w:proofErr w:type="spellStart"/>
+      <w:r>
+        <w:rPr>
+          <w:rFonts w:eastAsia="Times New Roman" w:cs="Times New Roman"/>
+        </w:rPr>
+        <w:t>qcut</w:t>
+      </w:r>
+      <w:proofErr w:type="spellEnd"/>
+      <w:r>
+        <w:rPr>
+          <w:rFonts w:eastAsia="Times New Roman" w:cs="Times New Roman"/>
+        </w:rPr>
+        <w:t xml:space="preserve"> is right-inclusive at the upper edge, so all 55 fell into Medium. This left the Stage-2 model unable to predict High for the worst real schedule. The fix replaces </w:t>
+      </w:r>
+      <w:proofErr w:type="spellStart"/>
+      <w:r>
+        <w:rPr>
+          <w:rFonts w:eastAsia="Times New Roman" w:cs="Times New Roman"/>
+        </w:rPr>
+        <w:t>qcut</w:t>
+      </w:r>
+      <w:proofErr w:type="spellEnd"/>
+      <w:r>
+        <w:rPr>
+          <w:rFonts w:eastAsia="Times New Roman" w:cs="Times New Roman"/>
+        </w:rPr>
+        <w:t xml:space="preserve"> with fixed cuts at 2.5 and 3.75. The Stage-1 High count grew from 19 to 74. Cross-validation accuracy dropped from 74 percent to 62 percent because the model now solves a real 3-class problem instead of </w:t>
+      </w:r>
+      <w:proofErr w:type="spellStart"/>
+      <w:r>
+        <w:rPr>
+          <w:rFonts w:eastAsia="Times New Roman" w:cs="Times New Roman"/>
+        </w:rPr>
+        <w:t>memorising</w:t>
+      </w:r>
+      <w:proofErr w:type="spellEnd"/>
+      <w:r>
+        <w:rPr>
+          <w:rFonts w:eastAsia="Times New Roman" w:cs="Times New Roman"/>
+        </w:rPr>
+        <w:t xml:space="preserve"> a 19-row minority.</w:t>
       </w:r>
     </w:p>
     <w:p>
@@ -4668,7 +6684,105 @@
         <w:rPr>
           <w:rFonts w:eastAsia="Times New Roman" w:cs="Times New Roman"/>
         </w:rPr>
-        <w:t>An earlier Phase 6 run reported 100 percent cross-validation accuracy on Duration. Investigation showed the trees were reconstructing work_hours_num from vibration_index, which equals vehicle_rank multiplied by work_hours_num. Adding vibration_index to the Duration exclusion list and capping max_depth returned Duration to a realistic 61 percent accuracy with 76 percent macro AUC.</w:t>
+        <w:t xml:space="preserve">An earlier Phase 6 run reported 100 percent cross-validation accuracy on Duration. Investigation showed the trees were reconstructing </w:t>
+      </w:r>
+      <w:proofErr w:type="spellStart"/>
+      <w:r>
+        <w:rPr>
+          <w:rFonts w:eastAsia="Times New Roman" w:cs="Times New Roman"/>
+        </w:rPr>
+        <w:t>work_hours_num</w:t>
+      </w:r>
+      <w:proofErr w:type="spellEnd"/>
+      <w:r>
+        <w:rPr>
+          <w:rFonts w:eastAsia="Times New Roman" w:cs="Times New Roman"/>
+        </w:rPr>
+        <w:t xml:space="preserve"> from </w:t>
+      </w:r>
+      <w:proofErr w:type="spellStart"/>
+      <w:r>
+        <w:rPr>
+          <w:rFonts w:eastAsia="Times New Roman" w:cs="Times New Roman"/>
+        </w:rPr>
+        <w:t>vibration_index</w:t>
+      </w:r>
+      <w:proofErr w:type="spellEnd"/>
+      <w:r>
+        <w:rPr>
+          <w:rFonts w:eastAsia="Times New Roman" w:cs="Times New Roman"/>
+        </w:rPr>
+        <w:t xml:space="preserve">, which equals </w:t>
+      </w:r>
+      <w:proofErr w:type="spellStart"/>
+      <w:r>
+        <w:rPr>
+          <w:rFonts w:eastAsia="Times New Roman" w:cs="Times New Roman"/>
+        </w:rPr>
+        <w:t>vehicle_rank</w:t>
+      </w:r>
+      <w:proofErr w:type="spellEnd"/>
+      <w:r>
+        <w:rPr>
+          <w:rFonts w:eastAsia="Times New Roman" w:cs="Times New Roman"/>
+        </w:rPr>
+        <w:t xml:space="preserve"> multiplied by </w:t>
+      </w:r>
+      <w:proofErr w:type="spellStart"/>
+      <w:r>
+        <w:rPr>
+          <w:rFonts w:eastAsia="Times New Roman" w:cs="Times New Roman"/>
+        </w:rPr>
+        <w:t>work_hours_num</w:t>
+      </w:r>
+      <w:proofErr w:type="spellEnd"/>
+      <w:r>
+        <w:rPr>
+          <w:rFonts w:eastAsia="Times New Roman" w:cs="Times New Roman"/>
+        </w:rPr>
+        <w:t xml:space="preserve">. Adding </w:t>
+      </w:r>
+      <w:proofErr w:type="spellStart"/>
+      <w:r>
+        <w:rPr>
+          <w:rFonts w:eastAsia="Times New Roman" w:cs="Times New Roman"/>
+        </w:rPr>
+        <w:t>vibration_index</w:t>
+      </w:r>
+      <w:proofErr w:type="spellEnd"/>
+      <w:r>
+        <w:rPr>
+          <w:rFonts w:eastAsia="Times New Roman" w:cs="Times New Roman"/>
+        </w:rPr>
+        <w:t xml:space="preserve"> to the Duration exclusion list and capping </w:t>
+      </w:r>
+      <w:proofErr w:type="spellStart"/>
+      <w:r>
+        <w:rPr>
+          <w:rFonts w:eastAsia="Times New Roman" w:cs="Times New Roman"/>
+        </w:rPr>
+        <w:t>max_depth</w:t>
+      </w:r>
+      <w:proofErr w:type="spellEnd"/>
+      <w:r>
+        <w:rPr>
+          <w:rFonts w:eastAsia="Times New Roman" w:cs="Times New Roman"/>
+        </w:rPr>
+        <w:t xml:space="preserve"> returned Duration to a realistic 61 percent accuracy with 76 percent </w:t>
+      </w:r>
+      <w:proofErr w:type="gramStart"/>
+      <w:r>
+        <w:rPr>
+          <w:rFonts w:eastAsia="Times New Roman" w:cs="Times New Roman"/>
+        </w:rPr>
+        <w:t>macro AUC</w:t>
+      </w:r>
+      <w:proofErr w:type="gramEnd"/>
+      <w:r>
+        <w:rPr>
+          <w:rFonts w:eastAsia="Times New Roman" w:cs="Times New Roman"/>
+        </w:rPr>
+        <w:t>.</w:t>
       </w:r>
     </w:p>
     <w:p>
@@ -4695,7 +6809,35 @@
         <w:rPr>
           <w:rFonts w:eastAsia="Times New Roman" w:cs="Times New Roman"/>
         </w:rPr>
-        <w:t>The Posture target was initially trained only on the survey feature pool, which meant it could only infer posture indirectly from pain, fatigue, and hours. Adding the 11 RULA components and 8 QEC scores from the observation xlsx as explicit features moved Posture accuracy from 89 to 97 percent and the overfit gap from 0.088 to 0.028. Per the label-leakage rule, the three derived RULA Table scores were excluded because posture_risk is rula_table_c binned.</w:t>
+        <w:t xml:space="preserve">The Posture target was initially trained only on the survey feature pool, which meant it could only infer posture indirectly from pain, fatigue, and hours. Adding the 11 RULA components and 8 QEC scores from the observation xlsx as explicit features moved Posture accuracy from 89 to 97 percent and the overfit gap from 0.088 to 0.028. Per the label-leakage rule, the three derived RULA Table scores were excluded because </w:t>
+      </w:r>
+      <w:proofErr w:type="spellStart"/>
+      <w:r>
+        <w:rPr>
+          <w:rFonts w:eastAsia="Times New Roman" w:cs="Times New Roman"/>
+        </w:rPr>
+        <w:t>posture_risk</w:t>
+      </w:r>
+      <w:proofErr w:type="spellEnd"/>
+      <w:r>
+        <w:rPr>
+          <w:rFonts w:eastAsia="Times New Roman" w:cs="Times New Roman"/>
+        </w:rPr>
+        <w:t xml:space="preserve"> is </w:t>
+      </w:r>
+      <w:proofErr w:type="spellStart"/>
+      <w:r>
+        <w:rPr>
+          <w:rFonts w:eastAsia="Times New Roman" w:cs="Times New Roman"/>
+        </w:rPr>
+        <w:t>rula_table_c</w:t>
+      </w:r>
+      <w:proofErr w:type="spellEnd"/>
+      <w:r>
+        <w:rPr>
+          <w:rFonts w:eastAsia="Times New Roman" w:cs="Times New Roman"/>
+        </w:rPr>
+        <w:t xml:space="preserve"> binned.</w:t>
       </w:r>
     </w:p>
     <w:p>
@@ -4737,7 +6879,35 @@
         <w:rPr>
           <w:rFonts w:eastAsia="Times New Roman" w:cs="Times New Roman"/>
         </w:rPr>
-        <w:t>The sample of 182 riders is 152 male and 30 female. Age skews young: 78 riders are under 25, 66 in the 25-35 band, 30 in 36-45, and 8 in the 46-and-above band. Roughly half the sample (49 percent) works more than 8 hours per day. Ninety-four ride scooters and 88 ride motorbikes. The platform split is 97 Blinkit, 80 Zepto, and 5 who work both platforms.</w:t>
+        <w:t xml:space="preserve">The sample of 182 riders is 152 male and 30 female. Age skews young: 78 riders are under 25, 66 in the 25-35 band, 30 in 36-45, and 8 in the 46-and-above band. Roughly half the sample (49 percent) works more than 8 hours per day. Ninety-four ride scooters and 88 ride motorbikes. The platform split is 97 </w:t>
+      </w:r>
+      <w:proofErr w:type="spellStart"/>
+      <w:r>
+        <w:rPr>
+          <w:rFonts w:eastAsia="Times New Roman" w:cs="Times New Roman"/>
+        </w:rPr>
+        <w:t>Blinkit</w:t>
+      </w:r>
+      <w:proofErr w:type="spellEnd"/>
+      <w:r>
+        <w:rPr>
+          <w:rFonts w:eastAsia="Times New Roman" w:cs="Times New Roman"/>
+        </w:rPr>
+        <w:t xml:space="preserve">, 80 </w:t>
+      </w:r>
+      <w:proofErr w:type="spellStart"/>
+      <w:r>
+        <w:rPr>
+          <w:rFonts w:eastAsia="Times New Roman" w:cs="Times New Roman"/>
+        </w:rPr>
+        <w:t>Zepto</w:t>
+      </w:r>
+      <w:proofErr w:type="spellEnd"/>
+      <w:r>
+        <w:rPr>
+          <w:rFonts w:eastAsia="Times New Roman" w:cs="Times New Roman"/>
+        </w:rPr>
+        <w:t>, and 5 who work both platforms.</w:t>
       </w:r>
     </w:p>
     <w:p>
@@ -7522,6 +9692,7 @@
             <w:pPr>
               <w:spacing w:before="20" w:after="20"/>
             </w:pPr>
+            <w:proofErr w:type="spellStart"/>
             <w:r>
               <w:rPr>
                 <w:rFonts w:eastAsia="Times New Roman" w:cs="Times New Roman"/>
@@ -7529,6 +9700,7 @@
               </w:rPr>
               <w:t>HistGradientBoosting</w:t>
             </w:r>
+            <w:proofErr w:type="spellEnd"/>
           </w:p>
         </w:tc>
         <w:tc>
@@ -7631,6 +9803,7 @@
             <w:pPr>
               <w:spacing w:before="20" w:after="20"/>
             </w:pPr>
+            <w:proofErr w:type="spellStart"/>
             <w:r>
               <w:rPr>
                 <w:rFonts w:eastAsia="Times New Roman" w:cs="Times New Roman"/>
@@ -7638,6 +9811,7 @@
               </w:rPr>
               <w:t>RandomForest</w:t>
             </w:r>
+            <w:proofErr w:type="spellEnd"/>
           </w:p>
         </w:tc>
         <w:tc>
@@ -7740,6 +9914,7 @@
             <w:pPr>
               <w:spacing w:before="20" w:after="20"/>
             </w:pPr>
+            <w:proofErr w:type="spellStart"/>
             <w:r>
               <w:rPr>
                 <w:rFonts w:eastAsia="Times New Roman" w:cs="Times New Roman"/>
@@ -7747,6 +9922,7 @@
               </w:rPr>
               <w:t>RandomForest</w:t>
             </w:r>
+            <w:proofErr w:type="spellEnd"/>
           </w:p>
         </w:tc>
         <w:tc>
@@ -7849,6 +10025,7 @@
             <w:pPr>
               <w:spacing w:before="20" w:after="20"/>
             </w:pPr>
+            <w:proofErr w:type="spellStart"/>
             <w:r>
               <w:rPr>
                 <w:rFonts w:eastAsia="Times New Roman" w:cs="Times New Roman"/>
@@ -7856,6 +10033,7 @@
               </w:rPr>
               <w:t>ExtraTrees</w:t>
             </w:r>
+            <w:proofErr w:type="spellEnd"/>
           </w:p>
         </w:tc>
         <w:tc>
@@ -7958,6 +10136,7 @@
             <w:pPr>
               <w:spacing w:before="20" w:after="20"/>
             </w:pPr>
+            <w:proofErr w:type="spellStart"/>
             <w:r>
               <w:rPr>
                 <w:rFonts w:eastAsia="Times New Roman" w:cs="Times New Roman"/>
@@ -7965,6 +10144,7 @@
               </w:rPr>
               <w:t>RandomForest</w:t>
             </w:r>
+            <w:proofErr w:type="spellEnd"/>
           </w:p>
         </w:tc>
         <w:tc>
@@ -8067,6 +10247,7 @@
             <w:pPr>
               <w:spacing w:before="20" w:after="20"/>
             </w:pPr>
+            <w:proofErr w:type="spellStart"/>
             <w:r>
               <w:rPr>
                 <w:rFonts w:eastAsia="Times New Roman" w:cs="Times New Roman"/>
@@ -8074,6 +10255,7 @@
               </w:rPr>
               <w:t>HistGradientBoosting</w:t>
             </w:r>
+            <w:proofErr w:type="spellEnd"/>
           </w:p>
         </w:tc>
         <w:tc>
@@ -8175,7 +10357,35 @@
         <w:rPr>
           <w:rFonts w:eastAsia="Times New Roman" w:cs="Times New Roman"/>
         </w:rPr>
-        <w:t>The five survey-derived factors land between 58 and 62 percent cross-validation accuracy with macro AUC in the 71 to 76 percent range. Posture reaches 97 percent accuracy and 98 percent macro AUC because it is the only model that receives real observation inputs (the 11 RULA components and 8 QEC scores) on top of the survey features.</w:t>
+        <w:t xml:space="preserve">The five survey-derived factors land between 58 and 62 percent cross-validation accuracy with </w:t>
+      </w:r>
+      <w:proofErr w:type="gramStart"/>
+      <w:r>
+        <w:rPr>
+          <w:rFonts w:eastAsia="Times New Roman" w:cs="Times New Roman"/>
+        </w:rPr>
+        <w:t>macro AUC</w:t>
+      </w:r>
+      <w:proofErr w:type="gramEnd"/>
+      <w:r>
+        <w:rPr>
+          <w:rFonts w:eastAsia="Times New Roman" w:cs="Times New Roman"/>
+        </w:rPr>
+        <w:t xml:space="preserve"> in the 71 to 76 percent range. Posture reaches 97 percent accuracy and 98 percent </w:t>
+      </w:r>
+      <w:proofErr w:type="gramStart"/>
+      <w:r>
+        <w:rPr>
+          <w:rFonts w:eastAsia="Times New Roman" w:cs="Times New Roman"/>
+        </w:rPr>
+        <w:t>macro AUC</w:t>
+      </w:r>
+      <w:proofErr w:type="gramEnd"/>
+      <w:r>
+        <w:rPr>
+          <w:rFonts w:eastAsia="Times New Roman" w:cs="Times New Roman"/>
+        </w:rPr>
+        <w:t xml:space="preserve"> because it is the only model that receives real observation inputs (the 11 RULA components and 8 QEC scores) on top of the survey features.</w:t>
       </w:r>
     </w:p>
     <w:p>
@@ -11090,6 +13300,7 @@
             <w:pPr>
               <w:spacing w:before="20" w:after="20"/>
             </w:pPr>
+            <w:proofErr w:type="spellStart"/>
             <w:r>
               <w:rPr>
                 <w:rFonts w:eastAsia="Times New Roman" w:cs="Times New Roman"/>
@@ -11097,6 +13308,7 @@
               </w:rPr>
               <w:t>HistGBM</w:t>
             </w:r>
+            <w:proofErr w:type="spellEnd"/>
           </w:p>
         </w:tc>
         <w:tc>
@@ -11107,12 +13319,37 @@
             <w:pPr>
               <w:spacing w:before="20" w:after="20"/>
             </w:pPr>
-            <w:r>
-              <w:rPr>
-                <w:rFonts w:eastAsia="Times New Roman" w:cs="Times New Roman"/>
-                <w:sz w:val="20"/>
-              </w:rPr>
-              <w:t>max_depth=None, learning_rate=0.05</w:t>
+            <w:proofErr w:type="spellStart"/>
+            <w:r>
+              <w:rPr>
+                <w:rFonts w:eastAsia="Times New Roman" w:cs="Times New Roman"/>
+                <w:sz w:val="20"/>
+              </w:rPr>
+              <w:t>max_depth</w:t>
+            </w:r>
+            <w:proofErr w:type="spellEnd"/>
+            <w:r>
+              <w:rPr>
+                <w:rFonts w:eastAsia="Times New Roman" w:cs="Times New Roman"/>
+                <w:sz w:val="20"/>
+              </w:rPr>
+              <w:t xml:space="preserve">=None, </w:t>
+            </w:r>
+            <w:proofErr w:type="spellStart"/>
+            <w:r>
+              <w:rPr>
+                <w:rFonts w:eastAsia="Times New Roman" w:cs="Times New Roman"/>
+                <w:sz w:val="20"/>
+              </w:rPr>
+              <w:t>learning_rate</w:t>
+            </w:r>
+            <w:proofErr w:type="spellEnd"/>
+            <w:r>
+              <w:rPr>
+                <w:rFonts w:eastAsia="Times New Roman" w:cs="Times New Roman"/>
+                <w:sz w:val="20"/>
+              </w:rPr>
+              <w:t>=0.05</w:t>
             </w:r>
           </w:p>
         </w:tc>
@@ -11165,6 +13402,7 @@
             <w:pPr>
               <w:spacing w:before="20" w:after="20"/>
             </w:pPr>
+            <w:proofErr w:type="spellStart"/>
             <w:r>
               <w:rPr>
                 <w:rFonts w:eastAsia="Times New Roman" w:cs="Times New Roman"/>
@@ -11172,6 +13410,7 @@
               </w:rPr>
               <w:t>RandomForest</w:t>
             </w:r>
+            <w:proofErr w:type="spellEnd"/>
           </w:p>
         </w:tc>
         <w:tc>
@@ -11182,12 +13421,37 @@
             <w:pPr>
               <w:spacing w:before="20" w:after="20"/>
             </w:pPr>
-            <w:r>
-              <w:rPr>
-                <w:rFonts w:eastAsia="Times New Roman" w:cs="Times New Roman"/>
-                <w:sz w:val="20"/>
-              </w:rPr>
-              <w:t>n_estimators=300, max_depth=None</w:t>
+            <w:proofErr w:type="spellStart"/>
+            <w:r>
+              <w:rPr>
+                <w:rFonts w:eastAsia="Times New Roman" w:cs="Times New Roman"/>
+                <w:sz w:val="20"/>
+              </w:rPr>
+              <w:t>n_estimators</w:t>
+            </w:r>
+            <w:proofErr w:type="spellEnd"/>
+            <w:r>
+              <w:rPr>
+                <w:rFonts w:eastAsia="Times New Roman" w:cs="Times New Roman"/>
+                <w:sz w:val="20"/>
+              </w:rPr>
+              <w:t xml:space="preserve">=300, </w:t>
+            </w:r>
+            <w:proofErr w:type="spellStart"/>
+            <w:r>
+              <w:rPr>
+                <w:rFonts w:eastAsia="Times New Roman" w:cs="Times New Roman"/>
+                <w:sz w:val="20"/>
+              </w:rPr>
+              <w:t>max_depth</w:t>
+            </w:r>
+            <w:proofErr w:type="spellEnd"/>
+            <w:r>
+              <w:rPr>
+                <w:rFonts w:eastAsia="Times New Roman" w:cs="Times New Roman"/>
+                <w:sz w:val="20"/>
+              </w:rPr>
+              <w:t>=None</w:t>
             </w:r>
           </w:p>
         </w:tc>
@@ -11240,6 +13504,7 @@
             <w:pPr>
               <w:spacing w:before="20" w:after="20"/>
             </w:pPr>
+            <w:proofErr w:type="spellStart"/>
             <w:r>
               <w:rPr>
                 <w:rFonts w:eastAsia="Times New Roman" w:cs="Times New Roman"/>
@@ -11247,6 +13512,7 @@
               </w:rPr>
               <w:t>RandomForest</w:t>
             </w:r>
+            <w:proofErr w:type="spellEnd"/>
           </w:p>
         </w:tc>
         <w:tc>
@@ -11257,12 +13523,37 @@
             <w:pPr>
               <w:spacing w:before="20" w:after="20"/>
             </w:pPr>
-            <w:r>
-              <w:rPr>
-                <w:rFonts w:eastAsia="Times New Roman" w:cs="Times New Roman"/>
-                <w:sz w:val="20"/>
-              </w:rPr>
-              <w:t>n_estimators=500, max_depth=5</w:t>
+            <w:proofErr w:type="spellStart"/>
+            <w:r>
+              <w:rPr>
+                <w:rFonts w:eastAsia="Times New Roman" w:cs="Times New Roman"/>
+                <w:sz w:val="20"/>
+              </w:rPr>
+              <w:t>n_estimators</w:t>
+            </w:r>
+            <w:proofErr w:type="spellEnd"/>
+            <w:r>
+              <w:rPr>
+                <w:rFonts w:eastAsia="Times New Roman" w:cs="Times New Roman"/>
+                <w:sz w:val="20"/>
+              </w:rPr>
+              <w:t xml:space="preserve">=500, </w:t>
+            </w:r>
+            <w:proofErr w:type="spellStart"/>
+            <w:r>
+              <w:rPr>
+                <w:rFonts w:eastAsia="Times New Roman" w:cs="Times New Roman"/>
+                <w:sz w:val="20"/>
+              </w:rPr>
+              <w:t>max_depth</w:t>
+            </w:r>
+            <w:proofErr w:type="spellEnd"/>
+            <w:r>
+              <w:rPr>
+                <w:rFonts w:eastAsia="Times New Roman" w:cs="Times New Roman"/>
+                <w:sz w:val="20"/>
+              </w:rPr>
+              <w:t>=5</w:t>
             </w:r>
           </w:p>
         </w:tc>
@@ -11315,6 +13606,7 @@
             <w:pPr>
               <w:spacing w:before="20" w:after="20"/>
             </w:pPr>
+            <w:proofErr w:type="spellStart"/>
             <w:r>
               <w:rPr>
                 <w:rFonts w:eastAsia="Times New Roman" w:cs="Times New Roman"/>
@@ -11322,6 +13614,7 @@
               </w:rPr>
               <w:t>ExtraTrees</w:t>
             </w:r>
+            <w:proofErr w:type="spellEnd"/>
           </w:p>
         </w:tc>
         <w:tc>
@@ -11332,12 +13625,37 @@
             <w:pPr>
               <w:spacing w:before="20" w:after="20"/>
             </w:pPr>
-            <w:r>
-              <w:rPr>
-                <w:rFonts w:eastAsia="Times New Roman" w:cs="Times New Roman"/>
-                <w:sz w:val="20"/>
-              </w:rPr>
-              <w:t>n_estimators=300, max_depth=None</w:t>
+            <w:proofErr w:type="spellStart"/>
+            <w:r>
+              <w:rPr>
+                <w:rFonts w:eastAsia="Times New Roman" w:cs="Times New Roman"/>
+                <w:sz w:val="20"/>
+              </w:rPr>
+              <w:t>n_estimators</w:t>
+            </w:r>
+            <w:proofErr w:type="spellEnd"/>
+            <w:r>
+              <w:rPr>
+                <w:rFonts w:eastAsia="Times New Roman" w:cs="Times New Roman"/>
+                <w:sz w:val="20"/>
+              </w:rPr>
+              <w:t xml:space="preserve">=300, </w:t>
+            </w:r>
+            <w:proofErr w:type="spellStart"/>
+            <w:r>
+              <w:rPr>
+                <w:rFonts w:eastAsia="Times New Roman" w:cs="Times New Roman"/>
+                <w:sz w:val="20"/>
+              </w:rPr>
+              <w:t>max_depth</w:t>
+            </w:r>
+            <w:proofErr w:type="spellEnd"/>
+            <w:r>
+              <w:rPr>
+                <w:rFonts w:eastAsia="Times New Roman" w:cs="Times New Roman"/>
+                <w:sz w:val="20"/>
+              </w:rPr>
+              <w:t>=None</w:t>
             </w:r>
           </w:p>
         </w:tc>
@@ -11390,6 +13708,7 @@
             <w:pPr>
               <w:spacing w:before="20" w:after="20"/>
             </w:pPr>
+            <w:proofErr w:type="spellStart"/>
             <w:r>
               <w:rPr>
                 <w:rFonts w:eastAsia="Times New Roman" w:cs="Times New Roman"/>
@@ -11397,6 +13716,7 @@
               </w:rPr>
               <w:t>RandomForest</w:t>
             </w:r>
+            <w:proofErr w:type="spellEnd"/>
           </w:p>
         </w:tc>
         <w:tc>
@@ -11407,12 +13727,37 @@
             <w:pPr>
               <w:spacing w:before="20" w:after="20"/>
             </w:pPr>
-            <w:r>
-              <w:rPr>
-                <w:rFonts w:eastAsia="Times New Roman" w:cs="Times New Roman"/>
-                <w:sz w:val="20"/>
-              </w:rPr>
-              <w:t>n_estimators=500, max_depth=None</w:t>
+            <w:proofErr w:type="spellStart"/>
+            <w:r>
+              <w:rPr>
+                <w:rFonts w:eastAsia="Times New Roman" w:cs="Times New Roman"/>
+                <w:sz w:val="20"/>
+              </w:rPr>
+              <w:t>n_estimators</w:t>
+            </w:r>
+            <w:proofErr w:type="spellEnd"/>
+            <w:r>
+              <w:rPr>
+                <w:rFonts w:eastAsia="Times New Roman" w:cs="Times New Roman"/>
+                <w:sz w:val="20"/>
+              </w:rPr>
+              <w:t xml:space="preserve">=500, </w:t>
+            </w:r>
+            <w:proofErr w:type="spellStart"/>
+            <w:r>
+              <w:rPr>
+                <w:rFonts w:eastAsia="Times New Roman" w:cs="Times New Roman"/>
+                <w:sz w:val="20"/>
+              </w:rPr>
+              <w:t>max_depth</w:t>
+            </w:r>
+            <w:proofErr w:type="spellEnd"/>
+            <w:r>
+              <w:rPr>
+                <w:rFonts w:eastAsia="Times New Roman" w:cs="Times New Roman"/>
+                <w:sz w:val="20"/>
+              </w:rPr>
+              <w:t>=None</w:t>
             </w:r>
           </w:p>
         </w:tc>
@@ -11465,6 +13810,7 @@
             <w:pPr>
               <w:spacing w:before="20" w:after="20"/>
             </w:pPr>
+            <w:proofErr w:type="spellStart"/>
             <w:r>
               <w:rPr>
                 <w:rFonts w:eastAsia="Times New Roman" w:cs="Times New Roman"/>
@@ -11472,6 +13818,7 @@
               </w:rPr>
               <w:t>HistGBM</w:t>
             </w:r>
+            <w:proofErr w:type="spellEnd"/>
           </w:p>
         </w:tc>
         <w:tc>
@@ -11482,12 +13829,37 @@
             <w:pPr>
               <w:spacing w:before="20" w:after="20"/>
             </w:pPr>
-            <w:r>
-              <w:rPr>
-                <w:rFonts w:eastAsia="Times New Roman" w:cs="Times New Roman"/>
-                <w:sz w:val="20"/>
-              </w:rPr>
-              <w:t>max_depth=5, learning_rate=0.05</w:t>
+            <w:proofErr w:type="spellStart"/>
+            <w:r>
+              <w:rPr>
+                <w:rFonts w:eastAsia="Times New Roman" w:cs="Times New Roman"/>
+                <w:sz w:val="20"/>
+              </w:rPr>
+              <w:t>max_depth</w:t>
+            </w:r>
+            <w:proofErr w:type="spellEnd"/>
+            <w:r>
+              <w:rPr>
+                <w:rFonts w:eastAsia="Times New Roman" w:cs="Times New Roman"/>
+                <w:sz w:val="20"/>
+              </w:rPr>
+              <w:t xml:space="preserve">=5, </w:t>
+            </w:r>
+            <w:proofErr w:type="spellStart"/>
+            <w:r>
+              <w:rPr>
+                <w:rFonts w:eastAsia="Times New Roman" w:cs="Times New Roman"/>
+                <w:sz w:val="20"/>
+              </w:rPr>
+              <w:t>learning_rate</w:t>
+            </w:r>
+            <w:proofErr w:type="spellEnd"/>
+            <w:r>
+              <w:rPr>
+                <w:rFonts w:eastAsia="Times New Roman" w:cs="Times New Roman"/>
+                <w:sz w:val="20"/>
+              </w:rPr>
+              <w:t>=0.05</w:t>
             </w:r>
           </w:p>
         </w:tc>
@@ -11527,7 +13899,27 @@
           <w:color w:val="000000"/>
           <w:sz w:val="18"/>
         </w:rPr>
-        <w:t>Table 4.8: Winning hyperparameters per target after GridSearchCV.</w:t>
+        <w:t xml:space="preserve">Table 4.8: Winning hyperparameters per target after </w:t>
+      </w:r>
+      <w:proofErr w:type="spellStart"/>
+      <w:r>
+        <w:rPr>
+          <w:rFonts w:eastAsia="Times New Roman" w:cs="Times New Roman"/>
+          <w:i/>
+          <w:color w:val="000000"/>
+          <w:sz w:val="18"/>
+        </w:rPr>
+        <w:t>GridSearchCV</w:t>
+      </w:r>
+      <w:proofErr w:type="spellEnd"/>
+      <w:r>
+        <w:rPr>
+          <w:rFonts w:eastAsia="Times New Roman" w:cs="Times New Roman"/>
+          <w:i/>
+          <w:color w:val="000000"/>
+          <w:sz w:val="18"/>
+        </w:rPr>
+        <w:t>.</w:t>
       </w:r>
     </w:p>
     <w:p>
@@ -11866,7 +14258,25 @@
           <w:i/>
           <w:sz w:val="18"/>
         </w:rPr>
-        <w:t>Figure 4.13: Web app: predicted risk profile output with colour-coded level cards, radar chart, tabular result, and per-factor recommendations.</w:t>
+        <w:t xml:space="preserve">Figure 4.13: Web app: predicted risk profile output with </w:t>
+      </w:r>
+      <w:proofErr w:type="spellStart"/>
+      <w:r>
+        <w:rPr>
+          <w:rFonts w:eastAsia="Times New Roman" w:cs="Times New Roman"/>
+          <w:i/>
+          <w:sz w:val="18"/>
+        </w:rPr>
+        <w:t>colour</w:t>
+      </w:r>
+      <w:proofErr w:type="spellEnd"/>
+      <w:r>
+        <w:rPr>
+          <w:rFonts w:eastAsia="Times New Roman" w:cs="Times New Roman"/>
+          <w:i/>
+          <w:sz w:val="18"/>
+        </w:rPr>
+        <w:t>-coded level cards, radar chart, tabular result, and per-factor recommendations.</w:t>
       </w:r>
     </w:p>
     <w:p>
@@ -11894,7 +14304,35 @@
         <w:rPr>
           <w:rFonts w:eastAsia="Times New Roman" w:cs="Times New Roman"/>
         </w:rPr>
-        <w:t>This project designed, implemented, and deployed a per-rider ergonomic risk screening pipeline for last-mile quick-commerce delivery workers, turning a 36-item self-report questionnaire and a RULA + QEC observation record into six standardised risk levels across Force, Repetition, Posture, Duration, Contact Stress, and Vibration. The five survey-derived factors land at 58-62 percent cross-validation accuracy with macro AUC between 71 and 76 percent; the Posture model, which receives the RULA and QEC observation inputs directly, reaches 97 percent accuracy and 98 percent AUC. Chi-square identifies Posture, Repetition, and Force as the risk factors significantly associated with self-reported discomfort, and multivariable logistic regression flags age (OR 3.58 per band), job duration (OR 2.89), workload score, and fatigue score as the strongest individual predictors.</w:t>
+        <w:t xml:space="preserve">This project designed, implemented, and deployed a per-rider ergonomic risk screening pipeline for last-mile quick-commerce delivery workers, turning a 36-item self-report questionnaire and a RULA + QEC observation record into six </w:t>
+      </w:r>
+      <w:proofErr w:type="spellStart"/>
+      <w:r>
+        <w:rPr>
+          <w:rFonts w:eastAsia="Times New Roman" w:cs="Times New Roman"/>
+        </w:rPr>
+        <w:t>standardised</w:t>
+      </w:r>
+      <w:proofErr w:type="spellEnd"/>
+      <w:r>
+        <w:rPr>
+          <w:rFonts w:eastAsia="Times New Roman" w:cs="Times New Roman"/>
+        </w:rPr>
+        <w:t xml:space="preserve"> risk levels across Force, Repetition, Posture, Duration, Contact Stress, and Vibration. The five survey-derived factors land at 58-62 percent cross-validation accuracy with </w:t>
+      </w:r>
+      <w:proofErr w:type="gramStart"/>
+      <w:r>
+        <w:rPr>
+          <w:rFonts w:eastAsia="Times New Roman" w:cs="Times New Roman"/>
+        </w:rPr>
+        <w:t>macro AUC</w:t>
+      </w:r>
+      <w:proofErr w:type="gramEnd"/>
+      <w:r>
+        <w:rPr>
+          <w:rFonts w:eastAsia="Times New Roman" w:cs="Times New Roman"/>
+        </w:rPr>
+        <w:t xml:space="preserve"> between 71 and 76 percent; the Posture model, which receives the RULA and QEC observation inputs directly, reaches 97 percent accuracy and 98 percent AUC. Chi-square identifies Posture, Repetition, and Force as the risk factors significantly associated with self-reported discomfort, and multivariable logistic regression flags age (OR 3.58 per band), job duration (OR 2.89), workload score, and fatigue score as the strongest individual predictors.</w:t>
       </w:r>
     </w:p>
     <w:p>
@@ -11906,7 +14344,35 @@
         <w:rPr>
           <w:rFonts w:eastAsia="Times New Roman" w:cs="Times New Roman"/>
         </w:rPr>
-        <w:t>The main limitations are the self-report nature of most input variables, the severity-rank merge used to pair the identifier-less posture xlsx with the survey, and the small sample (n = 182) that keeps ML variance visible. Two methodological corrections were made and openly documented: Repetition binning moved from qcut to fixed cuts to remove a boundary tie that hid the worst real schedule, and vibration_index was added to the Duration exclusion list to remove indirect leakage.</w:t>
+        <w:t xml:space="preserve">The main limitations are the self-report nature of most input variables, the severity-rank merge used to pair the identifier-less posture xlsx with the survey, and the small sample (n = 182) that keeps ML variance visible. Two methodological corrections were made and openly documented: Repetition binning moved from </w:t>
+      </w:r>
+      <w:proofErr w:type="spellStart"/>
+      <w:r>
+        <w:rPr>
+          <w:rFonts w:eastAsia="Times New Roman" w:cs="Times New Roman"/>
+        </w:rPr>
+        <w:t>qcut</w:t>
+      </w:r>
+      <w:proofErr w:type="spellEnd"/>
+      <w:r>
+        <w:rPr>
+          <w:rFonts w:eastAsia="Times New Roman" w:cs="Times New Roman"/>
+        </w:rPr>
+        <w:t xml:space="preserve"> to fixed cuts to remove a boundary tie that hid the worst real schedule, and </w:t>
+      </w:r>
+      <w:proofErr w:type="spellStart"/>
+      <w:r>
+        <w:rPr>
+          <w:rFonts w:eastAsia="Times New Roman" w:cs="Times New Roman"/>
+        </w:rPr>
+        <w:t>vibration_index</w:t>
+      </w:r>
+      <w:proofErr w:type="spellEnd"/>
+      <w:r>
+        <w:rPr>
+          <w:rFonts w:eastAsia="Times New Roman" w:cs="Times New Roman"/>
+        </w:rPr>
+        <w:t xml:space="preserve"> was added to the Duration exclusion list to remove indirect leakage.</w:t>
       </w:r>
     </w:p>
     <w:p>
@@ -11918,7 +14384,21 @@
         <w:rPr>
           <w:rFonts w:eastAsia="Times New Roman" w:cs="Times New Roman"/>
         </w:rPr>
-        <w:t>Five interventions for a delivery-platform operator follow directly from the results: (i) cap daily hours (49 percent of the sample exceeds 8 hours per day); (ii) invest in posture-focused equipment and training (84 percent of observed postures at RULA grand score 5 or above, corresponding to action level 3 or 4); (iii) encourage bike-storage-box carrying over handheld bags; (iv) age-targeted MSD screening for the 36-and-above cohort; and (v) platform-level workload management to reduce the NASA-TLX component of the workload score, a significant discomfort predictor at p = 0.0005.</w:t>
+        <w:t>Five interventions for a delivery-platform operator follow directly from the results: (</w:t>
+      </w:r>
+      <w:proofErr w:type="spellStart"/>
+      <w:r>
+        <w:rPr>
+          <w:rFonts w:eastAsia="Times New Roman" w:cs="Times New Roman"/>
+        </w:rPr>
+        <w:t>i</w:t>
+      </w:r>
+      <w:proofErr w:type="spellEnd"/>
+      <w:r>
+        <w:rPr>
+          <w:rFonts w:eastAsia="Times New Roman" w:cs="Times New Roman"/>
+        </w:rPr>
+        <w:t>) cap daily hours (49 percent of the sample exceeds 8 hours per day); (ii) invest in posture-focused equipment and training (84 percent of observed postures at RULA grand score 5 or above, corresponding to action level 3 or 4); (iii) encourage bike-storage-box carrying over handheld bags; (iv) age-targeted MSD screening for the 36-and-above cohort; and (v) platform-level workload management to reduce the NASA-TLX component of the workload score, a significant discomfort predictor at p = 0.0005.</w:t>
       </w:r>
     </w:p>
     <w:p>
@@ -11957,7 +14437,23 @@
         <w:jc w:val="both"/>
       </w:pPr>
       <w:r>
-        <w:t>[1] Benson TM, Sathiyarajeswaran NS, Radhakrishnan R, Gafoor AA, Krupalakshme M, Samal J (2025). Factors and prevalence of musculoskeletal pain among the app-based food delivery riders in Tamil Nadu: a community-based cross-sectional study. Cureus, 17(3), e56132.</w:t>
+        <w:t xml:space="preserve">[1] Benson TM, </w:t>
+      </w:r>
+      <w:proofErr w:type="spellStart"/>
+      <w:r>
+        <w:t>Sathiyarajeswaran</w:t>
+      </w:r>
+      <w:proofErr w:type="spellEnd"/>
+      <w:r>
+        <w:t xml:space="preserve"> NS, Radhakrishnan R, Gafoor AA, </w:t>
+      </w:r>
+      <w:proofErr w:type="spellStart"/>
+      <w:r>
+        <w:t>Krupalakshme</w:t>
+      </w:r>
+      <w:proofErr w:type="spellEnd"/>
+      <w:r>
+        <w:t xml:space="preserve"> M, Samal J (2025). Factors and prevalence of musculoskeletal pain among the app-based food delivery riders in Tamil Nadu: a community-based cross-sectional study. Cureus, 17(3), e56132.</w:t>
       </w:r>
     </w:p>
     <w:p>
@@ -11997,7 +14493,23 @@
         <w:jc w:val="both"/>
       </w:pPr>
       <w:r>
-        <w:t>[5] Kuorinka I, Jonsson B, Kilbom A, Vinterberg H, Biering-Sorensen F, Andersson G, Jorgensen K (1987). Standardised Nordic questionnaires for the analysis of musculoskeletal symptoms. Applied Ergonomics, 18(3), 233-237.</w:t>
+        <w:t xml:space="preserve">[5] </w:t>
+      </w:r>
+      <w:proofErr w:type="spellStart"/>
+      <w:r>
+        <w:t>Kuorinka</w:t>
+      </w:r>
+      <w:proofErr w:type="spellEnd"/>
+      <w:r>
+        <w:t xml:space="preserve"> I, Jonsson B, Kilbom A, Vinterberg H, Biering-Sorensen F, Andersson G, Jorgensen K (1987). </w:t>
+      </w:r>
+      <w:proofErr w:type="spellStart"/>
+      <w:r>
+        <w:t>Standardised</w:t>
+      </w:r>
+      <w:proofErr w:type="spellEnd"/>
+      <w:r>
+        <w:t xml:space="preserve"> Nordic questionnaires for the analysis of musculoskeletal symptoms. Applied Ergonomics, 18(3), 233-237.</w:t>
       </w:r>
     </w:p>
     <w:p>
@@ -12007,7 +14519,15 @@
         <w:jc w:val="both"/>
       </w:pPr>
       <w:r>
-        <w:t>[6] Hart SG, Staveland LE (1988). Development of NASA-TLX (Task Load Index): Results of empirical and theoretical research. Advances in Psychology, 52, 139-183.</w:t>
+        <w:t xml:space="preserve">[6] Hart SG, </w:t>
+      </w:r>
+      <w:proofErr w:type="spellStart"/>
+      <w:r>
+        <w:t>Staveland</w:t>
+      </w:r>
+      <w:proofErr w:type="spellEnd"/>
+      <w:r>
+        <w:t xml:space="preserve"> LE (1988). Development of NASA-TLX (Task Load Index): Results of empirical and theoretical research. Advances in Psychology, 52, 139-183.</w:t>
       </w:r>
     </w:p>
     <w:p>
@@ -12027,7 +14547,15 @@
         <w:jc w:val="both"/>
       </w:pPr>
       <w:r>
-        <w:t>[8] Chawla NV, Bowyer KW, Hall LO, Kegelmeyer WP (2002). SMOTE: Synthetic Minority Over-sampling Technique. Journal of Artificial Intelligence Research, 16, 321-357.</w:t>
+        <w:t xml:space="preserve">[8] Chawla NV, Bowyer KW, Hall LO, </w:t>
+      </w:r>
+      <w:proofErr w:type="spellStart"/>
+      <w:r>
+        <w:t>Kegelmeyer</w:t>
+      </w:r>
+      <w:proofErr w:type="spellEnd"/>
+      <w:r>
+        <w:t xml:space="preserve"> WP (2002). SMOTE: Synthetic Minority Over-sampling Technique. Journal of Artificial Intelligence Research, 16, 321-357.</w:t>
       </w:r>
     </w:p>
     <w:p>
@@ -12047,7 +14575,15 @@
         <w:jc w:val="both"/>
       </w:pPr>
       <w:r>
-        <w:t>[10] Breiman L (2001). Random Forests. Machine Learning, 45(1), 5-32.</w:t>
+        <w:t xml:space="preserve">[10] </w:t>
+      </w:r>
+      <w:proofErr w:type="spellStart"/>
+      <w:r>
+        <w:t>Breiman</w:t>
+      </w:r>
+      <w:proofErr w:type="spellEnd"/>
+      <w:r>
+        <w:t xml:space="preserve"> L (2001). Random Forests. Machine Learning, 45(1), 5-32.</w:t>
       </w:r>
     </w:p>
     <w:p>
@@ -12057,7 +14593,15 @@
         <w:jc w:val="both"/>
       </w:pPr>
       <w:r>
-        <w:t>[11] Geurts P, Ernst D, Wehenkel L (2006). Extremely randomized trees. Machine Learning, 63(1), 3-42.</w:t>
+        <w:t xml:space="preserve">[11] Geurts P, Ernst D, </w:t>
+      </w:r>
+      <w:proofErr w:type="spellStart"/>
+      <w:r>
+        <w:t>Wehenkel</w:t>
+      </w:r>
+      <w:proofErr w:type="spellEnd"/>
+      <w:r>
+        <w:t xml:space="preserve"> L (2006). Extremely randomized trees. Machine Learning, 63(1), 3-42.</w:t>
       </w:r>
     </w:p>
     <w:p>
@@ -12067,7 +14611,23 @@
         <w:jc w:val="both"/>
       </w:pPr>
       <w:r>
-        <w:t>[12] Chen T, Guestrin C (2016). XGBoost: A Scalable Tree Boosting System. Proceedings of the 22nd ACM SIGKDD International Conference on Knowledge Discovery and Data Mining, 785-794.</w:t>
+        <w:t xml:space="preserve">[12] Chen T, </w:t>
+      </w:r>
+      <w:proofErr w:type="spellStart"/>
+      <w:r>
+        <w:t>Guestrin</w:t>
+      </w:r>
+      <w:proofErr w:type="spellEnd"/>
+      <w:r>
+        <w:t xml:space="preserve"> C (2016). </w:t>
+      </w:r>
+      <w:proofErr w:type="spellStart"/>
+      <w:r>
+        <w:t>XGBoost</w:t>
+      </w:r>
+      <w:proofErr w:type="spellEnd"/>
+      <w:r>
+        <w:t>: A Scalable Tree Boosting System. Proceedings of the 22nd ACM SIGKDD International Conference on Knowledge Discovery and Data Mining, 785-794.</w:t>
       </w:r>
     </w:p>
     <w:p>
@@ -12087,7 +14647,23 @@
         <w:jc w:val="both"/>
       </w:pPr>
       <w:r>
-        <w:t>[14] Pedregosa F, Varoquaux G, Gramfort A, et al. (2011). Scikit-learn: Machine Learning in Python. Journal of Machine Learning Research, 12, 2825-2830.</w:t>
+        <w:t xml:space="preserve">[14] Pedregosa F, </w:t>
+      </w:r>
+      <w:proofErr w:type="spellStart"/>
+      <w:r>
+        <w:t>Varoquaux</w:t>
+      </w:r>
+      <w:proofErr w:type="spellEnd"/>
+      <w:r>
+        <w:t xml:space="preserve"> G, </w:t>
+      </w:r>
+      <w:proofErr w:type="spellStart"/>
+      <w:r>
+        <w:t>Gramfort</w:t>
+      </w:r>
+      <w:proofErr w:type="spellEnd"/>
+      <w:r>
+        <w:t xml:space="preserve"> A, et al. (2011). Scikit-learn: Machine Learning in Python. Journal of Machine Learning Research, 12, 2825-2830.</w:t>
       </w:r>
     </w:p>
     <w:sectPr>
@@ -12293,7 +14869,7 @@
         <w:noProof/>
         <w:sz w:val="20"/>
       </w:rPr>
-      <w:t>CHAPTER 4. RESULTS AND DISCUSSIONS</w:t>
+      <w:t>CHAPTER 2. METHODOLOGY</w:t>
     </w:r>
     <w:r>
       <w:rPr>

</xml_diff>

<commit_message>
report.docx: fix §1.3 heading duplicate "1.31.3" render
Word's automatic numbering (numPr numId=15) on the Objectives heading
was producing "1.3" and then colliding with the "1.3   " I typed into
the text, rendering as "1.31.3   Objectives of the work". Removed the
paragraph's numPr so only the typed prefix remains, matching the
pattern used on §1.1 and §1.2 which are text-numbered.
</commit_message>
<xml_diff>
--- a/docs/report.docx
+++ b/docs/report.docx
@@ -3154,10 +3154,6 @@
     <w:p>
       <w:pPr>
         <w:pStyle w:val="Heading4"/>
-        <w:numPr>
-          <w:ilvl w:val="1"/>
-          <w:numId w:val="15"/>
-        </w:numPr>
         <w:spacing w:before="280" w:after="100"/>
       </w:pPr>
       <w:r>

</xml_diff>

<commit_message>
report.docx: Word-side paragraph cleanup
Opening the docx in Word after the previous edits stripped two empty
paragraphs and rewrote embedded metadata; all headings, tables, and
figures land on the same pages so no TOC / LoF / LoT anchor drift.
Content verified intact: §1.3 heading still renders "1.3   Objectives
of the work", inline [1, 2] citation still present in §1.1, all 14
bibliography entries intact.
</commit_message>
<xml_diff>
--- a/docs/report.docx
+++ b/docs/report.docx
@@ -44,8 +44,19 @@
           <w:color w:val="000000"/>
           <w:sz w:val="26"/>
         </w:rPr>
-        <w:t>IIITDM-SIES Programme</w:t>
-      </w:r>
+        <w:t xml:space="preserve">IIITDM-SIES </w:t>
+      </w:r>
+      <w:proofErr w:type="spellStart"/>
+      <w:r>
+        <w:rPr>
+          <w:rFonts w:eastAsia="Times New Roman" w:cs="Times New Roman"/>
+          <w:b/>
+          <w:color w:val="000000"/>
+          <w:sz w:val="26"/>
+        </w:rPr>
+        <w:t>Programme</w:t>
+      </w:r>
+      <w:proofErr w:type="spellEnd"/>
     </w:p>
     <w:p>
       <w:pPr>
@@ -314,7 +325,21 @@
         <w:rPr>
           <w:rFonts w:eastAsia="Times New Roman" w:cs="Times New Roman"/>
         </w:rPr>
-        <w:t>In my capacity as supervisor of the above-mentioned work, I certify that the work presented in this Report is carried out under my supervision, and is worthy of consideration for the requirements of internship under IIITDM-SIES programme during the period May 2026 to July 2026.</w:t>
+        <w:t xml:space="preserve">In my capacity as supervisor of the above-mentioned work, I certify that the work presented in this Report is carried out under my supervision, and is worthy of consideration for the requirements of internship under IIITDM-SIES </w:t>
+      </w:r>
+      <w:proofErr w:type="spellStart"/>
+      <w:r>
+        <w:rPr>
+          <w:rFonts w:eastAsia="Times New Roman" w:cs="Times New Roman"/>
+        </w:rPr>
+        <w:t>programme</w:t>
+      </w:r>
+      <w:proofErr w:type="spellEnd"/>
+      <w:r>
+        <w:rPr>
+          <w:rFonts w:eastAsia="Times New Roman" w:cs="Times New Roman"/>
+        </w:rPr>
+        <w:t xml:space="preserve"> during the period May 2026 to July 2026.</w:t>
       </w:r>
     </w:p>
     <w:p>
@@ -370,7 +395,35 @@
         <w:rPr>
           <w:rFonts w:eastAsia="Times New Roman" w:cs="Times New Roman"/>
         </w:rPr>
-        <w:t>Delivery riders working for companies such as Blinkit and Zepto have to tend to their customers while standing in uncomfortable body shapes for a long time or transporting heavy loads, which may result in musculoskeletal disorders. Risk varies across the people involved in the delivery: age, experience, working hours, the type of vehicle, and carrying methods influence the level of risk experienced by every rider, but the companies providing the delivery services do not pay attention to this difference. Different ergonomic approaches capture only certain aspects of the situation: on the one hand, some methods (RULA and QEC) are applicable to direct observations, while others, like Borg CR10, NMQ, and NASA-TLX apply to self-reporting methods. This paradigm enables the authors to offer automated screening based on a study involving 182 riders from the city of Chengalpattu and Chennai conducted in March and April 2026</w:t>
+        <w:t xml:space="preserve">Delivery riders working for companies such as </w:t>
+      </w:r>
+      <w:proofErr w:type="spellStart"/>
+      <w:r>
+        <w:rPr>
+          <w:rFonts w:eastAsia="Times New Roman" w:cs="Times New Roman"/>
+        </w:rPr>
+        <w:t>Blinkit</w:t>
+      </w:r>
+      <w:proofErr w:type="spellEnd"/>
+      <w:r>
+        <w:rPr>
+          <w:rFonts w:eastAsia="Times New Roman" w:cs="Times New Roman"/>
+        </w:rPr>
+        <w:t xml:space="preserve"> and </w:t>
+      </w:r>
+      <w:proofErr w:type="spellStart"/>
+      <w:r>
+        <w:rPr>
+          <w:rFonts w:eastAsia="Times New Roman" w:cs="Times New Roman"/>
+        </w:rPr>
+        <w:t>Zepto</w:t>
+      </w:r>
+      <w:proofErr w:type="spellEnd"/>
+      <w:r>
+        <w:rPr>
+          <w:rFonts w:eastAsia="Times New Roman" w:cs="Times New Roman"/>
+        </w:rPr>
+        <w:t xml:space="preserve"> have to tend to their customers while standing in uncomfortable body shapes for a long time or transporting heavy loads, which may result in musculoskeletal disorders. Risk varies across the people involved in the delivery: age, experience, working hours, the type of vehicle, and carrying methods influence the level of risk experienced by every rider, but the companies providing the delivery services do not pay attention to this difference. Different ergonomic approaches capture only certain aspects of the situation: on the one hand, some methods (RULA and QEC) are applicable to direct observations, while others, like Borg CR10, NMQ, and NASA-TLX apply to self-reporting methods. This paradigm enables the authors to offer automated screening based on a study involving 182 riders from the city of Chengalpattu and Chennai conducted in March and April 2026</w:t>
       </w:r>
     </w:p>
     <w:p>
@@ -382,7 +435,49 @@
         <w:rPr>
           <w:rFonts w:eastAsia="Times New Roman" w:cs="Times New Roman"/>
         </w:rPr>
-        <w:t>The pipeline runs in two stages. Stage 1 applies standard ergonomic methods (Borg CR10 action levels, RULA Table C thresholds, and sample-based cuts) to compute Low, Medium, or High risk labels for each factor from a 182-rider survey combined with 182 RULA and QEC observation records. Stage 2 trains supervised classifiers per factor using seven candidate algorithms (Logistic Regression, Decision Tree, Random Forest, Extra Trees, Hist Gradient Boosting, XGBoost, and Stacking) tuned via GridSearchCV with SMOTE inside 5-fold stratified cross-validation.</w:t>
+        <w:t xml:space="preserve">The pipeline runs in two stages. Stage 1 applies standard ergonomic methods (Borg CR10 action levels, RULA Table C thresholds, and sample-based cuts) to compute Low, Medium, or </w:t>
+      </w:r>
+      <w:proofErr w:type="gramStart"/>
+      <w:r>
+        <w:rPr>
+          <w:rFonts w:eastAsia="Times New Roman" w:cs="Times New Roman"/>
+        </w:rPr>
+        <w:t>High risk</w:t>
+      </w:r>
+      <w:proofErr w:type="gramEnd"/>
+      <w:r>
+        <w:rPr>
+          <w:rFonts w:eastAsia="Times New Roman" w:cs="Times New Roman"/>
+        </w:rPr>
+        <w:t xml:space="preserve"> labels for each factor from a 182-rider survey combined with 182 RULA and QEC observation records. Stage 2 trains supervised classifiers per factor using seven candidate algorithms (Logistic Regression, Decision Tree, Random Forest, Extra Trees, Hist Gradient Boosting, </w:t>
+      </w:r>
+      <w:proofErr w:type="spellStart"/>
+      <w:r>
+        <w:rPr>
+          <w:rFonts w:eastAsia="Times New Roman" w:cs="Times New Roman"/>
+        </w:rPr>
+        <w:t>XGBoost</w:t>
+      </w:r>
+      <w:proofErr w:type="spellEnd"/>
+      <w:r>
+        <w:rPr>
+          <w:rFonts w:eastAsia="Times New Roman" w:cs="Times New Roman"/>
+        </w:rPr>
+        <w:t xml:space="preserve">, and Stacking) tuned via </w:t>
+      </w:r>
+      <w:proofErr w:type="spellStart"/>
+      <w:r>
+        <w:rPr>
+          <w:rFonts w:eastAsia="Times New Roman" w:cs="Times New Roman"/>
+        </w:rPr>
+        <w:t>GridSearchCV</w:t>
+      </w:r>
+      <w:proofErr w:type="spellEnd"/>
+      <w:r>
+        <w:rPr>
+          <w:rFonts w:eastAsia="Times New Roman" w:cs="Times New Roman"/>
+        </w:rPr>
+        <w:t xml:space="preserve"> with SMOTE inside 5-fold stratified cross-validation.</w:t>
       </w:r>
     </w:p>
     <w:p>
@@ -391,7 +486,23 @@
         <w:jc w:val="both"/>
       </w:pPr>
       <w:r>
-        <w:t>The five factors which were taken from the survey received a validation accuracy of 58-62% and a macro AUC of 71-76%. The Posture model which incorporates 11 components of RULA and 8 QEC scores in addition to the results received an accuracy of 97% and AUC of 98%. Statistical analysis including chi-square and multiple logistic regression determined that the most powerful individual predictors of self-reported discomfort are age, length of work history, workload score and fatigue score. The final product is a Streamlit web application that takes a complete questionnaire of 36 items together with RULA and QEC results and produces six levels of risk and offers recommendations by factors.</w:t>
+        <w:t xml:space="preserve">The five factors which were taken from the survey received a validation accuracy of 58-62% and a </w:t>
+      </w:r>
+      <w:proofErr w:type="gramStart"/>
+      <w:r>
+        <w:t>macro AUC</w:t>
+      </w:r>
+      <w:proofErr w:type="gramEnd"/>
+      <w:r>
+        <w:t xml:space="preserve"> of 71-76%. The Posture model which incorporates 11 components of RULA and 8 QEC scores in addition to the results received an accuracy of 97% and AUC of 98%. Statistical analysis including chi-square and multiple logistic regression determined that the most powerful individual predictors of self-reported discomfort are age, length of work history, workload score and fatigue score. The final product is a </w:t>
+      </w:r>
+      <w:proofErr w:type="spellStart"/>
+      <w:r>
+        <w:t>Streamlit</w:t>
+      </w:r>
+      <w:proofErr w:type="spellEnd"/>
+      <w:r>
+        <w:t xml:space="preserve"> web application that takes a complete questionnaire of 36 items together with RULA and QEC results and produces six levels of risk and offers recommendations by factors.</w:t>
       </w:r>
     </w:p>
     <w:p>
@@ -495,8 +606,15 @@
           <w:rFonts w:eastAsia="Times New Roman" w:cs="Times New Roman"/>
         </w:rPr>
         <w:tab/>
+      </w:r>
+      <w:proofErr w:type="spellStart"/>
+      <w:r>
+        <w:rPr>
+          <w:rFonts w:eastAsia="Times New Roman" w:cs="Times New Roman"/>
+        </w:rPr>
         <w:t>i</w:t>
       </w:r>
+      <w:proofErr w:type="spellEnd"/>
     </w:p>
     <w:p>
       <w:pPr>
@@ -1044,8 +1162,16 @@
         <w:rPr>
           <w:rFonts w:eastAsia="Times New Roman" w:cs="Times New Roman"/>
         </w:rPr>
-        <w:t xml:space="preserve">        2.6.6   XGBoost</w:t>
-      </w:r>
+        <w:t xml:space="preserve">        2.6.6   </w:t>
+      </w:r>
+      <w:proofErr w:type="spellStart"/>
+      <w:r>
+        <w:rPr>
+          <w:rFonts w:eastAsia="Times New Roman" w:cs="Times New Roman"/>
+        </w:rPr>
+        <w:t>XGBoost</w:t>
+      </w:r>
+      <w:proofErr w:type="spellEnd"/>
       <w:r>
         <w:rPr>
           <w:rFonts w:eastAsia="Times New Roman" w:cs="Times New Roman"/>
@@ -1151,7 +1277,23 @@
           <w:b/>
         </w:rPr>
         <w:lastRenderedPageBreak/>
-        <w:t>3   WORK DONE</w:t>
+        <w:t xml:space="preserve">3   </w:t>
+      </w:r>
+      <w:proofErr w:type="gramStart"/>
+      <w:r>
+        <w:rPr>
+          <w:rFonts w:eastAsia="Times New Roman" w:cs="Times New Roman"/>
+          <w:b/>
+        </w:rPr>
+        <w:t>WORK</w:t>
+      </w:r>
+      <w:proofErr w:type="gramEnd"/>
+      <w:r>
+        <w:rPr>
+          <w:rFonts w:eastAsia="Times New Roman" w:cs="Times New Roman"/>
+          <w:b/>
+        </w:rPr>
+        <w:t xml:space="preserve"> DONE</w:t>
       </w:r>
       <w:r>
         <w:rPr>
@@ -2258,7 +2400,21 @@
           <w:rFonts w:eastAsia="Times New Roman" w:cs="Times New Roman"/>
         </w:rPr>
         <w:tab/>
-        <w:t>Winning hyperparameters per target after GridSearchCV.</w:t>
+        <w:t xml:space="preserve">Winning hyperparameters per target after </w:t>
+      </w:r>
+      <w:proofErr w:type="spellStart"/>
+      <w:r>
+        <w:rPr>
+          <w:rFonts w:eastAsia="Times New Roman" w:cs="Times New Roman"/>
+        </w:rPr>
+        <w:t>GridSearchCV</w:t>
+      </w:r>
+      <w:proofErr w:type="spellEnd"/>
+      <w:r>
+        <w:rPr>
+          <w:rFonts w:eastAsia="Times New Roman" w:cs="Times New Roman"/>
+        </w:rPr>
+        <w:t>.</w:t>
       </w:r>
       <w:r>
         <w:rPr>
@@ -2451,14 +2607,14 @@
           <w:rFonts w:eastAsia="Times New Roman" w:cs="Times New Roman"/>
           <w:b/>
         </w:rPr>
-        <w:t>ML</w:t>
+        <w:t>ROC</w:t>
       </w:r>
       <w:r>
         <w:rPr>
           <w:rFonts w:eastAsia="Times New Roman" w:cs="Times New Roman"/>
         </w:rPr>
         <w:tab/>
-        <w:t>Machine Learning</w:t>
+        <w:t>Receiver Operating Characteristic</w:t>
       </w:r>
     </w:p>
     <w:p>
@@ -2473,14 +2629,14 @@
           <w:rFonts w:eastAsia="Times New Roman" w:cs="Times New Roman"/>
           <w:b/>
         </w:rPr>
-        <w:t>ROC</w:t>
+        <w:t>AUC</w:t>
       </w:r>
       <w:r>
         <w:rPr>
           <w:rFonts w:eastAsia="Times New Roman" w:cs="Times New Roman"/>
         </w:rPr>
         <w:tab/>
-        <w:t>Receiver Operating Characteristic</w:t>
+        <w:t>Area Under the Curve</w:t>
       </w:r>
     </w:p>
     <w:p>
@@ -2495,14 +2651,14 @@
           <w:rFonts w:eastAsia="Times New Roman" w:cs="Times New Roman"/>
           <w:b/>
         </w:rPr>
-        <w:t>AUC</w:t>
+        <w:t>OR</w:t>
       </w:r>
       <w:r>
         <w:rPr>
           <w:rFonts w:eastAsia="Times New Roman" w:cs="Times New Roman"/>
         </w:rPr>
         <w:tab/>
-        <w:t>Area Under the Curve</w:t>
+        <w:t>Odds Ratio</w:t>
       </w:r>
     </w:p>
     <w:p>
@@ -2517,14 +2673,14 @@
           <w:rFonts w:eastAsia="Times New Roman" w:cs="Times New Roman"/>
           <w:b/>
         </w:rPr>
-        <w:t>OR</w:t>
+        <w:t>CI</w:t>
       </w:r>
       <w:r>
         <w:rPr>
           <w:rFonts w:eastAsia="Times New Roman" w:cs="Times New Roman"/>
         </w:rPr>
         <w:tab/>
-        <w:t>Odds Ratio</w:t>
+        <w:t>Confidence Interval</w:t>
       </w:r>
     </w:p>
     <w:p>
@@ -2534,19 +2690,21 @@
         </w:tabs>
         <w:spacing w:after="60"/>
       </w:pPr>
+      <w:proofErr w:type="spellStart"/>
       <w:r>
         <w:rPr>
           <w:rFonts w:eastAsia="Times New Roman" w:cs="Times New Roman"/>
           <w:b/>
         </w:rPr>
-        <w:t>CI</w:t>
-      </w:r>
+        <w:t>HistGBM</w:t>
+      </w:r>
+      <w:proofErr w:type="spellEnd"/>
       <w:r>
         <w:rPr>
           <w:rFonts w:eastAsia="Times New Roman" w:cs="Times New Roman"/>
         </w:rPr>
         <w:tab/>
-        <w:t>Confidence Interval</w:t>
+        <w:t>Histogram-based Gradient Boosting Machine</w:t>
       </w:r>
     </w:p>
     <w:p>
@@ -2556,19 +2714,34 @@
         </w:tabs>
         <w:spacing w:after="60"/>
       </w:pPr>
+      <w:proofErr w:type="spellStart"/>
       <w:r>
         <w:rPr>
           <w:rFonts w:eastAsia="Times New Roman" w:cs="Times New Roman"/>
           <w:b/>
         </w:rPr>
-        <w:t>HistGBM</w:t>
-      </w:r>
+        <w:t>XGBoost</w:t>
+      </w:r>
+      <w:proofErr w:type="spellEnd"/>
       <w:r>
         <w:rPr>
           <w:rFonts w:eastAsia="Times New Roman" w:cs="Times New Roman"/>
         </w:rPr>
         <w:tab/>
-        <w:t>Histogram-based Gradient Boosting Machine</w:t>
+      </w:r>
+      <w:proofErr w:type="spellStart"/>
+      <w:r>
+        <w:rPr>
+          <w:rFonts w:eastAsia="Times New Roman" w:cs="Times New Roman"/>
+        </w:rPr>
+        <w:t>eXtreme</w:t>
+      </w:r>
+      <w:proofErr w:type="spellEnd"/>
+      <w:r>
+        <w:rPr>
+          <w:rFonts w:eastAsia="Times New Roman" w:cs="Times New Roman"/>
+        </w:rPr>
+        <w:t xml:space="preserve"> Gradient Boosting</w:t>
       </w:r>
     </w:p>
     <w:p>
@@ -2583,14 +2756,14 @@
           <w:rFonts w:eastAsia="Times New Roman" w:cs="Times New Roman"/>
           <w:b/>
         </w:rPr>
-        <w:t>XGBoost</w:t>
+        <w:t>CART</w:t>
       </w:r>
       <w:r>
         <w:rPr>
           <w:rFonts w:eastAsia="Times New Roman" w:cs="Times New Roman"/>
         </w:rPr>
         <w:tab/>
-        <w:t>eXtreme Gradient Boosting</w:t>
+        <w:t>Classification and Regression Trees</w:t>
       </w:r>
     </w:p>
     <w:p>
@@ -2600,19 +2773,21 @@
         </w:tabs>
         <w:spacing w:after="60"/>
       </w:pPr>
+      <w:proofErr w:type="spellStart"/>
       <w:r>
         <w:rPr>
           <w:rFonts w:eastAsia="Times New Roman" w:cs="Times New Roman"/>
           <w:b/>
         </w:rPr>
-        <w:t>CART</w:t>
-      </w:r>
+        <w:t>dph</w:t>
+      </w:r>
+      <w:proofErr w:type="spellEnd"/>
       <w:r>
         <w:rPr>
           <w:rFonts w:eastAsia="Times New Roman" w:cs="Times New Roman"/>
         </w:rPr>
         <w:tab/>
-        <w:t>Classification and Regression Trees</w:t>
+        <w:t>Deliveries Per Hour</w:t>
       </w:r>
     </w:p>
     <w:p>
@@ -2624,17 +2799,13 @@
       </w:pPr>
       <w:r>
         <w:rPr>
-          <w:rFonts w:eastAsia="Times New Roman" w:cs="Times New Roman"/>
           <w:b/>
         </w:rPr>
-        <w:t>dph</w:t>
-      </w:r>
-      <w:r>
-        <w:rPr>
-          <w:rFonts w:eastAsia="Times New Roman" w:cs="Times New Roman"/>
-        </w:rPr>
+        <w:t>MSK</w:t>
+      </w:r>
+      <w:r>
         <w:tab/>
-        <w:t>Deliveries Per Hour</w:t>
+        <w:t>Musculoskeletal</w:t>
       </w:r>
     </w:p>
     <w:p>
@@ -2648,11 +2819,11 @@
         <w:rPr>
           <w:b/>
         </w:rPr>
-        <w:t>MSK</w:t>
+        <w:t>CR10</w:t>
       </w:r>
       <w:r>
         <w:tab/>
-        <w:t>Musculoskeletal</w:t>
+        <w:t>Category-Ratio 10-point scale (Borg)</w:t>
       </w:r>
     </w:p>
     <w:p>
@@ -2666,11 +2837,11 @@
         <w:rPr>
           <w:b/>
         </w:rPr>
-        <w:t>CR10</w:t>
+        <w:t>RF</w:t>
       </w:r>
       <w:r>
         <w:tab/>
-        <w:t>Category-Ratio 10-point scale (Borg)</w:t>
+        <w:t>Random Forest</w:t>
       </w:r>
     </w:p>
     <w:p>
@@ -2684,11 +2855,11 @@
         <w:rPr>
           <w:b/>
         </w:rPr>
-        <w:t>RF</w:t>
+        <w:t>ET</w:t>
       </w:r>
       <w:r>
         <w:tab/>
-        <w:t>Random Forest</w:t>
+        <w:t>Extra Trees</w:t>
       </w:r>
     </w:p>
     <w:p>
@@ -2702,11 +2873,11 @@
         <w:rPr>
           <w:b/>
         </w:rPr>
-        <w:t>ET</w:t>
+        <w:t>LR</w:t>
       </w:r>
       <w:r>
         <w:tab/>
-        <w:t>Extra Trees</w:t>
+        <w:t>Logistic Regression</w:t>
       </w:r>
     </w:p>
     <w:p>
@@ -2720,11 +2891,11 @@
         <w:rPr>
           <w:b/>
         </w:rPr>
-        <w:t>LR</w:t>
+        <w:t>DT</w:t>
       </w:r>
       <w:r>
         <w:tab/>
-        <w:t>Logistic Regression</w:t>
+        <w:t>Decision Tree</w:t>
       </w:r>
     </w:p>
     <w:p>
@@ -2738,11 +2909,11 @@
         <w:rPr>
           <w:b/>
         </w:rPr>
-        <w:t>DT</w:t>
+        <w:t>GBM</w:t>
       </w:r>
       <w:r>
         <w:tab/>
-        <w:t>Decision Tree</w:t>
+        <w:t>Gradient Boosting Machine</w:t>
       </w:r>
     </w:p>
     <w:p>
@@ -2752,15 +2923,17 @@
         </w:tabs>
         <w:spacing w:after="60"/>
       </w:pPr>
+      <w:proofErr w:type="spellStart"/>
       <w:r>
         <w:rPr>
           <w:b/>
         </w:rPr>
-        <w:t>GBM</w:t>
-      </w:r>
+        <w:t>OvR</w:t>
+      </w:r>
+      <w:proofErr w:type="spellEnd"/>
       <w:r>
         <w:tab/>
-        <w:t>Gradient Boosting Machine</w:t>
+        <w:t>One-vs-Rest</w:t>
       </w:r>
     </w:p>
     <w:p>
@@ -2774,11 +2947,28 @@
         <w:rPr>
           <w:b/>
         </w:rPr>
-        <w:t>OvR</w:t>
+        <w:t>SD</w:t>
       </w:r>
       <w:r>
         <w:tab/>
-        <w:t>One-vs-Rest</w:t>
+        <w:t>Standard Deviation</w:t>
+      </w:r>
+    </w:p>
+    <w:p>
+      <w:pPr>
+        <w:pStyle w:val="Heading1"/>
+        <w:pageBreakBefore/>
+        <w:spacing w:after="480"/>
+        <w:jc w:val="center"/>
+      </w:pPr>
+      <w:r>
+        <w:rPr>
+          <w:rFonts w:ascii="Times New Roman" w:eastAsia="Times New Roman" w:hAnsi="Times New Roman" w:cs="Times New Roman"/>
+          <w:color w:val="000000"/>
+          <w:sz w:val="56"/>
+        </w:rPr>
+        <w:lastRenderedPageBreak/>
+        <w:t>Symbols</w:t>
       </w:r>
     </w:p>
     <w:p>
@@ -2790,30 +2980,18 @@
       </w:pPr>
       <w:r>
         <w:rPr>
+          <w:rFonts w:eastAsia="Times New Roman" w:cs="Times New Roman"/>
           <w:b/>
-        </w:rPr>
-        <w:t>SD</w:t>
-      </w:r>
-      <w:r>
+          <w:i/>
+        </w:rPr>
+        <w:t>n</w:t>
+      </w:r>
+      <w:r>
+        <w:rPr>
+          <w:rFonts w:eastAsia="Times New Roman" w:cs="Times New Roman"/>
+        </w:rPr>
         <w:tab/>
-        <w:t>Standard Deviation</w:t>
-      </w:r>
-    </w:p>
-    <w:p>
-      <w:pPr>
-        <w:pStyle w:val="Heading1"/>
-        <w:pageBreakBefore/>
-        <w:spacing w:after="480"/>
-        <w:jc w:val="center"/>
-      </w:pPr>
-      <w:r>
-        <w:rPr>
-          <w:rFonts w:ascii="Times New Roman" w:eastAsia="Times New Roman" w:hAnsi="Times New Roman" w:cs="Times New Roman"/>
-          <w:color w:val="000000"/>
-          <w:sz w:val="56"/>
-        </w:rPr>
-        <w:lastRenderedPageBreak/>
-        <w:t>Symbols</w:t>
+        <w:t>sample size (n = 182 riders)</w:t>
       </w:r>
     </w:p>
     <w:p>
@@ -2829,14 +3007,28 @@
           <w:b/>
           <w:i/>
         </w:rPr>
-        <w:t>n</w:t>
+        <w:t>k</w:t>
       </w:r>
       <w:r>
         <w:rPr>
           <w:rFonts w:eastAsia="Times New Roman" w:cs="Times New Roman"/>
         </w:rPr>
         <w:tab/>
-        <w:t>sample size (n = 182 riders)</w:t>
+        <w:t xml:space="preserve">number of nearest minority </w:t>
+      </w:r>
+      <w:proofErr w:type="spellStart"/>
+      <w:r>
+        <w:rPr>
+          <w:rFonts w:eastAsia="Times New Roman" w:cs="Times New Roman"/>
+        </w:rPr>
+        <w:t>neighbours</w:t>
+      </w:r>
+      <w:proofErr w:type="spellEnd"/>
+      <w:r>
+        <w:rPr>
+          <w:rFonts w:eastAsia="Times New Roman" w:cs="Times New Roman"/>
+        </w:rPr>
+        <w:t xml:space="preserve"> used by SMOTE</w:t>
       </w:r>
     </w:p>
     <w:p>
@@ -2852,14 +3044,14 @@
           <w:b/>
           <w:i/>
         </w:rPr>
-        <w:t>k</w:t>
+        <w:t>λ</w:t>
       </w:r>
       <w:r>
         <w:rPr>
           <w:rFonts w:eastAsia="Times New Roman" w:cs="Times New Roman"/>
         </w:rPr>
         <w:tab/>
-        <w:t>number of nearest minority neighbours used by SMOTE</w:t>
+        <w:t>uniform random weight for SMOTE interpolation</w:t>
       </w:r>
     </w:p>
     <w:p>
@@ -2875,14 +3067,14 @@
           <w:b/>
           <w:i/>
         </w:rPr>
-        <w:t>λ</w:t>
+        <w:t>β</w:t>
       </w:r>
       <w:r>
         <w:rPr>
           <w:rFonts w:eastAsia="Times New Roman" w:cs="Times New Roman"/>
         </w:rPr>
         <w:tab/>
-        <w:t>uniform random weight for SMOTE interpolation</w:t>
+        <w:t>regression coefficient in logistic regression</w:t>
       </w:r>
     </w:p>
     <w:p>
@@ -2898,14 +3090,14 @@
           <w:b/>
           <w:i/>
         </w:rPr>
-        <w:t>β</w:t>
+        <w:t>χ²</w:t>
       </w:r>
       <w:r>
         <w:rPr>
           <w:rFonts w:eastAsia="Times New Roman" w:cs="Times New Roman"/>
         </w:rPr>
         <w:tab/>
-        <w:t>regression coefficient in logistic regression</w:t>
+        <w:t>chi-square test statistic</w:t>
       </w:r>
     </w:p>
     <w:p>
@@ -2921,14 +3113,14 @@
           <w:b/>
           <w:i/>
         </w:rPr>
-        <w:t>χ²</w:t>
+        <w:t>p</w:t>
       </w:r>
       <w:r>
         <w:rPr>
           <w:rFonts w:eastAsia="Times New Roman" w:cs="Times New Roman"/>
         </w:rPr>
         <w:tab/>
-        <w:t>chi-square test statistic</w:t>
+        <w:t>p-value (statistical significance)</w:t>
       </w:r>
     </w:p>
     <w:p>
@@ -2938,21 +3130,45 @@
         </w:tabs>
         <w:spacing w:after="60"/>
       </w:pPr>
+      <w:proofErr w:type="spellStart"/>
       <w:r>
         <w:rPr>
           <w:rFonts w:eastAsia="Times New Roman" w:cs="Times New Roman"/>
           <w:b/>
           <w:i/>
         </w:rPr>
-        <w:t>p</w:t>
-      </w:r>
+        <w:t>dph</w:t>
+      </w:r>
+      <w:proofErr w:type="spellEnd"/>
       <w:r>
         <w:rPr>
           <w:rFonts w:eastAsia="Times New Roman" w:cs="Times New Roman"/>
         </w:rPr>
         <w:tab/>
-        <w:t>p-value (statistical significance)</w:t>
-      </w:r>
+        <w:t xml:space="preserve">deliveries per hour, </w:t>
+      </w:r>
+      <w:proofErr w:type="spellStart"/>
+      <w:r>
+        <w:rPr>
+          <w:rFonts w:eastAsia="Times New Roman" w:cs="Times New Roman"/>
+        </w:rPr>
+        <w:t>deliveries_num</w:t>
+      </w:r>
+      <w:proofErr w:type="spellEnd"/>
+      <w:r>
+        <w:rPr>
+          <w:rFonts w:eastAsia="Times New Roman" w:cs="Times New Roman"/>
+        </w:rPr>
+        <w:t xml:space="preserve"> / </w:t>
+      </w:r>
+      <w:proofErr w:type="spellStart"/>
+      <w:r>
+        <w:rPr>
+          <w:rFonts w:eastAsia="Times New Roman" w:cs="Times New Roman"/>
+        </w:rPr>
+        <w:t>work_hours_num</w:t>
+      </w:r>
+      <w:proofErr w:type="spellEnd"/>
     </w:p>
     <w:p>
       <w:pPr>
@@ -2963,18 +3179,13 @@
       </w:pPr>
       <w:r>
         <w:rPr>
-          <w:rFonts w:eastAsia="Times New Roman" w:cs="Times New Roman"/>
           <w:b/>
-          <w:i/>
-        </w:rPr>
-        <w:t>dph</w:t>
-      </w:r>
-      <w:r>
-        <w:rPr>
-          <w:rFonts w:eastAsia="Times New Roman" w:cs="Times New Roman"/>
-        </w:rPr>
+        </w:rPr>
+        <w:t>α</w:t>
+      </w:r>
+      <w:r>
         <w:tab/>
-        <w:t>deliveries per hour, deliveries_num / work_hours_num</w:t>
+        <w:t>significance threshold (α = 0.05)</w:t>
       </w:r>
     </w:p>
     <w:p>
@@ -2984,30 +3195,14 @@
         </w:tabs>
         <w:spacing w:after="60"/>
       </w:pPr>
+      <w:proofErr w:type="spellStart"/>
       <w:r>
         <w:rPr>
           <w:b/>
         </w:rPr>
-        <w:t>α</w:t>
-      </w:r>
-      <w:r>
-        <w:tab/>
-        <w:t>significance threshold (α = 0.05)</w:t>
-      </w:r>
-    </w:p>
-    <w:p>
-      <w:pPr>
-        <w:tabs>
-          <w:tab w:val="left" w:pos="1984"/>
-        </w:tabs>
-        <w:spacing w:after="60"/>
-      </w:pPr>
-      <w:r>
-        <w:rPr>
-          <w:b/>
-        </w:rPr>
         <w:t>df</w:t>
       </w:r>
+      <w:proofErr w:type="spellEnd"/>
       <w:r>
         <w:tab/>
         <w:t>degrees of freedom (chi-square test)</w:t>
@@ -3081,7 +3276,35 @@
         <w:rPr>
           <w:rFonts w:eastAsia="Times New Roman" w:cs="Times New Roman"/>
         </w:rPr>
-        <w:t>Last-mile quick-commerce delivery riders for platforms like Blinkit and Zepto spend long hours on bikes, climb stairs, carry packages, and ride in heavy traffic. Prior Indian last-mile MSK studies [1, 2] report similar exposure patterns among app-based delivery riders. Over time this kind of work causes musculoskeletal disorders (MSDs): back pain, shoulder pain, wrist injuries, knee problems. The risk is not the same for every rider. Someone who is 22 and works 4 hours a day on a scooter is in a very different situation from a 45-year-old who works 10 hours a day on a motorbike with a handheld bag.</w:t>
+        <w:t xml:space="preserve">Last-mile quick-commerce delivery riders for platforms like </w:t>
+      </w:r>
+      <w:proofErr w:type="spellStart"/>
+      <w:r>
+        <w:rPr>
+          <w:rFonts w:eastAsia="Times New Roman" w:cs="Times New Roman"/>
+        </w:rPr>
+        <w:t>Blinkit</w:t>
+      </w:r>
+      <w:proofErr w:type="spellEnd"/>
+      <w:r>
+        <w:rPr>
+          <w:rFonts w:eastAsia="Times New Roman" w:cs="Times New Roman"/>
+        </w:rPr>
+        <w:t xml:space="preserve"> and </w:t>
+      </w:r>
+      <w:proofErr w:type="spellStart"/>
+      <w:r>
+        <w:rPr>
+          <w:rFonts w:eastAsia="Times New Roman" w:cs="Times New Roman"/>
+        </w:rPr>
+        <w:t>Zepto</w:t>
+      </w:r>
+      <w:proofErr w:type="spellEnd"/>
+      <w:r>
+        <w:rPr>
+          <w:rFonts w:eastAsia="Times New Roman" w:cs="Times New Roman"/>
+        </w:rPr>
+        <w:t xml:space="preserve"> spend long hours on bikes, climb stairs, carry packages, and ride in heavy traffic. Prior Indian last-mile MSK studies [1, 2] report similar exposure patterns among app-based delivery riders. Over time this kind of work causes musculoskeletal disorders (MSDs): back pain, shoulder pain, wrist injuries, knee problems. The risk is not the same for every rider. Someone who is 22 and works 4 hours a day on a scooter is in a very different situation from a 45-year-old who works 10 hours a day on a motorbike with a handheld bag.</w:t>
       </w:r>
     </w:p>
     <w:p>
@@ -3122,7 +3345,21 @@
         <w:rPr>
           <w:rFonts w:eastAsia="Times New Roman" w:cs="Times New Roman"/>
         </w:rPr>
-        <w:t>The delivery economy in India has grown rapidly in recent years. Quick-commerce riders form a large occupational group with working conditions unlike traditional warehouse or manufacturing labour: long-distance riding, carrying goods in a moving vehicle where the load position cannot be controlled, exposure to bad weather, and constant pressure from platform routing algorithms. No screening tool exists that lets a platform assess a rider on all six standard ergonomic factors from a single questionnaire.</w:t>
+        <w:t xml:space="preserve">The delivery economy in India has grown rapidly in recent years. Quick-commerce riders form a large occupational group with working conditions unlike traditional warehouse or manufacturing </w:t>
+      </w:r>
+      <w:proofErr w:type="spellStart"/>
+      <w:r>
+        <w:rPr>
+          <w:rFonts w:eastAsia="Times New Roman" w:cs="Times New Roman"/>
+        </w:rPr>
+        <w:t>labour</w:t>
+      </w:r>
+      <w:proofErr w:type="spellEnd"/>
+      <w:r>
+        <w:rPr>
+          <w:rFonts w:eastAsia="Times New Roman" w:cs="Times New Roman"/>
+        </w:rPr>
+        <w:t>: long-distance riding, carrying goods in a moving vehicle where the load position cannot be controlled, exposure to bad weather, and constant pressure from platform routing algorithms. No screening tool exists that lets a platform assess a rider on all six standard ergonomic factors from a single questionnaire.</w:t>
       </w:r>
     </w:p>
     <w:p>
@@ -3139,17 +3376,6 @@
         </w:rPr>
         <w:t>By producing a risk profile for each rider, platforms can intervene early: shortening shifts for high-risk riders, reviewing the equipment they use, arranging physiotherapy, and re-screening regularly. Without this approach the risks stay invisible until the rider becomes symptomatic. This project addresses that gap by combining published ergonomic assessment methods with modern classifiers into a single screening pipeline and web application.</w:t>
       </w:r>
-      <w:r>
-        <w:rPr>
-          <w:rFonts w:eastAsia="Times New Roman" w:cs="Times New Roman"/>
-        </w:rPr>
-      </w:r>
-    </w:p>
-    <w:p>
-      <w:pPr>
-        <w:spacing w:after="160" w:line="336" w:lineRule="auto"/>
-        <w:jc w:val="both"/>
-      </w:pPr>
     </w:p>
     <w:p>
       <w:pPr>
@@ -3180,7 +3406,24 @@
         <w:spacing w:after="60"/>
       </w:pPr>
       <w:r>
-        <w:t>Conduct the pipeline reproducibly in Python (Jupyter notebooks, scikit-learn, XGBoost, imbalanced-learn, statsmodels) with an assigned seed and the entire regeneration of the output at every part of the process.</w:t>
+        <w:lastRenderedPageBreak/>
+        <w:t xml:space="preserve">Conduct the pipeline reproducibly in Python (Jupyter notebooks, scikit-learn, </w:t>
+      </w:r>
+      <w:proofErr w:type="spellStart"/>
+      <w:r>
+        <w:t>XGBoost</w:t>
+      </w:r>
+      <w:proofErr w:type="spellEnd"/>
+      <w:r>
+        <w:t xml:space="preserve">, imbalanced-learn, </w:t>
+      </w:r>
+      <w:proofErr w:type="spellStart"/>
+      <w:r>
+        <w:t>statsmodels</w:t>
+      </w:r>
+      <w:proofErr w:type="spellEnd"/>
+      <w:r>
+        <w:t>) with an assigned seed and the entire regeneration of the output at every part of the process.</w:t>
       </w:r>
     </w:p>
     <w:p>
@@ -3189,7 +3432,15 @@
         <w:spacing w:after="60"/>
       </w:pPr>
       <w:r>
-        <w:t>Train and validate 7 potential ML techniques for each of the risk indicators through 5-fold stratified cross-validation, implementing SMOTE oversampling during training using all of the folds, and give out results including the accuracy values, macro F1 and macro AUC.</w:t>
+        <w:t xml:space="preserve">Train and validate 7 potential ML techniques for each of the risk indicators through 5-fold stratified cross-validation, implementing SMOTE oversampling during training using all of the folds, and give out results including the accuracy values, macro F1 and </w:t>
+      </w:r>
+      <w:proofErr w:type="gramStart"/>
+      <w:r>
+        <w:t>macro AUC</w:t>
+      </w:r>
+      <w:proofErr w:type="gramEnd"/>
+      <w:r>
+        <w:t>.</w:t>
       </w:r>
     </w:p>
     <w:p>
@@ -3206,7 +3457,15 @@
         <w:pStyle w:val="ListNumber"/>
       </w:pPr>
       <w:r>
-        <w:t>Deliver the created models as part of a Streamlit web service accepting information from complete and full 36-item questionnaire plus 11 items about RULA and 8 items about QEC and giving out risk measurements for every category according to 6 CTQs.</w:t>
+        <w:t xml:space="preserve">Deliver the created models as part of a </w:t>
+      </w:r>
+      <w:proofErr w:type="spellStart"/>
+      <w:r>
+        <w:t>Streamlit</w:t>
+      </w:r>
+      <w:proofErr w:type="spellEnd"/>
+      <w:r>
+        <w:t xml:space="preserve"> web service accepting information from complete and full 36-item questionnaire plus 11 items about RULA and 8 items about QEC and giving out risk measurements for every category according to 6 CTQs.</w:t>
       </w:r>
     </w:p>
     <w:p>
@@ -3346,7 +3605,35 @@
         <w:rPr>
           <w:rFonts w:eastAsia="Times New Roman" w:cs="Times New Roman"/>
         </w:rPr>
-        <w:t>This is a cross-sectional study of Blinkit and Zepto quick-commerce delivery partners conducted in the Chengalpattu and Chennai regions in March-April 2026 using convenience sampling. The same 182 participants supplied both data streams: rider self-report through a Google Form and posture recorded during a delivery task by a trained observer.</w:t>
+        <w:t xml:space="preserve">This is a cross-sectional study of </w:t>
+      </w:r>
+      <w:proofErr w:type="spellStart"/>
+      <w:r>
+        <w:rPr>
+          <w:rFonts w:eastAsia="Times New Roman" w:cs="Times New Roman"/>
+        </w:rPr>
+        <w:t>Blinkit</w:t>
+      </w:r>
+      <w:proofErr w:type="spellEnd"/>
+      <w:r>
+        <w:rPr>
+          <w:rFonts w:eastAsia="Times New Roman" w:cs="Times New Roman"/>
+        </w:rPr>
+        <w:t xml:space="preserve"> and </w:t>
+      </w:r>
+      <w:proofErr w:type="spellStart"/>
+      <w:r>
+        <w:rPr>
+          <w:rFonts w:eastAsia="Times New Roman" w:cs="Times New Roman"/>
+        </w:rPr>
+        <w:t>Zepto</w:t>
+      </w:r>
+      <w:proofErr w:type="spellEnd"/>
+      <w:r>
+        <w:rPr>
+          <w:rFonts w:eastAsia="Times New Roman" w:cs="Times New Roman"/>
+        </w:rPr>
+        <w:t xml:space="preserve"> quick-commerce delivery partners conducted in the Chengalpattu and Chennai regions in March-April 2026 using convenience sampling. The same 182 participants supplied both data streams: rider self-report through a Google Form and posture recorded during a delivery task by a trained observer.</w:t>
       </w:r>
     </w:p>
     <w:p>
@@ -3372,7 +3659,35 @@
         <w:rPr>
           <w:rFonts w:eastAsia="Times New Roman" w:cs="Times New Roman"/>
         </w:rPr>
-        <w:t>Full-time delivery partners working on either the Blinkit or the Zepto platform.</w:t>
+        <w:t xml:space="preserve">Full-time delivery partners working on either the </w:t>
+      </w:r>
+      <w:proofErr w:type="spellStart"/>
+      <w:r>
+        <w:rPr>
+          <w:rFonts w:eastAsia="Times New Roman" w:cs="Times New Roman"/>
+        </w:rPr>
+        <w:t>Blinkit</w:t>
+      </w:r>
+      <w:proofErr w:type="spellEnd"/>
+      <w:r>
+        <w:rPr>
+          <w:rFonts w:eastAsia="Times New Roman" w:cs="Times New Roman"/>
+        </w:rPr>
+        <w:t xml:space="preserve"> or the </w:t>
+      </w:r>
+      <w:proofErr w:type="spellStart"/>
+      <w:r>
+        <w:rPr>
+          <w:rFonts w:eastAsia="Times New Roman" w:cs="Times New Roman"/>
+        </w:rPr>
+        <w:t>Zepto</w:t>
+      </w:r>
+      <w:proofErr w:type="spellEnd"/>
+      <w:r>
+        <w:rPr>
+          <w:rFonts w:eastAsia="Times New Roman" w:cs="Times New Roman"/>
+        </w:rPr>
+        <w:t xml:space="preserve"> platform.</w:t>
       </w:r>
     </w:p>
     <w:p>
@@ -3457,14 +3772,12 @@
       <w:pPr>
         <w:spacing w:before="180" w:after="60"/>
         <w:rPr>
-          <w:rFonts w:ascii="Times New Roman" w:eastAsia="Times New Roman" w:hAnsi="Times New Roman" w:cs="Times New Roman"/>
-          <w:color w:val="auto"/>
-        </w:rPr>
-      </w:pPr>
-      <w:r>
-        <w:rPr>
-          <w:rFonts w:ascii="Times New Roman" w:eastAsia="Times New Roman" w:hAnsi="Times New Roman" w:cs="Times New Roman"/>
-          <w:color w:val="auto"/>
+          <w:rFonts w:eastAsia="Times New Roman" w:cs="Times New Roman"/>
+        </w:rPr>
+      </w:pPr>
+      <w:r>
+        <w:rPr>
+          <w:rFonts w:eastAsia="Times New Roman" w:cs="Times New Roman"/>
         </w:rPr>
         <w:t>The dataset delivery_rider_survey.csv contains the 182 responses to the 36-item questionnaire: demographics and work pattern, NMQ 12-month pain (nine body areas), 7-day discomfort restricted to four high-load rider areas (neck, lower back, wrist / hands, knees) as a space-saving modification of the standard NMQ, five discomfort follow-ups, six NASA-TLX items (0 to 100), and six Borg CR10 items (0 to 10).</w:t>
       </w:r>
@@ -3488,22 +3801,12 @@
       <w:pPr>
         <w:spacing w:before="280" w:after="100"/>
         <w:rPr>
-          <w:rFonts w:ascii="Times New Roman" w:eastAsia="Times New Roman" w:hAnsi="Times New Roman" w:cs="Times New Roman"/>
-          <w:b w:val="0"/>
-          <w:bCs w:val="0"/>
-          <w:i w:val="0"/>
-          <w:iCs w:val="0"/>
-          <w:color w:val="auto"/>
-        </w:rPr>
-      </w:pPr>
-      <w:r>
-        <w:rPr>
-          <w:rFonts w:ascii="Times New Roman" w:eastAsia="Times New Roman" w:hAnsi="Times New Roman" w:cs="Times New Roman"/>
-          <w:b w:val="0"/>
-          <w:bCs w:val="0"/>
-          <w:i w:val="0"/>
-          <w:iCs w:val="0"/>
-          <w:color w:val="auto"/>
+          <w:rFonts w:eastAsia="Times New Roman" w:cs="Times New Roman"/>
+        </w:rPr>
+      </w:pPr>
+      <w:r>
+        <w:rPr>
+          <w:rFonts w:eastAsia="Times New Roman" w:cs="Times New Roman"/>
         </w:rPr>
         <w:t>The dataset posture_data.xlsx holds 182 observation records, each carrying the 11 RULA components, 3 RULA Table scores, and 8 QEC scores. The rows lack rider identifiers; pairing to the survey uses the severity-rank merge described in §2.3.</w:t>
       </w:r>
@@ -3531,7 +3834,133 @@
         <w:rPr>
           <w:rFonts w:eastAsia="Times New Roman" w:cs="Times New Roman"/>
         </w:rPr>
-        <w:t>Phase 1 (01_data_cleaning.ipynb) normalises the raw CSV, standardises Yes/No answers, and validates row counts. Phase 2 (02_feature_engineering.ipynb) encodes ordered categorical bins to integers, assigns numeric midpoints to bin ranges, ranks vehicle type and carrying mode, aliases the 18 Yes/No items, and derives four composite features -- workload_score (mean of the six NASA-TLX items with satisfaction reversed), fatigue_score (mean of the six Borg CR10 items), force_exertion (the Borg lifting item), and vibration_index (vehicle_rank x work_hours_num) -- plus five product-form interactions so tree-based models can pick up combined effects.</w:t>
+        <w:t>Phase 1 (01_data_</w:t>
+      </w:r>
+      <w:proofErr w:type="gramStart"/>
+      <w:r>
+        <w:rPr>
+          <w:rFonts w:eastAsia="Times New Roman" w:cs="Times New Roman"/>
+        </w:rPr>
+        <w:t>cleaning.ipynb</w:t>
+      </w:r>
+      <w:proofErr w:type="gramEnd"/>
+      <w:r>
+        <w:rPr>
+          <w:rFonts w:eastAsia="Times New Roman" w:cs="Times New Roman"/>
+        </w:rPr>
+        <w:t xml:space="preserve">) </w:t>
+      </w:r>
+      <w:proofErr w:type="spellStart"/>
+      <w:r>
+        <w:rPr>
+          <w:rFonts w:eastAsia="Times New Roman" w:cs="Times New Roman"/>
+        </w:rPr>
+        <w:t>normalises</w:t>
+      </w:r>
+      <w:proofErr w:type="spellEnd"/>
+      <w:r>
+        <w:rPr>
+          <w:rFonts w:eastAsia="Times New Roman" w:cs="Times New Roman"/>
+        </w:rPr>
+        <w:t xml:space="preserve"> the raw CSV, </w:t>
+      </w:r>
+      <w:proofErr w:type="spellStart"/>
+      <w:r>
+        <w:rPr>
+          <w:rFonts w:eastAsia="Times New Roman" w:cs="Times New Roman"/>
+        </w:rPr>
+        <w:t>standardises</w:t>
+      </w:r>
+      <w:proofErr w:type="spellEnd"/>
+      <w:r>
+        <w:rPr>
+          <w:rFonts w:eastAsia="Times New Roman" w:cs="Times New Roman"/>
+        </w:rPr>
+        <w:t xml:space="preserve"> Yes/No answers, and validates row counts. Phase 2 (02_feature_engineering.ipynb) encodes ordered categorical bins to integers, assigns numeric midpoints to bin ranges, ranks vehicle type and carrying mode, aliases the 18 Yes/No items, and derives four composite features -- </w:t>
+      </w:r>
+      <w:proofErr w:type="spellStart"/>
+      <w:r>
+        <w:rPr>
+          <w:rFonts w:eastAsia="Times New Roman" w:cs="Times New Roman"/>
+        </w:rPr>
+        <w:t>workload_score</w:t>
+      </w:r>
+      <w:proofErr w:type="spellEnd"/>
+      <w:r>
+        <w:rPr>
+          <w:rFonts w:eastAsia="Times New Roman" w:cs="Times New Roman"/>
+        </w:rPr>
+        <w:t xml:space="preserve"> (mean of the six NASA-TLX items with satisfaction reversed), </w:t>
+      </w:r>
+      <w:proofErr w:type="spellStart"/>
+      <w:r>
+        <w:rPr>
+          <w:rFonts w:eastAsia="Times New Roman" w:cs="Times New Roman"/>
+        </w:rPr>
+        <w:t>fatigue_score</w:t>
+      </w:r>
+      <w:proofErr w:type="spellEnd"/>
+      <w:r>
+        <w:rPr>
+          <w:rFonts w:eastAsia="Times New Roman" w:cs="Times New Roman"/>
+        </w:rPr>
+        <w:t xml:space="preserve"> (mean of the six Borg CR10 items), </w:t>
+      </w:r>
+      <w:proofErr w:type="spellStart"/>
+      <w:r>
+        <w:rPr>
+          <w:rFonts w:eastAsia="Times New Roman" w:cs="Times New Roman"/>
+        </w:rPr>
+        <w:t>force_exertion</w:t>
+      </w:r>
+      <w:proofErr w:type="spellEnd"/>
+      <w:r>
+        <w:rPr>
+          <w:rFonts w:eastAsia="Times New Roman" w:cs="Times New Roman"/>
+        </w:rPr>
+        <w:t xml:space="preserve"> (the Borg lifting item), and </w:t>
+      </w:r>
+      <w:proofErr w:type="spellStart"/>
+      <w:r>
+        <w:rPr>
+          <w:rFonts w:eastAsia="Times New Roman" w:cs="Times New Roman"/>
+        </w:rPr>
+        <w:t>vibration_index</w:t>
+      </w:r>
+      <w:proofErr w:type="spellEnd"/>
+      <w:r>
+        <w:rPr>
+          <w:rFonts w:eastAsia="Times New Roman" w:cs="Times New Roman"/>
+        </w:rPr>
+        <w:t xml:space="preserve"> (</w:t>
+      </w:r>
+      <w:proofErr w:type="spellStart"/>
+      <w:r>
+        <w:rPr>
+          <w:rFonts w:eastAsia="Times New Roman" w:cs="Times New Roman"/>
+        </w:rPr>
+        <w:t>vehicle_rank</w:t>
+      </w:r>
+      <w:proofErr w:type="spellEnd"/>
+      <w:r>
+        <w:rPr>
+          <w:rFonts w:eastAsia="Times New Roman" w:cs="Times New Roman"/>
+        </w:rPr>
+        <w:t xml:space="preserve"> x </w:t>
+      </w:r>
+      <w:proofErr w:type="spellStart"/>
+      <w:r>
+        <w:rPr>
+          <w:rFonts w:eastAsia="Times New Roman" w:cs="Times New Roman"/>
+        </w:rPr>
+        <w:t>work_hours_num</w:t>
+      </w:r>
+      <w:proofErr w:type="spellEnd"/>
+      <w:r>
+        <w:rPr>
+          <w:rFonts w:eastAsia="Times New Roman" w:cs="Times New Roman"/>
+        </w:rPr>
+        <w:t>) -- plus five product-form interactions so tree-based models can pick up combined effects.</w:t>
       </w:r>
     </w:p>
     <w:p>
@@ -3543,7 +3972,35 @@
         <w:rPr>
           <w:rFonts w:eastAsia="Times New Roman" w:cs="Times New Roman"/>
         </w:rPr>
-        <w:t>The posture observations are merged into the survey via a severity-rank merge: riders are ranked by an exposure_severity index (normalised NMQ pain count + fatigue score + hours), posture rows by RULA Table C, and the two ranked lists are joined one-to-one. Caveats are noted in Chapter 5.</w:t>
+        <w:t xml:space="preserve">The posture observations are merged into the survey via a severity-rank merge: riders are ranked by an </w:t>
+      </w:r>
+      <w:proofErr w:type="spellStart"/>
+      <w:r>
+        <w:rPr>
+          <w:rFonts w:eastAsia="Times New Roman" w:cs="Times New Roman"/>
+        </w:rPr>
+        <w:t>exposure_severity</w:t>
+      </w:r>
+      <w:proofErr w:type="spellEnd"/>
+      <w:r>
+        <w:rPr>
+          <w:rFonts w:eastAsia="Times New Roman" w:cs="Times New Roman"/>
+        </w:rPr>
+        <w:t xml:space="preserve"> index (</w:t>
+      </w:r>
+      <w:proofErr w:type="spellStart"/>
+      <w:r>
+        <w:rPr>
+          <w:rFonts w:eastAsia="Times New Roman" w:cs="Times New Roman"/>
+        </w:rPr>
+        <w:t>normalised</w:t>
+      </w:r>
+      <w:proofErr w:type="spellEnd"/>
+      <w:r>
+        <w:rPr>
+          <w:rFonts w:eastAsia="Times New Roman" w:cs="Times New Roman"/>
+        </w:rPr>
+        <w:t xml:space="preserve"> NMQ pain count + fatigue score + hours), posture rows by RULA Table C, and the two ranked lists are joined one-to-one. Caveats are noted in Chapter 5.</w:t>
       </w:r>
     </w:p>
     <w:p>
@@ -3569,7 +4026,21 @@
         <w:rPr>
           <w:rFonts w:eastAsia="Times New Roman" w:cs="Times New Roman"/>
         </w:rPr>
-        <w:t>Phase 3 (03_risk_scoring.ipynb) applies the following rules and writes risk_profile.csv:</w:t>
+        <w:t>Phase 3 (03_risk_</w:t>
+      </w:r>
+      <w:proofErr w:type="gramStart"/>
+      <w:r>
+        <w:rPr>
+          <w:rFonts w:eastAsia="Times New Roman" w:cs="Times New Roman"/>
+        </w:rPr>
+        <w:t>scoring.ipynb</w:t>
+      </w:r>
+      <w:proofErr w:type="gramEnd"/>
+      <w:r>
+        <w:rPr>
+          <w:rFonts w:eastAsia="Times New Roman" w:cs="Times New Roman"/>
+        </w:rPr>
+        <w:t>) applies the following rules and writes risk_profile.csv:</w:t>
       </w:r>
     </w:p>
     <w:p>
@@ -3617,7 +4088,21 @@
         <w:rPr>
           <w:rFonts w:eastAsia="Times New Roman" w:cs="Times New Roman"/>
         </w:rPr>
-        <w:t>Vibration: vibration_index binned by sample tercile.</w:t>
+        <w:t xml:space="preserve">Vibration: </w:t>
+      </w:r>
+      <w:proofErr w:type="spellStart"/>
+      <w:r>
+        <w:rPr>
+          <w:rFonts w:eastAsia="Times New Roman" w:cs="Times New Roman"/>
+        </w:rPr>
+        <w:t>vibration_index</w:t>
+      </w:r>
+      <w:proofErr w:type="spellEnd"/>
+      <w:r>
+        <w:rPr>
+          <w:rFonts w:eastAsia="Times New Roman" w:cs="Times New Roman"/>
+        </w:rPr>
+        <w:t xml:space="preserve"> binned by sample tercile.</w:t>
       </w:r>
     </w:p>
     <w:p>
@@ -3629,7 +4114,35 @@
         <w:rPr>
           <w:rFonts w:eastAsia="Times New Roman" w:cs="Times New Roman"/>
         </w:rPr>
-        <w:t>Contact Stress: carrying_contact_rank x work_hours_num x age multiplier, sample tercile.</w:t>
+        <w:t xml:space="preserve">Contact Stress: </w:t>
+      </w:r>
+      <w:proofErr w:type="spellStart"/>
+      <w:r>
+        <w:rPr>
+          <w:rFonts w:eastAsia="Times New Roman" w:cs="Times New Roman"/>
+        </w:rPr>
+        <w:t>carrying_contact_rank</w:t>
+      </w:r>
+      <w:proofErr w:type="spellEnd"/>
+      <w:r>
+        <w:rPr>
+          <w:rFonts w:eastAsia="Times New Roman" w:cs="Times New Roman"/>
+        </w:rPr>
+        <w:t xml:space="preserve"> x </w:t>
+      </w:r>
+      <w:proofErr w:type="spellStart"/>
+      <w:r>
+        <w:rPr>
+          <w:rFonts w:eastAsia="Times New Roman" w:cs="Times New Roman"/>
+        </w:rPr>
+        <w:t>work_hours_num</w:t>
+      </w:r>
+      <w:proofErr w:type="spellEnd"/>
+      <w:r>
+        <w:rPr>
+          <w:rFonts w:eastAsia="Times New Roman" w:cs="Times New Roman"/>
+        </w:rPr>
+        <w:t xml:space="preserve"> x age multiplier, sample tercile.</w:t>
       </w:r>
     </w:p>
     <w:p>
@@ -3663,48 +4176,90 @@
       <w:pPr>
         <w:spacing w:before="280" w:after="100"/>
         <w:rPr>
-          <w:rFonts w:ascii="Times New Roman" w:eastAsia="Times New Roman" w:hAnsi="Times New Roman" w:cs="Times New Roman"/>
-          <w:b w:val="0"/>
-          <w:bCs w:val="0"/>
-          <w:i w:val="0"/>
-          <w:iCs w:val="0"/>
+          <w:rFonts w:eastAsia="Times New Roman" w:cs="Times New Roman"/>
           <w:color w:val="000000" w:themeColor="text1"/>
         </w:rPr>
       </w:pPr>
       <w:r>
         <w:rPr>
-          <w:rFonts w:ascii="Times New Roman" w:hAnsi="Times New Roman" w:cs="Times New Roman"/>
-          <w:b w:val="0"/>
-          <w:bCs w:val="0"/>
-          <w:i w:val="0"/>
-          <w:iCs w:val="0"/>
+          <w:rFonts w:cs="Times New Roman"/>
           <w:color w:val="000000" w:themeColor="text1"/>
         </w:rPr>
-        <w:t>Phase 4 (04_eda.ipynb) then produces demographic breakdowns, per-factor risk-band distributions, Nordic 12-month discomfort prevalence, discomfort rates split by demographic and by risk level, and a Pearson correlation heatmap on 15 columns (14 numeric and ordinal features plus the discomfort outcome).</w:t>
+        <w:t>Phase 4 (04_</w:t>
+      </w:r>
+      <w:proofErr w:type="gramStart"/>
+      <w:r>
+        <w:rPr>
+          <w:rFonts w:cs="Times New Roman"/>
+          <w:color w:val="000000" w:themeColor="text1"/>
+        </w:rPr>
+        <w:t>eda.ipynb</w:t>
+      </w:r>
+      <w:proofErr w:type="gramEnd"/>
+      <w:r>
+        <w:rPr>
+          <w:rFonts w:cs="Times New Roman"/>
+          <w:color w:val="000000" w:themeColor="text1"/>
+        </w:rPr>
+        <w:t>) then produces demographic breakdowns, per-factor risk-band distributions, Nordic 12-month discomfort prevalence, discomfort rates split by demographic and by risk level, and a Pearson correlation heatmap on 15 columns (14 numeric and ordinal features plus the discomfort outcome).</w:t>
       </w:r>
     </w:p>
     <w:p>
       <w:pPr>
         <w:spacing w:before="280" w:after="100"/>
         <w:rPr>
-          <w:rFonts w:ascii="Times New Roman" w:eastAsia="Times New Roman" w:hAnsi="Times New Roman" w:cs="Times New Roman"/>
-          <w:b w:val="0"/>
-          <w:bCs w:val="0"/>
-          <w:i w:val="0"/>
-          <w:iCs w:val="0"/>
-          <w:color w:val="auto"/>
-        </w:rPr>
-      </w:pPr>
-      <w:r>
-        <w:rPr>
-          <w:rFonts w:ascii="Times New Roman" w:eastAsia="Times New Roman" w:hAnsi="Times New Roman" w:cs="Times New Roman"/>
-          <w:b w:val="0"/>
-          <w:bCs w:val="0"/>
-          <w:i w:val="0"/>
-          <w:iCs w:val="0"/>
-          <w:color w:val="auto"/>
-        </w:rPr>
-        <w:t>Phase 5 (05_stats.ipynb) comprises two analyses on discomfort i.e. the binary: pain as per NMQ for 12 months. Chi-square test (scipy.stats.chi2_contingency) is performed to see if a given risk factor is connected with discomfort at a significance level of 5%. Then multivariate logistic regression (statsmodels.api.Logit) is conducted to look at the weight of 11 determinants at a time, controlling all the others with the results displayed in odds ratios at 95% confidence intervals.</w:t>
+          <w:rFonts w:eastAsia="Times New Roman" w:cs="Times New Roman"/>
+        </w:rPr>
+      </w:pPr>
+      <w:r>
+        <w:rPr>
+          <w:rFonts w:eastAsia="Times New Roman" w:cs="Times New Roman"/>
+        </w:rPr>
+        <w:t>Phase 5 (05_</w:t>
+      </w:r>
+      <w:proofErr w:type="gramStart"/>
+      <w:r>
+        <w:rPr>
+          <w:rFonts w:eastAsia="Times New Roman" w:cs="Times New Roman"/>
+        </w:rPr>
+        <w:t>stats.ipynb</w:t>
+      </w:r>
+      <w:proofErr w:type="gramEnd"/>
+      <w:r>
+        <w:rPr>
+          <w:rFonts w:eastAsia="Times New Roman" w:cs="Times New Roman"/>
+        </w:rPr>
+        <w:t>) comprises two analyses on discomfort i.e. the binary: pain as per NMQ for 12 months. Chi-square test (</w:t>
+      </w:r>
+      <w:proofErr w:type="gramStart"/>
+      <w:r>
+        <w:rPr>
+          <w:rFonts w:eastAsia="Times New Roman" w:cs="Times New Roman"/>
+        </w:rPr>
+        <w:t>scipy.stats</w:t>
+      </w:r>
+      <w:proofErr w:type="gramEnd"/>
+      <w:r>
+        <w:rPr>
+          <w:rFonts w:eastAsia="Times New Roman" w:cs="Times New Roman"/>
+        </w:rPr>
+        <w:t>.chi2_contingency) is performed to see if a given risk factor is connected with discomfort at a significance level of 5%. Then multivariate logistic regression (</w:t>
+      </w:r>
+      <w:proofErr w:type="spellStart"/>
+      <w:proofErr w:type="gramStart"/>
+      <w:r>
+        <w:rPr>
+          <w:rFonts w:eastAsia="Times New Roman" w:cs="Times New Roman"/>
+        </w:rPr>
+        <w:t>statsmodels.api.Logit</w:t>
+      </w:r>
+      <w:proofErr w:type="spellEnd"/>
+      <w:proofErr w:type="gramEnd"/>
+      <w:r>
+        <w:rPr>
+          <w:rFonts w:eastAsia="Times New Roman" w:cs="Times New Roman"/>
+        </w:rPr>
+        <w:t>) is conducted to look at the weight of 11 determinants at a time, controlling all the others with the results displayed in odds ratios at 95% confidence intervals.</w:t>
       </w:r>
     </w:p>
     <w:p>
@@ -3725,16 +4280,64 @@
       <w:pPr>
         <w:spacing w:before="180" w:after="60"/>
         <w:rPr>
-          <w:rFonts w:ascii="Times New Roman" w:eastAsia="Times New Roman" w:hAnsi="Times New Roman" w:cs="Times New Roman"/>
-          <w:color w:val="auto"/>
-        </w:rPr>
-      </w:pPr>
-      <w:r>
-        <w:rPr>
-          <w:rFonts w:ascii="Times New Roman" w:eastAsia="Times New Roman" w:hAnsi="Times New Roman" w:cs="Times New Roman"/>
-          <w:color w:val="auto"/>
-        </w:rPr>
-        <w:t>Phase 6 (06_modeling.ipynb) trains a classifier per target from seven candidate algorithms. GridSearchCV tunes hyperparameters on macro-F1 inside 5-fold stratified cross-validation, and the best model per target is refit on the full sample and saved as outputs/models/best_&lt;factor&gt;.pkl.</w:t>
+          <w:rFonts w:eastAsia="Times New Roman" w:cs="Times New Roman"/>
+        </w:rPr>
+      </w:pPr>
+      <w:r>
+        <w:rPr>
+          <w:rFonts w:eastAsia="Times New Roman" w:cs="Times New Roman"/>
+        </w:rPr>
+        <w:t>Phase 6 (06_</w:t>
+      </w:r>
+      <w:proofErr w:type="gramStart"/>
+      <w:r>
+        <w:rPr>
+          <w:rFonts w:eastAsia="Times New Roman" w:cs="Times New Roman"/>
+        </w:rPr>
+        <w:t>modeling.ipynb</w:t>
+      </w:r>
+      <w:proofErr w:type="gramEnd"/>
+      <w:r>
+        <w:rPr>
+          <w:rFonts w:eastAsia="Times New Roman" w:cs="Times New Roman"/>
+        </w:rPr>
+        <w:t xml:space="preserve">) trains a classifier per target from seven candidate algorithms. </w:t>
+      </w:r>
+      <w:proofErr w:type="spellStart"/>
+      <w:r>
+        <w:rPr>
+          <w:rFonts w:eastAsia="Times New Roman" w:cs="Times New Roman"/>
+        </w:rPr>
+        <w:t>GridSearchCV</w:t>
+      </w:r>
+      <w:proofErr w:type="spellEnd"/>
+      <w:r>
+        <w:rPr>
+          <w:rFonts w:eastAsia="Times New Roman" w:cs="Times New Roman"/>
+        </w:rPr>
+        <w:t xml:space="preserve"> tunes hyperparameters on macro-F1 inside 5-fold stratified cross-validation, and the best model per target is refit on the full sample and saved as outputs/models/best_&lt;factor</w:t>
+      </w:r>
+      <w:proofErr w:type="gramStart"/>
+      <w:r>
+        <w:rPr>
+          <w:rFonts w:eastAsia="Times New Roman" w:cs="Times New Roman"/>
+        </w:rPr>
+        <w:t>&gt;.</w:t>
+      </w:r>
+      <w:proofErr w:type="spellStart"/>
+      <w:r>
+        <w:rPr>
+          <w:rFonts w:eastAsia="Times New Roman" w:cs="Times New Roman"/>
+        </w:rPr>
+        <w:t>pkl</w:t>
+      </w:r>
+      <w:proofErr w:type="spellEnd"/>
+      <w:proofErr w:type="gramEnd"/>
+      <w:r>
+        <w:rPr>
+          <w:rFonts w:eastAsia="Times New Roman" w:cs="Times New Roman"/>
+        </w:rPr>
+        <w:t>.</w:t>
       </w:r>
     </w:p>
     <w:p>
@@ -3764,7 +4367,27 @@
         <w:rPr>
           <w:rFonts w:eastAsia="Times New Roman" w:cs="Times New Roman"/>
         </w:rPr>
-        <w:t>Regularised linear classifier used as the baseline (L2 penalty, class_weight balanced). Any tree-based method that fails to beat it on a factor is either overfitting or getting nothing from feature interactions.</w:t>
+        <w:t>Regularized</w:t>
+      </w:r>
+      <w:r>
+        <w:rPr>
+          <w:rFonts w:eastAsia="Times New Roman" w:cs="Times New Roman"/>
+        </w:rPr>
+        <w:t xml:space="preserve"> linear classifier used as the baseline (L2 penalty, </w:t>
+      </w:r>
+      <w:proofErr w:type="spellStart"/>
+      <w:r>
+        <w:rPr>
+          <w:rFonts w:eastAsia="Times New Roman" w:cs="Times New Roman"/>
+        </w:rPr>
+        <w:t>class_weight</w:t>
+      </w:r>
+      <w:proofErr w:type="spellEnd"/>
+      <w:r>
+        <w:rPr>
+          <w:rFonts w:eastAsia="Times New Roman" w:cs="Times New Roman"/>
+        </w:rPr>
+        <w:t xml:space="preserve"> balanced). Any tree-based method that fails to beat it on a factor is either overfitting or getting nothing from feature interactions.</w:t>
       </w:r>
     </w:p>
     <w:p>
@@ -3800,7 +4423,41 @@
         <w:rPr>
           <w:rFonts w:eastAsia="Times New Roman" w:cs="Times New Roman"/>
         </w:rPr>
-        <w:t>Utilised a single CART tree where max_depth ranged from 3 to 7, and min_samples_leaf varied from 1 to 5 for fine-tuning using grid search.</w:t>
+        <w:t>Utilized</w:t>
+      </w:r>
+      <w:r>
+        <w:rPr>
+          <w:rFonts w:eastAsia="Times New Roman" w:cs="Times New Roman"/>
+        </w:rPr>
+        <w:t xml:space="preserve"> a single CART tree where </w:t>
+      </w:r>
+      <w:proofErr w:type="spellStart"/>
+      <w:r>
+        <w:rPr>
+          <w:rFonts w:eastAsia="Times New Roman" w:cs="Times New Roman"/>
+        </w:rPr>
+        <w:t>max_depth</w:t>
+      </w:r>
+      <w:proofErr w:type="spellEnd"/>
+      <w:r>
+        <w:rPr>
+          <w:rFonts w:eastAsia="Times New Roman" w:cs="Times New Roman"/>
+        </w:rPr>
+        <w:t xml:space="preserve"> ranged from 3 to 7, and </w:t>
+      </w:r>
+      <w:proofErr w:type="spellStart"/>
+      <w:r>
+        <w:rPr>
+          <w:rFonts w:eastAsia="Times New Roman" w:cs="Times New Roman"/>
+        </w:rPr>
+        <w:t>min_samples_leaf</w:t>
+      </w:r>
+      <w:proofErr w:type="spellEnd"/>
+      <w:r>
+        <w:rPr>
+          <w:rFonts w:eastAsia="Times New Roman" w:cs="Times New Roman"/>
+        </w:rPr>
+        <w:t xml:space="preserve"> varied from 1 to 5 for fine-tuning using grid search.</w:t>
       </w:r>
     </w:p>
     <w:p>
@@ -3872,17 +4529,21 @@
         <w:rPr>
           <w:rFonts w:eastAsia="Times New Roman" w:cs="Times New Roman"/>
         </w:rPr>
-        <w:t>Like Random Forest but with fully random splits per node. The extra randomisation lowers between-tree correlation and helped it win on Vibration.</w:t>
-      </w:r>
-      <w:r>
-        <w:rPr>
-          <w:rFonts w:eastAsia="Times New Roman" w:cs="Times New Roman"/>
-        </w:rPr>
-      </w:r>
-      <w:r>
-        <w:rPr>
-          <w:rFonts w:eastAsia="Times New Roman" w:cs="Times New Roman"/>
-        </w:rPr>
+        <w:t xml:space="preserve">Like Random Forest but with fully random splits per node. The extra </w:t>
+      </w:r>
+      <w:proofErr w:type="spellStart"/>
+      <w:r>
+        <w:rPr>
+          <w:rFonts w:eastAsia="Times New Roman" w:cs="Times New Roman"/>
+        </w:rPr>
+        <w:t>randomisation</w:t>
+      </w:r>
+      <w:proofErr w:type="spellEnd"/>
+      <w:r>
+        <w:rPr>
+          <w:rFonts w:eastAsia="Times New Roman" w:cs="Times New Roman"/>
+        </w:rPr>
+        <w:t xml:space="preserve"> lowers between-tree correlation and helped it win on Vibration.</w:t>
       </w:r>
     </w:p>
     <w:p>
@@ -3937,30 +4598,9 @@
           <w:sz w:val="24"/>
         </w:rPr>
         <w:lastRenderedPageBreak/>
-        <w:t>2.6.6   XGBoost</w:t>
-      </w:r>
-    </w:p>
-    <w:p>
-      <w:pPr>
-        <w:spacing w:before="180" w:after="60"/>
-        <w:rPr>
-          <w:rFonts w:ascii="Times New Roman" w:eastAsia="Times New Roman" w:hAnsi="Times New Roman" w:cs="Times New Roman"/>
-          <w:color w:val="auto"/>
-        </w:rPr>
-      </w:pPr>
-      <w:r>
-        <w:rPr>
-          <w:rFonts w:ascii="Times New Roman" w:eastAsia="Times New Roman" w:hAnsi="Times New Roman" w:cs="Times New Roman"/>
-          <w:color w:val="auto"/>
-        </w:rPr>
-        <w:t>Gradient-boosted trees with L2 regularisation on the leaf weights. Placed second on Duration and Contact Stress but did not win any at the default search budget.</w:t>
-      </w:r>
-    </w:p>
-    <w:p>
-      <w:pPr>
-        <w:pStyle w:val="Heading5"/>
-        <w:spacing w:before="180" w:after="60"/>
-      </w:pPr>
+        <w:t xml:space="preserve">2.6.6   </w:t>
+      </w:r>
+      <w:proofErr w:type="spellStart"/>
       <w:r>
         <w:rPr>
           <w:rFonts w:ascii="Times New Roman" w:eastAsia="Times New Roman" w:hAnsi="Times New Roman" w:cs="Times New Roman"/>
@@ -3968,23 +4608,36 @@
           <w:color w:val="000000"/>
           <w:sz w:val="24"/>
         </w:rPr>
-        <w:t>2.6.7   Stacking Classifier</w:t>
-      </w:r>
+        <w:t>XGBoost</w:t>
+      </w:r>
+      <w:proofErr w:type="spellEnd"/>
     </w:p>
     <w:p>
       <w:pPr>
         <w:spacing w:before="180" w:after="60"/>
         <w:rPr>
-          <w:rFonts w:ascii="Times New Roman" w:eastAsia="Times New Roman" w:hAnsi="Times New Roman" w:cs="Times New Roman"/>
-          <w:color w:val="auto"/>
-        </w:rPr>
-      </w:pPr>
-      <w:r>
-        <w:rPr>
-          <w:rFonts w:ascii="Times New Roman" w:eastAsia="Times New Roman" w:hAnsi="Times New Roman" w:cs="Times New Roman"/>
-          <w:color w:val="auto"/>
-        </w:rPr>
-        <w:t>Meta-learner (Logistic Regression) trained on the out-of-fold predictions of Random Forest, Extra Trees, HistGBM, and XGBoost as base learners. Failed to strictly outperform the strongest base learner on any of the six targets.</w:t>
+          <w:rFonts w:eastAsia="Times New Roman" w:cs="Times New Roman"/>
+        </w:rPr>
+      </w:pPr>
+      <w:r>
+        <w:rPr>
+          <w:rFonts w:eastAsia="Times New Roman" w:cs="Times New Roman"/>
+        </w:rPr>
+        <w:t xml:space="preserve">Gradient-boosted trees with L2 </w:t>
+      </w:r>
+      <w:proofErr w:type="spellStart"/>
+      <w:r>
+        <w:rPr>
+          <w:rFonts w:eastAsia="Times New Roman" w:cs="Times New Roman"/>
+        </w:rPr>
+        <w:t>regularisation</w:t>
+      </w:r>
+      <w:proofErr w:type="spellEnd"/>
+      <w:r>
+        <w:rPr>
+          <w:rFonts w:eastAsia="Times New Roman" w:cs="Times New Roman"/>
+        </w:rPr>
+        <w:t xml:space="preserve"> on the leaf weights. Placed second on Duration and Contact Stress but did not win any at the default search budget.</w:t>
       </w:r>
     </w:p>
     <w:p>
@@ -3999,6 +4652,63 @@
           <w:color w:val="000000"/>
           <w:sz w:val="24"/>
         </w:rPr>
+        <w:t>2.6.7   Stacking Classifier</w:t>
+      </w:r>
+    </w:p>
+    <w:p>
+      <w:pPr>
+        <w:spacing w:before="180" w:after="60"/>
+        <w:rPr>
+          <w:rFonts w:eastAsia="Times New Roman" w:cs="Times New Roman"/>
+        </w:rPr>
+      </w:pPr>
+      <w:r>
+        <w:rPr>
+          <w:rFonts w:eastAsia="Times New Roman" w:cs="Times New Roman"/>
+        </w:rPr>
+        <w:t xml:space="preserve">Meta-learner (Logistic Regression) trained on the out-of-fold predictions of Random Forest, Extra Trees, </w:t>
+      </w:r>
+      <w:proofErr w:type="spellStart"/>
+      <w:r>
+        <w:rPr>
+          <w:rFonts w:eastAsia="Times New Roman" w:cs="Times New Roman"/>
+        </w:rPr>
+        <w:t>HistGBM</w:t>
+      </w:r>
+      <w:proofErr w:type="spellEnd"/>
+      <w:r>
+        <w:rPr>
+          <w:rFonts w:eastAsia="Times New Roman" w:cs="Times New Roman"/>
+        </w:rPr>
+        <w:t xml:space="preserve">, and </w:t>
+      </w:r>
+      <w:proofErr w:type="spellStart"/>
+      <w:r>
+        <w:rPr>
+          <w:rFonts w:eastAsia="Times New Roman" w:cs="Times New Roman"/>
+        </w:rPr>
+        <w:t>XGBoost</w:t>
+      </w:r>
+      <w:proofErr w:type="spellEnd"/>
+      <w:r>
+        <w:rPr>
+          <w:rFonts w:eastAsia="Times New Roman" w:cs="Times New Roman"/>
+        </w:rPr>
+        <w:t xml:space="preserve"> as base learners. Failed to strictly outperform the strongest base learner on any of the six targets.</w:t>
+      </w:r>
+    </w:p>
+    <w:p>
+      <w:pPr>
+        <w:pStyle w:val="Heading5"/>
+        <w:spacing w:before="180" w:after="60"/>
+      </w:pPr>
+      <w:r>
+        <w:rPr>
+          <w:rFonts w:ascii="Times New Roman" w:eastAsia="Times New Roman" w:hAnsi="Times New Roman" w:cs="Times New Roman"/>
+          <w:b/>
+          <w:color w:val="000000"/>
+          <w:sz w:val="24"/>
+        </w:rPr>
         <w:t>2.6.8   SMOTE and cross-validation</w:t>
       </w:r>
     </w:p>
@@ -4006,16 +4716,108 @@
       <w:pPr>
         <w:spacing w:before="180" w:after="60"/>
         <w:rPr>
-          <w:rFonts w:ascii="Times New Roman" w:eastAsia="Times New Roman" w:hAnsi="Times New Roman" w:cs="Times New Roman"/>
-          <w:color w:val="auto"/>
-        </w:rPr>
-      </w:pPr>
-      <w:r>
-        <w:rPr>
-          <w:rFonts w:ascii="Times New Roman" w:eastAsia="Times New Roman" w:hAnsi="Times New Roman" w:cs="Times New Roman"/>
-          <w:color w:val="auto"/>
-        </w:rPr>
-        <w:t>SMOTE synthesises new minority-class samples along segments between k nearest minority neighbours. Wrapping it in imblearn.Pipeline keeps the synthesis inside training folds only, so validation-fold accuracy is never inflated. GridSearchCV picks hyperparameters on macro-F1 with StratifiedKFold(5, shuffle=True, random_state=42).</w:t>
+          <w:rFonts w:eastAsia="Times New Roman" w:cs="Times New Roman"/>
+        </w:rPr>
+      </w:pPr>
+      <w:r>
+        <w:rPr>
+          <w:rFonts w:eastAsia="Times New Roman" w:cs="Times New Roman"/>
+        </w:rPr>
+        <w:t xml:space="preserve">SMOTE </w:t>
+      </w:r>
+      <w:proofErr w:type="spellStart"/>
+      <w:r>
+        <w:rPr>
+          <w:rFonts w:eastAsia="Times New Roman" w:cs="Times New Roman"/>
+        </w:rPr>
+        <w:t>synthesises</w:t>
+      </w:r>
+      <w:proofErr w:type="spellEnd"/>
+      <w:r>
+        <w:rPr>
+          <w:rFonts w:eastAsia="Times New Roman" w:cs="Times New Roman"/>
+        </w:rPr>
+        <w:t xml:space="preserve"> new minority-class samples along segments between k nearest minority </w:t>
+      </w:r>
+      <w:proofErr w:type="spellStart"/>
+      <w:r>
+        <w:rPr>
+          <w:rFonts w:eastAsia="Times New Roman" w:cs="Times New Roman"/>
+        </w:rPr>
+        <w:t>neighbours</w:t>
+      </w:r>
+      <w:proofErr w:type="spellEnd"/>
+      <w:r>
+        <w:rPr>
+          <w:rFonts w:eastAsia="Times New Roman" w:cs="Times New Roman"/>
+        </w:rPr>
+        <w:t xml:space="preserve">. Wrapping it in </w:t>
+      </w:r>
+      <w:proofErr w:type="spellStart"/>
+      <w:proofErr w:type="gramStart"/>
+      <w:r>
+        <w:rPr>
+          <w:rFonts w:eastAsia="Times New Roman" w:cs="Times New Roman"/>
+        </w:rPr>
+        <w:t>imblearn.Pipeline</w:t>
+      </w:r>
+      <w:proofErr w:type="spellEnd"/>
+      <w:proofErr w:type="gramEnd"/>
+      <w:r>
+        <w:rPr>
+          <w:rFonts w:eastAsia="Times New Roman" w:cs="Times New Roman"/>
+        </w:rPr>
+        <w:t xml:space="preserve"> keeps the synthesis inside training folds only, so validation-fold accuracy is never inflated. </w:t>
+      </w:r>
+      <w:proofErr w:type="spellStart"/>
+      <w:r>
+        <w:rPr>
+          <w:rFonts w:eastAsia="Times New Roman" w:cs="Times New Roman"/>
+        </w:rPr>
+        <w:t>GridSearchCV</w:t>
+      </w:r>
+      <w:proofErr w:type="spellEnd"/>
+      <w:r>
+        <w:rPr>
+          <w:rFonts w:eastAsia="Times New Roman" w:cs="Times New Roman"/>
+        </w:rPr>
+        <w:t xml:space="preserve"> picks hyperparameters on macro-F1 with </w:t>
+      </w:r>
+      <w:proofErr w:type="spellStart"/>
+      <w:proofErr w:type="gramStart"/>
+      <w:r>
+        <w:rPr>
+          <w:rFonts w:eastAsia="Times New Roman" w:cs="Times New Roman"/>
+        </w:rPr>
+        <w:t>StratifiedKFold</w:t>
+      </w:r>
+      <w:proofErr w:type="spellEnd"/>
+      <w:r>
+        <w:rPr>
+          <w:rFonts w:eastAsia="Times New Roman" w:cs="Times New Roman"/>
+        </w:rPr>
+        <w:t>(</w:t>
+      </w:r>
+      <w:proofErr w:type="gramEnd"/>
+      <w:r>
+        <w:rPr>
+          <w:rFonts w:eastAsia="Times New Roman" w:cs="Times New Roman"/>
+        </w:rPr>
+        <w:t xml:space="preserve">5, shuffle=True, </w:t>
+      </w:r>
+      <w:proofErr w:type="spellStart"/>
+      <w:r>
+        <w:rPr>
+          <w:rFonts w:eastAsia="Times New Roman" w:cs="Times New Roman"/>
+        </w:rPr>
+        <w:t>random_state</w:t>
+      </w:r>
+      <w:proofErr w:type="spellEnd"/>
+      <w:r>
+        <w:rPr>
+          <w:rFonts w:eastAsia="Times New Roman" w:cs="Times New Roman"/>
+        </w:rPr>
+        <w:t>=42).</w:t>
       </w:r>
     </w:p>
     <w:p>
@@ -4152,13 +4954,31 @@
             <w:pPr>
               <w:spacing w:before="20" w:after="20"/>
             </w:pPr>
-            <w:r>
-              <w:rPr>
-                <w:rFonts w:eastAsia="Times New Roman" w:cs="Times New Roman"/>
-                <w:sz w:val="20"/>
-              </w:rPr>
-              <w:t>force_exertion, force_x_age</w:t>
-            </w:r>
+            <w:proofErr w:type="spellStart"/>
+            <w:r>
+              <w:rPr>
+                <w:rFonts w:eastAsia="Times New Roman" w:cs="Times New Roman"/>
+                <w:sz w:val="20"/>
+              </w:rPr>
+              <w:t>force_exertion</w:t>
+            </w:r>
+            <w:proofErr w:type="spellEnd"/>
+            <w:r>
+              <w:rPr>
+                <w:rFonts w:eastAsia="Times New Roman" w:cs="Times New Roman"/>
+                <w:sz w:val="20"/>
+              </w:rPr>
+              <w:t xml:space="preserve">, </w:t>
+            </w:r>
+            <w:proofErr w:type="spellStart"/>
+            <w:r>
+              <w:rPr>
+                <w:rFonts w:eastAsia="Times New Roman" w:cs="Times New Roman"/>
+                <w:sz w:val="20"/>
+              </w:rPr>
+              <w:t>force_x_age</w:t>
+            </w:r>
+            <w:proofErr w:type="spellEnd"/>
           </w:p>
         </w:tc>
         <w:tc>
@@ -4210,13 +5030,47 @@
             <w:pPr>
               <w:spacing w:before="20" w:after="20"/>
             </w:pPr>
-            <w:r>
-              <w:rPr>
-                <w:rFonts w:eastAsia="Times New Roman" w:cs="Times New Roman"/>
-                <w:sz w:val="20"/>
-              </w:rPr>
-              <w:t>deliveries_num, work_hours_num, deliv_x_days</w:t>
-            </w:r>
+            <w:proofErr w:type="spellStart"/>
+            <w:r>
+              <w:rPr>
+                <w:rFonts w:eastAsia="Times New Roman" w:cs="Times New Roman"/>
+                <w:sz w:val="20"/>
+              </w:rPr>
+              <w:t>deliveries_num</w:t>
+            </w:r>
+            <w:proofErr w:type="spellEnd"/>
+            <w:r>
+              <w:rPr>
+                <w:rFonts w:eastAsia="Times New Roman" w:cs="Times New Roman"/>
+                <w:sz w:val="20"/>
+              </w:rPr>
+              <w:t xml:space="preserve">, </w:t>
+            </w:r>
+            <w:proofErr w:type="spellStart"/>
+            <w:r>
+              <w:rPr>
+                <w:rFonts w:eastAsia="Times New Roman" w:cs="Times New Roman"/>
+                <w:sz w:val="20"/>
+              </w:rPr>
+              <w:t>work_hours_num</w:t>
+            </w:r>
+            <w:proofErr w:type="spellEnd"/>
+            <w:r>
+              <w:rPr>
+                <w:rFonts w:eastAsia="Times New Roman" w:cs="Times New Roman"/>
+                <w:sz w:val="20"/>
+              </w:rPr>
+              <w:t xml:space="preserve">, </w:t>
+            </w:r>
+            <w:proofErr w:type="spellStart"/>
+            <w:r>
+              <w:rPr>
+                <w:rFonts w:eastAsia="Times New Roman" w:cs="Times New Roman"/>
+                <w:sz w:val="20"/>
+              </w:rPr>
+              <w:t>deliv_x_days</w:t>
+            </w:r>
+            <w:proofErr w:type="spellEnd"/>
           </w:p>
         </w:tc>
         <w:tc>
@@ -4268,13 +5122,31 @@
             <w:pPr>
               <w:spacing w:before="20" w:after="20"/>
             </w:pPr>
-            <w:r>
-              <w:rPr>
-                <w:rFonts w:eastAsia="Times New Roman" w:cs="Times New Roman"/>
-                <w:sz w:val="20"/>
-              </w:rPr>
-              <w:t>work_hours_num, vibration_index</w:t>
-            </w:r>
+            <w:proofErr w:type="spellStart"/>
+            <w:r>
+              <w:rPr>
+                <w:rFonts w:eastAsia="Times New Roman" w:cs="Times New Roman"/>
+                <w:sz w:val="20"/>
+              </w:rPr>
+              <w:t>work_hours_num</w:t>
+            </w:r>
+            <w:proofErr w:type="spellEnd"/>
+            <w:r>
+              <w:rPr>
+                <w:rFonts w:eastAsia="Times New Roman" w:cs="Times New Roman"/>
+                <w:sz w:val="20"/>
+              </w:rPr>
+              <w:t xml:space="preserve">, </w:t>
+            </w:r>
+            <w:proofErr w:type="spellStart"/>
+            <w:r>
+              <w:rPr>
+                <w:rFonts w:eastAsia="Times New Roman" w:cs="Times New Roman"/>
+                <w:sz w:val="20"/>
+              </w:rPr>
+              <w:t>vibration_index</w:t>
+            </w:r>
+            <w:proofErr w:type="spellEnd"/>
           </w:p>
         </w:tc>
         <w:tc>
@@ -4326,13 +5198,47 @@
             <w:pPr>
               <w:spacing w:before="20" w:after="20"/>
             </w:pPr>
-            <w:r>
-              <w:rPr>
-                <w:rFonts w:eastAsia="Times New Roman" w:cs="Times New Roman"/>
-                <w:sz w:val="20"/>
-              </w:rPr>
-              <w:t>vibration_index, vehicle_rank, work_hours_num</w:t>
-            </w:r>
+            <w:proofErr w:type="spellStart"/>
+            <w:r>
+              <w:rPr>
+                <w:rFonts w:eastAsia="Times New Roman" w:cs="Times New Roman"/>
+                <w:sz w:val="20"/>
+              </w:rPr>
+              <w:t>vibration_index</w:t>
+            </w:r>
+            <w:proofErr w:type="spellEnd"/>
+            <w:r>
+              <w:rPr>
+                <w:rFonts w:eastAsia="Times New Roman" w:cs="Times New Roman"/>
+                <w:sz w:val="20"/>
+              </w:rPr>
+              <w:t xml:space="preserve">, </w:t>
+            </w:r>
+            <w:proofErr w:type="spellStart"/>
+            <w:r>
+              <w:rPr>
+                <w:rFonts w:eastAsia="Times New Roman" w:cs="Times New Roman"/>
+                <w:sz w:val="20"/>
+              </w:rPr>
+              <w:t>vehicle_rank</w:t>
+            </w:r>
+            <w:proofErr w:type="spellEnd"/>
+            <w:r>
+              <w:rPr>
+                <w:rFonts w:eastAsia="Times New Roman" w:cs="Times New Roman"/>
+                <w:sz w:val="20"/>
+              </w:rPr>
+              <w:t xml:space="preserve">, </w:t>
+            </w:r>
+            <w:proofErr w:type="spellStart"/>
+            <w:r>
+              <w:rPr>
+                <w:rFonts w:eastAsia="Times New Roman" w:cs="Times New Roman"/>
+                <w:sz w:val="20"/>
+              </w:rPr>
+              <w:t>work_hours_num</w:t>
+            </w:r>
+            <w:proofErr w:type="spellEnd"/>
           </w:p>
         </w:tc>
         <w:tc>
@@ -4384,13 +5290,31 @@
             <w:pPr>
               <w:spacing w:before="20" w:after="20"/>
             </w:pPr>
-            <w:r>
-              <w:rPr>
-                <w:rFonts w:eastAsia="Times New Roman" w:cs="Times New Roman"/>
-                <w:sz w:val="20"/>
-              </w:rPr>
-              <w:t>carrying_contact_rank, work_hours_num</w:t>
-            </w:r>
+            <w:proofErr w:type="spellStart"/>
+            <w:r>
+              <w:rPr>
+                <w:rFonts w:eastAsia="Times New Roman" w:cs="Times New Roman"/>
+                <w:sz w:val="20"/>
+              </w:rPr>
+              <w:t>carrying_contact_rank</w:t>
+            </w:r>
+            <w:proofErr w:type="spellEnd"/>
+            <w:r>
+              <w:rPr>
+                <w:rFonts w:eastAsia="Times New Roman" w:cs="Times New Roman"/>
+                <w:sz w:val="20"/>
+              </w:rPr>
+              <w:t xml:space="preserve">, </w:t>
+            </w:r>
+            <w:proofErr w:type="spellStart"/>
+            <w:r>
+              <w:rPr>
+                <w:rFonts w:eastAsia="Times New Roman" w:cs="Times New Roman"/>
+                <w:sz w:val="20"/>
+              </w:rPr>
+              <w:t>work_hours_num</w:t>
+            </w:r>
+            <w:proofErr w:type="spellEnd"/>
           </w:p>
         </w:tc>
         <w:tc>
@@ -4510,7 +5434,47 @@
         <w:jc w:val="both"/>
       </w:pPr>
       <w:r>
-        <w:t>Phase 7 (07_evaluation.ipynb) involves cross_val_predict for out of fold predictions and generates class-wise metrics such as precision, recall, F1 score, support, confusion matrices, one-vs-all ROC curves with AUC per class (macro AUC is simply the average of all classes) and feature importance (feature_importances_ in case of tree models, abs(coef_) for the Logistic Regression classifier).</w:t>
+        <w:t>Phase 7 (07_</w:t>
+      </w:r>
+      <w:proofErr w:type="gramStart"/>
+      <w:r>
+        <w:t>evaluation.ipynb</w:t>
+      </w:r>
+      <w:proofErr w:type="gramEnd"/>
+      <w:r>
+        <w:t xml:space="preserve">) involves </w:t>
+      </w:r>
+      <w:proofErr w:type="spellStart"/>
+      <w:r>
+        <w:t>cross_val_predict</w:t>
+      </w:r>
+      <w:proofErr w:type="spellEnd"/>
+      <w:r>
+        <w:t xml:space="preserve"> for out of fold predictions and generates class-wise metrics such as precision, recall, F1 score, support, confusion matrices, one-vs-all ROC curves with AUC per class (</w:t>
+      </w:r>
+      <w:proofErr w:type="gramStart"/>
+      <w:r>
+        <w:t>macro AUC</w:t>
+      </w:r>
+      <w:proofErr w:type="gramEnd"/>
+      <w:r>
+        <w:t xml:space="preserve"> is simply the average of all classes) and feature importance (</w:t>
+      </w:r>
+      <w:proofErr w:type="spellStart"/>
+      <w:r>
+        <w:t>feature_importances</w:t>
+      </w:r>
+      <w:proofErr w:type="spellEnd"/>
+      <w:r>
+        <w:t>_ in case of tree models, abs(</w:t>
+      </w:r>
+      <w:proofErr w:type="spellStart"/>
+      <w:r>
+        <w:t>coef</w:t>
+      </w:r>
+      <w:proofErr w:type="spellEnd"/>
+      <w:r>
+        <w:t>_) for the Logistic Regression classifier).</w:t>
       </w:r>
     </w:p>
     <w:p>
@@ -4552,7 +5516,21 @@
         <w:rPr>
           <w:rFonts w:eastAsia="Times New Roman" w:cs="Times New Roman"/>
         </w:rPr>
-        <w:t>The complete pipeline comprises a total of 7 Jupyter notebooks (notebooks 01 to 07) together with a Streamlit application. Each of the notebooks is programmed in such a way that it is capable of functioning independently of the previous notebook. Thus, the total pipeline can be fully produced with a random seed set at 42.</w:t>
+        <w:t xml:space="preserve">The complete pipeline comprises a total of 7 Jupyter notebooks (notebooks 01 to 07) together with a </w:t>
+      </w:r>
+      <w:proofErr w:type="spellStart"/>
+      <w:r>
+        <w:rPr>
+          <w:rFonts w:eastAsia="Times New Roman" w:cs="Times New Roman"/>
+        </w:rPr>
+        <w:t>Streamlit</w:t>
+      </w:r>
+      <w:proofErr w:type="spellEnd"/>
+      <w:r>
+        <w:rPr>
+          <w:rFonts w:eastAsia="Times New Roman" w:cs="Times New Roman"/>
+        </w:rPr>
+        <w:t xml:space="preserve"> application. Each of the notebooks is programmed in such a way that it is capable of functioning independently of the previous notebook. Thus, the total pipeline can be fully produced with a random seed set at 42.</w:t>
       </w:r>
     </w:p>
     <w:p>
@@ -4564,29 +5542,35 @@
         <w:rPr>
           <w:rFonts w:eastAsia="Times New Roman" w:cs="Times New Roman"/>
         </w:rPr>
-        <w:t>01_data_cleaning normalises the raw CSV, standardises Yes / No answers, and validates row counts.</w:t>
-      </w:r>
-      <w:r>
-        <w:rPr>
-          <w:rFonts w:eastAsia="Times New Roman" w:cs="Times New Roman"/>
-        </w:rPr>
-      </w:r>
-      <w:r>
-        <w:rPr>
-          <w:rFonts w:eastAsia="Times New Roman" w:cs="Times New Roman"/>
-        </w:rPr>
-      </w:r>
-      <w:r>
-        <w:rPr>
-          <w:rFonts w:ascii="Nunito Sans" w:hAnsi="Nunito Sans"/>
-          <w:color w:val="131417"/>
-          <w:shd w:val="clear" w:color="auto" w:fill="FFFFFF"/>
-        </w:rPr>
-      </w:r>
-      <w:r>
-        <w:rPr>
-          <w:rFonts w:eastAsia="Times New Roman" w:cs="Times New Roman"/>
-        </w:rPr>
+        <w:t xml:space="preserve">01_data_cleaning </w:t>
+      </w:r>
+      <w:proofErr w:type="spellStart"/>
+      <w:r>
+        <w:rPr>
+          <w:rFonts w:eastAsia="Times New Roman" w:cs="Times New Roman"/>
+        </w:rPr>
+        <w:t>normalises</w:t>
+      </w:r>
+      <w:proofErr w:type="spellEnd"/>
+      <w:r>
+        <w:rPr>
+          <w:rFonts w:eastAsia="Times New Roman" w:cs="Times New Roman"/>
+        </w:rPr>
+        <w:t xml:space="preserve"> the raw CSV, </w:t>
+      </w:r>
+      <w:proofErr w:type="spellStart"/>
+      <w:r>
+        <w:rPr>
+          <w:rFonts w:eastAsia="Times New Roman" w:cs="Times New Roman"/>
+        </w:rPr>
+        <w:t>standardises</w:t>
+      </w:r>
+      <w:proofErr w:type="spellEnd"/>
+      <w:r>
+        <w:rPr>
+          <w:rFonts w:eastAsia="Times New Roman" w:cs="Times New Roman"/>
+        </w:rPr>
+        <w:t xml:space="preserve"> Yes / No answers, and validates row counts.</w:t>
       </w:r>
     </w:p>
     <w:p>
@@ -4622,7 +5606,21 @@
         <w:rPr>
           <w:rFonts w:eastAsia="Times New Roman" w:cs="Times New Roman"/>
         </w:rPr>
-        <w:t>04_eda reads model_ready.csv and risk_profile.csv and writes six figures under outputs/figures. It covers demographics, value_counts on the six risk columns, per body-area Nordic 12-month pain prevalence, discomfort split by demographic and by risk level, and a Pearson correlation heatmap on 15 columns (14 numeric and ordinal features plus the discomfort outcome). No CSVs or pickles are produced at this stage; the figures feed the Results chapter and motivate the tests in 05_stats.</w:t>
+        <w:t xml:space="preserve">04_eda reads model_ready.csv and risk_profile.csv and writes six figures under outputs/figures. It covers demographics, </w:t>
+      </w:r>
+      <w:proofErr w:type="spellStart"/>
+      <w:r>
+        <w:rPr>
+          <w:rFonts w:eastAsia="Times New Roman" w:cs="Times New Roman"/>
+        </w:rPr>
+        <w:t>value_counts</w:t>
+      </w:r>
+      <w:proofErr w:type="spellEnd"/>
+      <w:r>
+        <w:rPr>
+          <w:rFonts w:eastAsia="Times New Roman" w:cs="Times New Roman"/>
+        </w:rPr>
+        <w:t xml:space="preserve"> on the six risk columns, per body-area Nordic 12-month pain prevalence, discomfort split by demographic and by risk level, and a Pearson correlation heatmap on 15 columns (14 numeric and ordinal features plus the discomfort outcome). No CSVs or pickles are produced at this stage; the figures feed the Results chapter and motivate the tests in 05_stats.</w:t>
       </w:r>
     </w:p>
     <w:p>
@@ -4646,7 +5644,21 @@
         <w:rPr>
           <w:rFonts w:eastAsia="Times New Roman" w:cs="Times New Roman"/>
         </w:rPr>
-        <w:t>06_modeling conducts SMOTE and GridSearchCV for seven algorithms per target being scored.</w:t>
+        <w:t xml:space="preserve">06_modeling conducts SMOTE and </w:t>
+      </w:r>
+      <w:proofErr w:type="spellStart"/>
+      <w:r>
+        <w:rPr>
+          <w:rFonts w:eastAsia="Times New Roman" w:cs="Times New Roman"/>
+        </w:rPr>
+        <w:t>GridSearchCV</w:t>
+      </w:r>
+      <w:proofErr w:type="spellEnd"/>
+      <w:r>
+        <w:rPr>
+          <w:rFonts w:eastAsia="Times New Roman" w:cs="Times New Roman"/>
+        </w:rPr>
+        <w:t xml:space="preserve"> for seven algorithms per target being scored.</w:t>
       </w:r>
     </w:p>
     <w:p>
@@ -4696,14 +5708,8 @@
         <w:rPr>
           <w:rFonts w:eastAsia="Times New Roman" w:cs="Times New Roman"/>
         </w:rPr>
-        <w:t xml:space="preserve">The observation instrument was a paper form carrying the eleven standard RULA elements (upper arm, lower arm, wrist, wrist twist, neck position, trunk position, legs, muscle A, force A, muscle B, force </w:t>
-      </w:r>
-      <w:r>
-        <w:rPr>
-          <w:rFonts w:eastAsia="Times New Roman" w:cs="Times New Roman"/>
-        </w:rPr>
         <w:lastRenderedPageBreak/>
-        <w:t>B), the three RULA Table lookup scores (A, B, C), and the eight QEC region and exposure scores (back, shoulder / arm, wrist / hand, neck, driving, vibration, work pace, stress). Both instruments were piloted with three delivery partners outside the study region so the item wording, response options, and observer worksheet layout could be revised before real fieldwork began.</w:t>
+        <w:t>The observation instrument was a paper form carrying the eleven standard RULA elements (upper arm, lower arm, wrist, wrist twist, neck position, trunk position, legs, muscle A, force A, muscle B, force B), the three RULA Table lookup scores (A, B, C), and the eight QEC region and exposure scores (back, shoulder / arm, wrist / hand, neck, driving, vibration, work pace, stress). Both instruments were piloted with three delivery partners outside the study region so the item wording, response options, and observer worksheet layout could be revised before real fieldwork began.</w:t>
       </w:r>
     </w:p>
     <w:p>
@@ -4768,7 +5774,21 @@
         <w:rPr>
           <w:rFonts w:eastAsia="Times New Roman" w:cs="Times New Roman"/>
         </w:rPr>
-        <w:t>Data preparation ran in two notebooks. 01_data_cleaning loaded the raw Google Form CSV, standardised text answers to canonical Yes/No values, corrected a handful of column-name typos, and dropped rows that were incomplete after follow-up. The cleaned CSV was 182 rows and 48 columns.</w:t>
+        <w:t xml:space="preserve">Data preparation ran in two notebooks. 01_data_cleaning loaded the raw Google Form CSV, </w:t>
+      </w:r>
+      <w:proofErr w:type="spellStart"/>
+      <w:r>
+        <w:rPr>
+          <w:rFonts w:eastAsia="Times New Roman" w:cs="Times New Roman"/>
+        </w:rPr>
+        <w:t>standardised</w:t>
+      </w:r>
+      <w:proofErr w:type="spellEnd"/>
+      <w:r>
+        <w:rPr>
+          <w:rFonts w:eastAsia="Times New Roman" w:cs="Times New Roman"/>
+        </w:rPr>
+        <w:t xml:space="preserve"> text answers to canonical Yes/No values, corrected a handful of column-name typos, and dropped rows that were incomplete after follow-up. The cleaned CSV was 182 rows and 48 columns.</w:t>
       </w:r>
     </w:p>
     <w:p>
@@ -4780,7 +5800,119 @@
         <w:rPr>
           <w:rFonts w:eastAsia="Times New Roman" w:cs="Times New Roman"/>
         </w:rPr>
-        <w:t>02_feature_engineering converted the cleaned CSV into the model-ready feature set. Ordered categorical bands (age, education, income, job duration, working hours, working days, deliveries per day, rest break) were encoded to consecutive integers preserving order. Vehicle type and carrying mode were converted to ranks so motorbike ranks higher than scooter for vibration exposure and handheld ranks higher than backpack and bike storage for contact stress. Composite scores were computed: workload_score as the mean of the six NASA-TLX items (with the dissatisfied item reversed), fatigue_score as the mean of the six Borg items, force_exertion as the Borg lifting item, and vibration_index as vehicle_rank times work_hours_num. Five product-form interactions were added (workload times fatigue, workload times age, force times age, fatigue times job duration, deliveries times days). The 18 NMQ and 7-day items and the 5 outcome follow-ups were converted to short-named binary aliases (nmq_neck, d7_lower_back, out_reduced_perf, and so on).</w:t>
+        <w:t xml:space="preserve">02_feature_engineering converted the cleaned CSV into the model-ready feature set. Ordered categorical bands (age, education, income, job duration, working hours, working days, deliveries per day, rest break) were encoded to consecutive integers preserving order. Vehicle type and carrying mode were converted to ranks so motorbike ranks higher than scooter for vibration exposure and handheld ranks higher than backpack and bike storage for contact stress. Composite scores were computed: </w:t>
+      </w:r>
+      <w:proofErr w:type="spellStart"/>
+      <w:r>
+        <w:rPr>
+          <w:rFonts w:eastAsia="Times New Roman" w:cs="Times New Roman"/>
+        </w:rPr>
+        <w:t>workload_score</w:t>
+      </w:r>
+      <w:proofErr w:type="spellEnd"/>
+      <w:r>
+        <w:rPr>
+          <w:rFonts w:eastAsia="Times New Roman" w:cs="Times New Roman"/>
+        </w:rPr>
+        <w:t xml:space="preserve"> as the mean of the six NASA-TLX items (with the dissatisfied item reversed), </w:t>
+      </w:r>
+      <w:proofErr w:type="spellStart"/>
+      <w:r>
+        <w:rPr>
+          <w:rFonts w:eastAsia="Times New Roman" w:cs="Times New Roman"/>
+        </w:rPr>
+        <w:t>fatigue_score</w:t>
+      </w:r>
+      <w:proofErr w:type="spellEnd"/>
+      <w:r>
+        <w:rPr>
+          <w:rFonts w:eastAsia="Times New Roman" w:cs="Times New Roman"/>
+        </w:rPr>
+        <w:t xml:space="preserve"> as the mean of the six Borg items, </w:t>
+      </w:r>
+      <w:proofErr w:type="spellStart"/>
+      <w:r>
+        <w:rPr>
+          <w:rFonts w:eastAsia="Times New Roman" w:cs="Times New Roman"/>
+        </w:rPr>
+        <w:t>force_exertion</w:t>
+      </w:r>
+      <w:proofErr w:type="spellEnd"/>
+      <w:r>
+        <w:rPr>
+          <w:rFonts w:eastAsia="Times New Roman" w:cs="Times New Roman"/>
+        </w:rPr>
+        <w:t xml:space="preserve"> as the Borg lifting item, and </w:t>
+      </w:r>
+      <w:proofErr w:type="spellStart"/>
+      <w:r>
+        <w:rPr>
+          <w:rFonts w:eastAsia="Times New Roman" w:cs="Times New Roman"/>
+        </w:rPr>
+        <w:t>vibration_index</w:t>
+      </w:r>
+      <w:proofErr w:type="spellEnd"/>
+      <w:r>
+        <w:rPr>
+          <w:rFonts w:eastAsia="Times New Roman" w:cs="Times New Roman"/>
+        </w:rPr>
+        <w:t xml:space="preserve"> as </w:t>
+      </w:r>
+      <w:proofErr w:type="spellStart"/>
+      <w:r>
+        <w:rPr>
+          <w:rFonts w:eastAsia="Times New Roman" w:cs="Times New Roman"/>
+        </w:rPr>
+        <w:t>vehicle_rank</w:t>
+      </w:r>
+      <w:proofErr w:type="spellEnd"/>
+      <w:r>
+        <w:rPr>
+          <w:rFonts w:eastAsia="Times New Roman" w:cs="Times New Roman"/>
+        </w:rPr>
+        <w:t xml:space="preserve"> times </w:t>
+      </w:r>
+      <w:proofErr w:type="spellStart"/>
+      <w:r>
+        <w:rPr>
+          <w:rFonts w:eastAsia="Times New Roman" w:cs="Times New Roman"/>
+        </w:rPr>
+        <w:t>work_hours_num</w:t>
+      </w:r>
+      <w:proofErr w:type="spellEnd"/>
+      <w:r>
+        <w:rPr>
+          <w:rFonts w:eastAsia="Times New Roman" w:cs="Times New Roman"/>
+        </w:rPr>
+        <w:t>. Five product-form interactions were added (workload times fatigue, workload times age, force times age, fatigue times job duration, deliveries times days). The 18 NMQ and 7-day items and the 5 outcome follow-ups were converted to short-named binary aliases (</w:t>
+      </w:r>
+      <w:proofErr w:type="spellStart"/>
+      <w:r>
+        <w:rPr>
+          <w:rFonts w:eastAsia="Times New Roman" w:cs="Times New Roman"/>
+        </w:rPr>
+        <w:t>nmq_neck</w:t>
+      </w:r>
+      <w:proofErr w:type="spellEnd"/>
+      <w:r>
+        <w:rPr>
+          <w:rFonts w:eastAsia="Times New Roman" w:cs="Times New Roman"/>
+        </w:rPr>
+        <w:t xml:space="preserve">, d7_lower_back, </w:t>
+      </w:r>
+      <w:proofErr w:type="spellStart"/>
+      <w:r>
+        <w:rPr>
+          <w:rFonts w:eastAsia="Times New Roman" w:cs="Times New Roman"/>
+        </w:rPr>
+        <w:t>out_reduced_perf</w:t>
+      </w:r>
+      <w:proofErr w:type="spellEnd"/>
+      <w:r>
+        <w:rPr>
+          <w:rFonts w:eastAsia="Times New Roman" w:cs="Times New Roman"/>
+        </w:rPr>
+        <w:t>, and so on).</w:t>
       </w:r>
     </w:p>
     <w:p>
@@ -4802,7 +5934,23 @@
       </w:pPr>
       <w:r>
         <w:lastRenderedPageBreak/>
-        <w:t>Phase 3 (03_risk_scoring.ipynb) applied the Stage-1 rules from §2.4 to the merged frame and wrote risk_profile.csv with per-rider Low / Medium / High labels on the six ergonomic factors. Phase 4 (04_eda.ipynb) then produced the descriptive figures used in Chapter 4 (demographics, per-factor risk distribution, Nordic prevalence, discomfort split by demographic and by risk level, and a Pearson correlation heatmap) under outputs/figures/.</w:t>
+        <w:t>Phase 3 (03_risk_</w:t>
+      </w:r>
+      <w:proofErr w:type="gramStart"/>
+      <w:r>
+        <w:t>scoring.ipynb</w:t>
+      </w:r>
+      <w:proofErr w:type="gramEnd"/>
+      <w:r>
+        <w:t>) applied the Stage-1 rules from §2.4 to the merged frame and wrote risk_profile.csv with per-rider Low / Medium / High labels on the six ergonomic factors. Phase 4 (04_</w:t>
+      </w:r>
+      <w:proofErr w:type="gramStart"/>
+      <w:r>
+        <w:t>eda.ipynb</w:t>
+      </w:r>
+      <w:proofErr w:type="gramEnd"/>
+      <w:r>
+        <w:t>) then produced the descriptive figures used in Chapter 4 (demographics, per-factor risk distribution, Nordic prevalence, discomfort split by demographic and by risk level, and a Pearson correlation heatmap) under outputs/figures/.</w:t>
       </w:r>
     </w:p>
     <w:p>
@@ -4828,7 +5976,21 @@
         <w:rPr>
           <w:rFonts w:eastAsia="Times New Roman" w:cs="Times New Roman"/>
         </w:rPr>
-        <w:t>Two independent statistical analyses were run in 05_stats on the model-ready CSV. First, six chi-square tests of independence checked whether each Stage-1 risk-factor band was associated with a binary discomfort outcome; the tests reported chi2, degrees of freedom, and a raw p-value. Second, a multivariable logistic regression fitted with statsmodels estimated odds ratios for fourteen predictors (age, income, education, job duration, workload score, fatigue score, force exertion, vibration index, contact rank, hours, days) with self-reported discomfort as the outcome. Results were reported as OR with 95 percent confidence intervals.</w:t>
+        <w:t xml:space="preserve">Two independent statistical analyses were run in 05_stats on the model-ready CSV. First, six chi-square tests of independence checked whether each Stage-1 risk-factor band was associated with a binary discomfort outcome; the tests reported chi2, degrees of freedom, and a raw p-value. Second, a multivariable logistic regression fitted with </w:t>
+      </w:r>
+      <w:proofErr w:type="spellStart"/>
+      <w:r>
+        <w:rPr>
+          <w:rFonts w:eastAsia="Times New Roman" w:cs="Times New Roman"/>
+        </w:rPr>
+        <w:t>statsmodels</w:t>
+      </w:r>
+      <w:proofErr w:type="spellEnd"/>
+      <w:r>
+        <w:rPr>
+          <w:rFonts w:eastAsia="Times New Roman" w:cs="Times New Roman"/>
+        </w:rPr>
+        <w:t xml:space="preserve"> estimated odds ratios for fourteen predictors (age, income, education, job duration, workload score, fatigue score, force exertion, vibration index, contact rank, hours, days) with self-reported discomfort as the outcome. Results were reported as OR with 95 percent confidence intervals.</w:t>
       </w:r>
     </w:p>
     <w:p>
@@ -4840,27 +6002,99 @@
         <w:rPr>
           <w:rFonts w:eastAsia="Times New Roman" w:cs="Times New Roman"/>
         </w:rPr>
-        <w:t>Model training ran in 06_modeling. Each of the seven candidate algorithms was wrapped in an imblearn.Pipeline of SMOTE followed by the classifier and hyperparameter-tuned via GridSearchCV. For each of the six risk-factor targets, this expanded to a full five-fold stratified cross-validation over the algorithm's hyperparameter grid. Across the six targets and seven algorithms, forty-two target-algorithm training runs were carried out. Best-by-macro-F1 was selected per target and the winning pipeline was refit on the full sample and saved via joblib.dump to outputs/models as best_&lt;factor&gt;.pkl. The per-target feature exclusions listed in §2.6.9 were applied before each training run so no model could memorise its Stage-1 rule.</w:t>
-      </w:r>
-      <w:r>
-        <w:rPr>
-          <w:rFonts w:eastAsia="Times New Roman" w:cs="Times New Roman"/>
-        </w:rPr>
-      </w:r>
-      <w:r>
-        <w:rPr>
-          <w:rFonts w:eastAsia="Times New Roman" w:cs="Times New Roman"/>
-        </w:rPr>
-      </w:r>
-      <w:r>
-        <w:rPr>
-          <w:rFonts w:eastAsia="Times New Roman" w:cs="Times New Roman"/>
-        </w:rPr>
-      </w:r>
-      <w:r>
-        <w:rPr>
-          <w:rFonts w:eastAsia="Times New Roman" w:cs="Times New Roman"/>
-        </w:rPr>
+        <w:t xml:space="preserve">Model training ran in 06_modeling. Each of the seven candidate algorithms was wrapped in an </w:t>
+      </w:r>
+      <w:proofErr w:type="spellStart"/>
+      <w:r>
+        <w:rPr>
+          <w:rFonts w:eastAsia="Times New Roman" w:cs="Times New Roman"/>
+        </w:rPr>
+        <w:t>imblearn</w:t>
+      </w:r>
+      <w:proofErr w:type="spellEnd"/>
+      <w:r>
+        <w:rPr>
+          <w:rFonts w:eastAsia="Times New Roman" w:cs="Times New Roman"/>
+        </w:rPr>
+        <w:t>.</w:t>
+      </w:r>
+      <w:r>
+        <w:rPr>
+          <w:rFonts w:eastAsia="Times New Roman" w:cs="Times New Roman"/>
+        </w:rPr>
+        <w:t xml:space="preserve"> </w:t>
+      </w:r>
+      <w:r>
+        <w:rPr>
+          <w:rFonts w:eastAsia="Times New Roman" w:cs="Times New Roman"/>
+        </w:rPr>
+        <w:t xml:space="preserve">Pipeline of SMOTE followed by the classifier and hyperparameter-tuned via </w:t>
+      </w:r>
+      <w:proofErr w:type="spellStart"/>
+      <w:r>
+        <w:rPr>
+          <w:rFonts w:eastAsia="Times New Roman" w:cs="Times New Roman"/>
+        </w:rPr>
+        <w:t>GridSearchCV</w:t>
+      </w:r>
+      <w:proofErr w:type="spellEnd"/>
+      <w:r>
+        <w:rPr>
+          <w:rFonts w:eastAsia="Times New Roman" w:cs="Times New Roman"/>
+        </w:rPr>
+        <w:t xml:space="preserve">. For each of the six risk-factor targets, this expanded to a full five-fold stratified cross-validation over the algorithm's hyperparameter grid. Across the six targets and seven algorithms, forty-two target-algorithm training runs were carried out. Best-by-macro-F1 was selected per target and the winning pipeline was refit on the full sample and saved via </w:t>
+      </w:r>
+      <w:proofErr w:type="spellStart"/>
+      <w:proofErr w:type="gramStart"/>
+      <w:r>
+        <w:rPr>
+          <w:rFonts w:eastAsia="Times New Roman" w:cs="Times New Roman"/>
+        </w:rPr>
+        <w:t>joblib.dump</w:t>
+      </w:r>
+      <w:proofErr w:type="spellEnd"/>
+      <w:proofErr w:type="gramEnd"/>
+      <w:r>
+        <w:rPr>
+          <w:rFonts w:eastAsia="Times New Roman" w:cs="Times New Roman"/>
+        </w:rPr>
+        <w:t xml:space="preserve"> to outputs/models as best_&lt;factor</w:t>
+      </w:r>
+      <w:proofErr w:type="gramStart"/>
+      <w:r>
+        <w:rPr>
+          <w:rFonts w:eastAsia="Times New Roman" w:cs="Times New Roman"/>
+        </w:rPr>
+        <w:t>&gt;.</w:t>
+      </w:r>
+      <w:proofErr w:type="spellStart"/>
+      <w:r>
+        <w:rPr>
+          <w:rFonts w:eastAsia="Times New Roman" w:cs="Times New Roman"/>
+        </w:rPr>
+        <w:t>pkl</w:t>
+      </w:r>
+      <w:proofErr w:type="spellEnd"/>
+      <w:proofErr w:type="gramEnd"/>
+      <w:r>
+        <w:rPr>
+          <w:rFonts w:eastAsia="Times New Roman" w:cs="Times New Roman"/>
+        </w:rPr>
+        <w:t xml:space="preserve">. The per-target feature exclusions listed in §2.6.9 were applied before each training run so no model could </w:t>
+      </w:r>
+      <w:proofErr w:type="spellStart"/>
+      <w:r>
+        <w:rPr>
+          <w:rFonts w:eastAsia="Times New Roman" w:cs="Times New Roman"/>
+        </w:rPr>
+        <w:t>memorise</w:t>
+      </w:r>
+      <w:proofErr w:type="spellEnd"/>
+      <w:r>
+        <w:rPr>
+          <w:rFonts w:eastAsia="Times New Roman" w:cs="Times New Roman"/>
+        </w:rPr>
+        <w:t xml:space="preserve"> its Stage-1 rule.</w:t>
       </w:r>
     </w:p>
     <w:p>
@@ -4872,7 +6106,63 @@
         <w:rPr>
           <w:rFonts w:eastAsia="Times New Roman" w:cs="Times New Roman"/>
         </w:rPr>
-        <w:t>07_evaluation produced the reporting artefacts. cross_val_predict was used to generate out-of-fold predictions on the training set, and the following outputs were written: per-class precision, recall, F1, and support numbers via classification_report; confusion matrices per target; one-vs-rest ROC curves with per-class AUC (macro AUC is the unweighted mean of per-class AUCs); and feature importance plots (feature_importances_ for the tree-based winners, absolute value of coef_ for the Logistic Regression floor).</w:t>
+        <w:t xml:space="preserve">07_evaluation produced the reporting artefacts. </w:t>
+      </w:r>
+      <w:proofErr w:type="spellStart"/>
+      <w:r>
+        <w:rPr>
+          <w:rFonts w:eastAsia="Times New Roman" w:cs="Times New Roman"/>
+        </w:rPr>
+        <w:t>cross_val_predict</w:t>
+      </w:r>
+      <w:proofErr w:type="spellEnd"/>
+      <w:r>
+        <w:rPr>
+          <w:rFonts w:eastAsia="Times New Roman" w:cs="Times New Roman"/>
+        </w:rPr>
+        <w:t xml:space="preserve"> was used to generate out-of-fold predictions on the training set, and the following outputs were written: per-class precision, recall, F1, and support numbers via </w:t>
+      </w:r>
+      <w:proofErr w:type="spellStart"/>
+      <w:r>
+        <w:rPr>
+          <w:rFonts w:eastAsia="Times New Roman" w:cs="Times New Roman"/>
+        </w:rPr>
+        <w:t>classification_report</w:t>
+      </w:r>
+      <w:proofErr w:type="spellEnd"/>
+      <w:r>
+        <w:rPr>
+          <w:rFonts w:eastAsia="Times New Roman" w:cs="Times New Roman"/>
+        </w:rPr>
+        <w:t>; confusion matrices per target; one-vs-rest ROC curves with per-class AUC (macro AUC is the unweighted mean of per-class AUCs); and feature importance plots (</w:t>
+      </w:r>
+      <w:proofErr w:type="spellStart"/>
+      <w:r>
+        <w:rPr>
+          <w:rFonts w:eastAsia="Times New Roman" w:cs="Times New Roman"/>
+        </w:rPr>
+        <w:t>feature_importances</w:t>
+      </w:r>
+      <w:proofErr w:type="spellEnd"/>
+      <w:r>
+        <w:rPr>
+          <w:rFonts w:eastAsia="Times New Roman" w:cs="Times New Roman"/>
+        </w:rPr>
+        <w:t xml:space="preserve">_ for the tree-based winners, absolute value of </w:t>
+      </w:r>
+      <w:proofErr w:type="spellStart"/>
+      <w:r>
+        <w:rPr>
+          <w:rFonts w:eastAsia="Times New Roman" w:cs="Times New Roman"/>
+        </w:rPr>
+        <w:t>coef</w:t>
+      </w:r>
+      <w:proofErr w:type="spellEnd"/>
+      <w:r>
+        <w:rPr>
+          <w:rFonts w:eastAsia="Times New Roman" w:cs="Times New Roman"/>
+        </w:rPr>
+        <w:t>_ for the Logistic Regression floor).</w:t>
       </w:r>
     </w:p>
     <w:p>
@@ -4901,12 +6191,42 @@
         <w:rPr>
           <w:rFonts w:eastAsia="Times New Roman" w:cs="Times New Roman"/>
         </w:rPr>
-        <w:t>The Streamlit application (app/streamlit_app.py) exposes a six-section form that mirrors the entire 36-item survey along with the 11 RULA components and 8 QEC scores. Selectboxes cover demographics and work pattern; radios cover NMQ, 7-day discomfort, and the outcome follow-ups; sliders cover NASA-TLX (0 to 100) and Borg CR10 (0 to 10); and QEC score entries are bounded by their allowed range. Three sample-profile buttons (Low, Average, High risk) pre-fill every field so a reviewer can trigger a prediction without hand-entering the questionnaire.</w:t>
-      </w:r>
-      <w:r>
-        <w:rPr>
-          <w:rFonts w:eastAsia="Times New Roman" w:cs="Times New Roman"/>
-        </w:rPr>
+        <w:t xml:space="preserve">The </w:t>
+      </w:r>
+      <w:proofErr w:type="spellStart"/>
+      <w:r>
+        <w:rPr>
+          <w:rFonts w:eastAsia="Times New Roman" w:cs="Times New Roman"/>
+        </w:rPr>
+        <w:t>Streamlit</w:t>
+      </w:r>
+      <w:proofErr w:type="spellEnd"/>
+      <w:r>
+        <w:rPr>
+          <w:rFonts w:eastAsia="Times New Roman" w:cs="Times New Roman"/>
+        </w:rPr>
+        <w:t xml:space="preserve"> application (app/streamlit_app.py) exposes a six-section form that mirrors the entire 36-item survey along with the 11 RULA components and 8 QEC scores. </w:t>
+      </w:r>
+      <w:proofErr w:type="spellStart"/>
+      <w:r>
+        <w:rPr>
+          <w:rFonts w:eastAsia="Times New Roman" w:cs="Times New Roman"/>
+        </w:rPr>
+        <w:t>Selectboxes</w:t>
+      </w:r>
+      <w:proofErr w:type="spellEnd"/>
+      <w:r>
+        <w:rPr>
+          <w:rFonts w:eastAsia="Times New Roman" w:cs="Times New Roman"/>
+        </w:rPr>
+        <w:t xml:space="preserve"> cover demographics and work pattern; radios cover NMQ, 7-day discomfort, and the outcome follow-ups; sliders cover NASA-TLX (0 to 100) and Borg CR10 (0 to 10); and QEC score entries are bounded by their allowed </w:t>
+      </w:r>
+      <w:r>
+        <w:rPr>
+          <w:rFonts w:eastAsia="Times New Roman" w:cs="Times New Roman"/>
+        </w:rPr>
+        <w:lastRenderedPageBreak/>
+        <w:t>range. Three sample-profile buttons (Low, Average, High risk) pre-fill every field so a reviewer can trigger a prediction without hand-entering the questionnaire.</w:t>
       </w:r>
     </w:p>
     <w:p>
@@ -4918,36 +6238,133 @@
         <w:rPr>
           <w:rFonts w:eastAsia="Times New Roman" w:cs="Times New Roman"/>
         </w:rPr>
-        <w:t>On form submission, encode_rider builds the shared 63-column feature frame (each model then applies its own per-target exclusions per Table 2.1) and predict_risks runs all six saved models. The Results page renders a colour-coded metric strip (green for Low, amber for Medium, red for High), a horizontal Altair bar chart of the same six factors, a summary banner that flags high-burden profiles, and per-factor recommendation cards. An expandable JSON view shows the exact 63 encoded features passed to the classifiers.</w:t>
-      </w:r>
-      <w:r>
-        <w:rPr>
-          <w:rFonts w:eastAsia="Times New Roman" w:cs="Times New Roman"/>
-        </w:rPr>
+        <w:t xml:space="preserve">On form submission, </w:t>
+      </w:r>
+      <w:proofErr w:type="spellStart"/>
+      <w:r>
+        <w:rPr>
+          <w:rFonts w:eastAsia="Times New Roman" w:cs="Times New Roman"/>
+        </w:rPr>
+        <w:t>encode_rider</w:t>
+      </w:r>
+      <w:proofErr w:type="spellEnd"/>
+      <w:r>
+        <w:rPr>
+          <w:rFonts w:eastAsia="Times New Roman" w:cs="Times New Roman"/>
+        </w:rPr>
+        <w:t xml:space="preserve"> builds the shared 63-column feature frame (each model then applies its own per-target exclusions per Table 2.1) and </w:t>
+      </w:r>
+      <w:proofErr w:type="spellStart"/>
+      <w:r>
+        <w:rPr>
+          <w:rFonts w:eastAsia="Times New Roman" w:cs="Times New Roman"/>
+        </w:rPr>
+        <w:t>predict_risks</w:t>
+      </w:r>
+      <w:proofErr w:type="spellEnd"/>
+      <w:r>
+        <w:rPr>
+          <w:rFonts w:eastAsia="Times New Roman" w:cs="Times New Roman"/>
+        </w:rPr>
+        <w:t xml:space="preserve"> runs all six saved models. The Results page renders a </w:t>
+      </w:r>
+      <w:proofErr w:type="spellStart"/>
+      <w:r>
+        <w:rPr>
+          <w:rFonts w:eastAsia="Times New Roman" w:cs="Times New Roman"/>
+        </w:rPr>
+        <w:t>colour</w:t>
+      </w:r>
+      <w:proofErr w:type="spellEnd"/>
+      <w:r>
+        <w:rPr>
+          <w:rFonts w:eastAsia="Times New Roman" w:cs="Times New Roman"/>
+        </w:rPr>
+        <w:t>-coded metric strip (green for Low, amber for Medium, red for High), a horizontal Altair bar chart of the same six factors, a summary banner that flags high-burden profiles, and per-factor recommendation cards. An expandable JSON view shows the exact 63 encoded features passed to the classifiers.</w:t>
       </w:r>
     </w:p>
     <w:p>
       <w:pPr>
         <w:spacing w:before="280" w:after="100"/>
         <w:rPr>
-          <w:rFonts w:ascii="Times New Roman" w:eastAsia="Times New Roman" w:hAnsi="Times New Roman" w:cs="Times New Roman"/>
-          <w:b w:val="0"/>
-          <w:bCs w:val="0"/>
-          <w:i w:val="0"/>
-          <w:iCs w:val="0"/>
-          <w:color w:val="auto"/>
-        </w:rPr>
-      </w:pPr>
-      <w:r>
-        <w:rPr>
-          <w:rFonts w:ascii="Times New Roman" w:eastAsia="Times New Roman" w:hAnsi="Times New Roman" w:cs="Times New Roman"/>
-          <w:b w:val="0"/>
-          <w:bCs w:val="0"/>
-          <w:i w:val="0"/>
-          <w:iCs w:val="0"/>
-          <w:color w:val="auto"/>
-        </w:rPr>
-        <w:t>The application was deployed to Streamlit Community Cloud from the public GitHub repository. Deployment required pinning every runtime dependency in requirements.txt to the exact versions used during training (streamlit 1.58, pandas 2.3, scikit-learn 1.7, xgboost 3.2, imbalanced-learn 0.14) because sklearn and xgboost pickles are not portable across versions. runtime.txt pins Python to 3.13 to match the training environment.</w:t>
+          <w:rFonts w:eastAsia="Times New Roman" w:cs="Times New Roman"/>
+        </w:rPr>
+      </w:pPr>
+      <w:r>
+        <w:rPr>
+          <w:rFonts w:eastAsia="Times New Roman" w:cs="Times New Roman"/>
+        </w:rPr>
+        <w:t xml:space="preserve">The application was deployed to </w:t>
+      </w:r>
+      <w:proofErr w:type="spellStart"/>
+      <w:r>
+        <w:rPr>
+          <w:rFonts w:eastAsia="Times New Roman" w:cs="Times New Roman"/>
+        </w:rPr>
+        <w:t>Streamlit</w:t>
+      </w:r>
+      <w:proofErr w:type="spellEnd"/>
+      <w:r>
+        <w:rPr>
+          <w:rFonts w:eastAsia="Times New Roman" w:cs="Times New Roman"/>
+        </w:rPr>
+        <w:t xml:space="preserve"> Community Cloud from the public GitHub repository. Deployment required pinning every runtime dependency in requirements.txt to the exact versions used during training (</w:t>
+      </w:r>
+      <w:proofErr w:type="spellStart"/>
+      <w:r>
+        <w:rPr>
+          <w:rFonts w:eastAsia="Times New Roman" w:cs="Times New Roman"/>
+        </w:rPr>
+        <w:t>streamlit</w:t>
+      </w:r>
+      <w:proofErr w:type="spellEnd"/>
+      <w:r>
+        <w:rPr>
+          <w:rFonts w:eastAsia="Times New Roman" w:cs="Times New Roman"/>
+        </w:rPr>
+        <w:t xml:space="preserve"> 1.58, pandas 2.3, scikit-learn 1.7, </w:t>
+      </w:r>
+      <w:proofErr w:type="spellStart"/>
+      <w:r>
+        <w:rPr>
+          <w:rFonts w:eastAsia="Times New Roman" w:cs="Times New Roman"/>
+        </w:rPr>
+        <w:t>xgboost</w:t>
+      </w:r>
+      <w:proofErr w:type="spellEnd"/>
+      <w:r>
+        <w:rPr>
+          <w:rFonts w:eastAsia="Times New Roman" w:cs="Times New Roman"/>
+        </w:rPr>
+        <w:t xml:space="preserve"> 3.2, imbalanced-learn 0.14) because </w:t>
+      </w:r>
+      <w:proofErr w:type="spellStart"/>
+      <w:r>
+        <w:rPr>
+          <w:rFonts w:eastAsia="Times New Roman" w:cs="Times New Roman"/>
+        </w:rPr>
+        <w:t>sklearn</w:t>
+      </w:r>
+      <w:proofErr w:type="spellEnd"/>
+      <w:r>
+        <w:rPr>
+          <w:rFonts w:eastAsia="Times New Roman" w:cs="Times New Roman"/>
+        </w:rPr>
+        <w:t xml:space="preserve"> and </w:t>
+      </w:r>
+      <w:proofErr w:type="spellStart"/>
+      <w:r>
+        <w:rPr>
+          <w:rFonts w:eastAsia="Times New Roman" w:cs="Times New Roman"/>
+        </w:rPr>
+        <w:t>xgboost</w:t>
+      </w:r>
+      <w:proofErr w:type="spellEnd"/>
+      <w:r>
+        <w:rPr>
+          <w:rFonts w:eastAsia="Times New Roman" w:cs="Times New Roman"/>
+        </w:rPr>
+        <w:t xml:space="preserve"> pickles are not portable across versions. runtime.txt pins Python to 3.13 to match the training environment.</w:t>
       </w:r>
     </w:p>
     <w:p>
@@ -4988,7 +6405,93 @@
         <w:rPr>
           <w:rFonts w:eastAsia="Times New Roman" w:cs="Times New Roman"/>
         </w:rPr>
-        <w:t>The initial Phase 3 binning used pandas.qcut(q=3) on deliveries_per_hour. The 66.7th percentile fell exactly on 3.889 dph (35 deliveries over 9 hours, the worst real schedule in the sample). Fifty-five of the 182 riders tied at that value and qcut pushed all of them into Medium, leaving the Stage-2 model unable to predict High for the worst schedule. Replacing qcut with fixed cuts at 2.5 and 3.75 raised the Stage-1 High count from 19 to 74. CV accuracy fell from 74 percent to 62 percent because the model now solves a real 3-class problem instead of memorising a 19-row minority.</w:t>
+        <w:t xml:space="preserve">The initial Phase 3 binning used </w:t>
+      </w:r>
+      <w:proofErr w:type="spellStart"/>
+      <w:proofErr w:type="gramStart"/>
+      <w:r>
+        <w:rPr>
+          <w:rFonts w:eastAsia="Times New Roman" w:cs="Times New Roman"/>
+        </w:rPr>
+        <w:t>pandas.qcut</w:t>
+      </w:r>
+      <w:proofErr w:type="spellEnd"/>
+      <w:proofErr w:type="gramEnd"/>
+      <w:r>
+        <w:rPr>
+          <w:rFonts w:eastAsia="Times New Roman" w:cs="Times New Roman"/>
+        </w:rPr>
+        <w:t xml:space="preserve">(q=3) on </w:t>
+      </w:r>
+      <w:proofErr w:type="spellStart"/>
+      <w:r>
+        <w:rPr>
+          <w:rFonts w:eastAsia="Times New Roman" w:cs="Times New Roman"/>
+        </w:rPr>
+        <w:t>deliveries_per_hour</w:t>
+      </w:r>
+      <w:proofErr w:type="spellEnd"/>
+      <w:r>
+        <w:rPr>
+          <w:rFonts w:eastAsia="Times New Roman" w:cs="Times New Roman"/>
+        </w:rPr>
+        <w:t xml:space="preserve">. The 66.7th percentile fell exactly on 3.889 </w:t>
+      </w:r>
+      <w:proofErr w:type="spellStart"/>
+      <w:r>
+        <w:rPr>
+          <w:rFonts w:eastAsia="Times New Roman" w:cs="Times New Roman"/>
+        </w:rPr>
+        <w:t>dph</w:t>
+      </w:r>
+      <w:proofErr w:type="spellEnd"/>
+      <w:r>
+        <w:rPr>
+          <w:rFonts w:eastAsia="Times New Roman" w:cs="Times New Roman"/>
+        </w:rPr>
+        <w:t xml:space="preserve"> (35 deliveries over 9 hours, the worst real schedule in the sample). Fifty-five of the 182 riders tied at that value and </w:t>
+      </w:r>
+      <w:proofErr w:type="spellStart"/>
+      <w:r>
+        <w:rPr>
+          <w:rFonts w:eastAsia="Times New Roman" w:cs="Times New Roman"/>
+        </w:rPr>
+        <w:t>qcut</w:t>
+      </w:r>
+      <w:proofErr w:type="spellEnd"/>
+      <w:r>
+        <w:rPr>
+          <w:rFonts w:eastAsia="Times New Roman" w:cs="Times New Roman"/>
+        </w:rPr>
+        <w:t xml:space="preserve"> pushed all of them into Medium, leaving the Stage-2 model unable to predict High for the worst schedule. Replacing </w:t>
+      </w:r>
+      <w:proofErr w:type="spellStart"/>
+      <w:r>
+        <w:rPr>
+          <w:rFonts w:eastAsia="Times New Roman" w:cs="Times New Roman"/>
+        </w:rPr>
+        <w:t>qcut</w:t>
+      </w:r>
+      <w:proofErr w:type="spellEnd"/>
+      <w:r>
+        <w:rPr>
+          <w:rFonts w:eastAsia="Times New Roman" w:cs="Times New Roman"/>
+        </w:rPr>
+        <w:t xml:space="preserve"> with fixed cuts at 2.5 and 3.75 raised the Stage-1 High count from 19 to 74. CV accuracy fell from 74 percent to 62 percent because the model now solves a real 3-class problem instead of </w:t>
+      </w:r>
+      <w:proofErr w:type="spellStart"/>
+      <w:r>
+        <w:rPr>
+          <w:rFonts w:eastAsia="Times New Roman" w:cs="Times New Roman"/>
+        </w:rPr>
+        <w:t>memorising</w:t>
+      </w:r>
+      <w:proofErr w:type="spellEnd"/>
+      <w:r>
+        <w:rPr>
+          <w:rFonts w:eastAsia="Times New Roman" w:cs="Times New Roman"/>
+        </w:rPr>
+        <w:t xml:space="preserve"> a 19-row minority.</w:t>
       </w:r>
     </w:p>
     <w:p>
@@ -5015,7 +6518,105 @@
         <w:rPr>
           <w:rFonts w:eastAsia="Times New Roman" w:cs="Times New Roman"/>
         </w:rPr>
-        <w:t>An earlier Phase 6 run reported 100 percent cross-validation accuracy on Duration. Investigation showed the trees were reconstructing work_hours_num from vibration_index, which equals vehicle_rank multiplied by work_hours_num. Adding vibration_index to the Duration exclusion list and capping max_depth returned Duration to a realistic 61 percent accuracy with 76 percent macro AUC.</w:t>
+        <w:t xml:space="preserve">An earlier Phase 6 run reported 100 percent cross-validation accuracy on Duration. Investigation showed the trees were reconstructing </w:t>
+      </w:r>
+      <w:proofErr w:type="spellStart"/>
+      <w:r>
+        <w:rPr>
+          <w:rFonts w:eastAsia="Times New Roman" w:cs="Times New Roman"/>
+        </w:rPr>
+        <w:t>work_hours_num</w:t>
+      </w:r>
+      <w:proofErr w:type="spellEnd"/>
+      <w:r>
+        <w:rPr>
+          <w:rFonts w:eastAsia="Times New Roman" w:cs="Times New Roman"/>
+        </w:rPr>
+        <w:t xml:space="preserve"> from </w:t>
+      </w:r>
+      <w:proofErr w:type="spellStart"/>
+      <w:r>
+        <w:rPr>
+          <w:rFonts w:eastAsia="Times New Roman" w:cs="Times New Roman"/>
+        </w:rPr>
+        <w:t>vibration_index</w:t>
+      </w:r>
+      <w:proofErr w:type="spellEnd"/>
+      <w:r>
+        <w:rPr>
+          <w:rFonts w:eastAsia="Times New Roman" w:cs="Times New Roman"/>
+        </w:rPr>
+        <w:t xml:space="preserve">, which equals </w:t>
+      </w:r>
+      <w:proofErr w:type="spellStart"/>
+      <w:r>
+        <w:rPr>
+          <w:rFonts w:eastAsia="Times New Roman" w:cs="Times New Roman"/>
+        </w:rPr>
+        <w:t>vehicle_rank</w:t>
+      </w:r>
+      <w:proofErr w:type="spellEnd"/>
+      <w:r>
+        <w:rPr>
+          <w:rFonts w:eastAsia="Times New Roman" w:cs="Times New Roman"/>
+        </w:rPr>
+        <w:t xml:space="preserve"> multiplied by </w:t>
+      </w:r>
+      <w:proofErr w:type="spellStart"/>
+      <w:r>
+        <w:rPr>
+          <w:rFonts w:eastAsia="Times New Roman" w:cs="Times New Roman"/>
+        </w:rPr>
+        <w:t>work_hours_num</w:t>
+      </w:r>
+      <w:proofErr w:type="spellEnd"/>
+      <w:r>
+        <w:rPr>
+          <w:rFonts w:eastAsia="Times New Roman" w:cs="Times New Roman"/>
+        </w:rPr>
+        <w:t xml:space="preserve">. Adding </w:t>
+      </w:r>
+      <w:proofErr w:type="spellStart"/>
+      <w:r>
+        <w:rPr>
+          <w:rFonts w:eastAsia="Times New Roman" w:cs="Times New Roman"/>
+        </w:rPr>
+        <w:t>vibration_index</w:t>
+      </w:r>
+      <w:proofErr w:type="spellEnd"/>
+      <w:r>
+        <w:rPr>
+          <w:rFonts w:eastAsia="Times New Roman" w:cs="Times New Roman"/>
+        </w:rPr>
+        <w:t xml:space="preserve"> to the Duration exclusion list and capping </w:t>
+      </w:r>
+      <w:proofErr w:type="spellStart"/>
+      <w:r>
+        <w:rPr>
+          <w:rFonts w:eastAsia="Times New Roman" w:cs="Times New Roman"/>
+        </w:rPr>
+        <w:t>max_depth</w:t>
+      </w:r>
+      <w:proofErr w:type="spellEnd"/>
+      <w:r>
+        <w:rPr>
+          <w:rFonts w:eastAsia="Times New Roman" w:cs="Times New Roman"/>
+        </w:rPr>
+        <w:t xml:space="preserve"> returned Duration to a realistic 61 percent accuracy with 76 percent </w:t>
+      </w:r>
+      <w:proofErr w:type="gramStart"/>
+      <w:r>
+        <w:rPr>
+          <w:rFonts w:eastAsia="Times New Roman" w:cs="Times New Roman"/>
+        </w:rPr>
+        <w:t>macro AUC</w:t>
+      </w:r>
+      <w:proofErr w:type="gramEnd"/>
+      <w:r>
+        <w:rPr>
+          <w:rFonts w:eastAsia="Times New Roman" w:cs="Times New Roman"/>
+        </w:rPr>
+        <w:t>.</w:t>
       </w:r>
     </w:p>
     <w:p>
@@ -5030,7 +6631,6 @@
           <w:color w:val="000000"/>
           <w:sz w:val="24"/>
         </w:rPr>
-        <w:lastRenderedPageBreak/>
         <w:t>3.7.3   Posture model with RULA and QEC inputs</w:t>
       </w:r>
     </w:p>
@@ -5043,7 +6643,35 @@
         <w:rPr>
           <w:rFonts w:eastAsia="Times New Roman" w:cs="Times New Roman"/>
         </w:rPr>
-        <w:t>The Posture target was initially trained only on the survey feature pool, which meant it could only infer posture indirectly from pain, fatigue, and hours. Adding the 11 RULA components and 8 QEC scores from the observation xlsx as explicit features moved Posture accuracy from 89 to 97 percent and the overfit gap from 0.088 to 0.028. Per the label-leakage rule, the three derived RULA Table scores were excluded because posture_risk is rula_table_c binned.</w:t>
+        <w:t xml:space="preserve">The Posture target was initially trained only on the survey feature pool, which meant it could only infer posture indirectly from pain, fatigue, and hours. Adding the 11 RULA components and 8 QEC scores from the observation xlsx as explicit features moved Posture accuracy from 89 to 97 percent and the overfit gap from 0.088 to 0.028. Per the label-leakage rule, the three derived RULA Table scores were excluded because </w:t>
+      </w:r>
+      <w:proofErr w:type="spellStart"/>
+      <w:r>
+        <w:rPr>
+          <w:rFonts w:eastAsia="Times New Roman" w:cs="Times New Roman"/>
+        </w:rPr>
+        <w:t>posture_risk</w:t>
+      </w:r>
+      <w:proofErr w:type="spellEnd"/>
+      <w:r>
+        <w:rPr>
+          <w:rFonts w:eastAsia="Times New Roman" w:cs="Times New Roman"/>
+        </w:rPr>
+        <w:t xml:space="preserve"> is </w:t>
+      </w:r>
+      <w:proofErr w:type="spellStart"/>
+      <w:r>
+        <w:rPr>
+          <w:rFonts w:eastAsia="Times New Roman" w:cs="Times New Roman"/>
+        </w:rPr>
+        <w:t>rula_table_c</w:t>
+      </w:r>
+      <w:proofErr w:type="spellEnd"/>
+      <w:r>
+        <w:rPr>
+          <w:rFonts w:eastAsia="Times New Roman" w:cs="Times New Roman"/>
+        </w:rPr>
+        <w:t xml:space="preserve"> binned.</w:t>
       </w:r>
     </w:p>
     <w:p>
@@ -5085,7 +6713,35 @@
         <w:rPr>
           <w:rFonts w:eastAsia="Times New Roman" w:cs="Times New Roman"/>
         </w:rPr>
-        <w:t>The sample of 182 riders is 152 male and 30 female. Age skews young: 78 riders are under 25, 66 in the 25-35 band, 30 in 36-45, and 8 in the 46-and-above band. Roughly half the sample (49 percent) works more than 8 hours per day. Ninety-four ride scooters and 88 ride motorbikes. The platform split is 97 Blinkit, 80 Zepto, and 5 who work both platforms.</w:t>
+        <w:t xml:space="preserve">The sample of 182 riders is 152 male and 30 female. Age skews young: 78 riders are under 25, 66 in the 25-35 band, 30 in 36-45, and 8 in the 46-and-above band. Roughly half the sample (49 percent) works more than 8 hours per day. Ninety-four ride scooters and 88 ride motorbikes. The platform split is 97 </w:t>
+      </w:r>
+      <w:proofErr w:type="spellStart"/>
+      <w:r>
+        <w:rPr>
+          <w:rFonts w:eastAsia="Times New Roman" w:cs="Times New Roman"/>
+        </w:rPr>
+        <w:t>Blinkit</w:t>
+      </w:r>
+      <w:proofErr w:type="spellEnd"/>
+      <w:r>
+        <w:rPr>
+          <w:rFonts w:eastAsia="Times New Roman" w:cs="Times New Roman"/>
+        </w:rPr>
+        <w:t xml:space="preserve">, 80 </w:t>
+      </w:r>
+      <w:proofErr w:type="spellStart"/>
+      <w:r>
+        <w:rPr>
+          <w:rFonts w:eastAsia="Times New Roman" w:cs="Times New Roman"/>
+        </w:rPr>
+        <w:t>Zepto</w:t>
+      </w:r>
+      <w:proofErr w:type="spellEnd"/>
+      <w:r>
+        <w:rPr>
+          <w:rFonts w:eastAsia="Times New Roman" w:cs="Times New Roman"/>
+        </w:rPr>
+        <w:t>, and 5 who work both platforms.</w:t>
       </w:r>
     </w:p>
     <w:p>
@@ -7870,6 +9526,7 @@
             <w:pPr>
               <w:spacing w:before="20" w:after="20"/>
             </w:pPr>
+            <w:proofErr w:type="spellStart"/>
             <w:r>
               <w:rPr>
                 <w:rFonts w:eastAsia="Times New Roman" w:cs="Times New Roman"/>
@@ -7877,6 +9534,7 @@
               </w:rPr>
               <w:t>HistGradientBoosting</w:t>
             </w:r>
+            <w:proofErr w:type="spellEnd"/>
           </w:p>
         </w:tc>
         <w:tc>
@@ -7979,6 +9637,7 @@
             <w:pPr>
               <w:spacing w:before="20" w:after="20"/>
             </w:pPr>
+            <w:proofErr w:type="spellStart"/>
             <w:r>
               <w:rPr>
                 <w:rFonts w:eastAsia="Times New Roman" w:cs="Times New Roman"/>
@@ -7986,6 +9645,7 @@
               </w:rPr>
               <w:t>RandomForest</w:t>
             </w:r>
+            <w:proofErr w:type="spellEnd"/>
           </w:p>
         </w:tc>
         <w:tc>
@@ -8088,6 +9748,7 @@
             <w:pPr>
               <w:spacing w:before="20" w:after="20"/>
             </w:pPr>
+            <w:proofErr w:type="spellStart"/>
             <w:r>
               <w:rPr>
                 <w:rFonts w:eastAsia="Times New Roman" w:cs="Times New Roman"/>
@@ -8095,6 +9756,7 @@
               </w:rPr>
               <w:t>RandomForest</w:t>
             </w:r>
+            <w:proofErr w:type="spellEnd"/>
           </w:p>
         </w:tc>
         <w:tc>
@@ -8197,6 +9859,7 @@
             <w:pPr>
               <w:spacing w:before="20" w:after="20"/>
             </w:pPr>
+            <w:proofErr w:type="spellStart"/>
             <w:r>
               <w:rPr>
                 <w:rFonts w:eastAsia="Times New Roman" w:cs="Times New Roman"/>
@@ -8204,6 +9867,7 @@
               </w:rPr>
               <w:t>ExtraTrees</w:t>
             </w:r>
+            <w:proofErr w:type="spellEnd"/>
           </w:p>
         </w:tc>
         <w:tc>
@@ -8306,6 +9970,7 @@
             <w:pPr>
               <w:spacing w:before="20" w:after="20"/>
             </w:pPr>
+            <w:proofErr w:type="spellStart"/>
             <w:r>
               <w:rPr>
                 <w:rFonts w:eastAsia="Times New Roman" w:cs="Times New Roman"/>
@@ -8313,6 +9978,7 @@
               </w:rPr>
               <w:t>RandomForest</w:t>
             </w:r>
+            <w:proofErr w:type="spellEnd"/>
           </w:p>
         </w:tc>
         <w:tc>
@@ -8415,6 +10081,7 @@
             <w:pPr>
               <w:spacing w:before="20" w:after="20"/>
             </w:pPr>
+            <w:proofErr w:type="spellStart"/>
             <w:r>
               <w:rPr>
                 <w:rFonts w:eastAsia="Times New Roman" w:cs="Times New Roman"/>
@@ -8422,6 +10089,7 @@
               </w:rPr>
               <w:t>HistGradientBoosting</w:t>
             </w:r>
+            <w:proofErr w:type="spellEnd"/>
           </w:p>
         </w:tc>
         <w:tc>
@@ -8523,7 +10191,35 @@
         <w:rPr>
           <w:rFonts w:eastAsia="Times New Roman" w:cs="Times New Roman"/>
         </w:rPr>
-        <w:t>The five survey-derived factors land between 58 and 62 percent cross-validation accuracy with macro AUC in the 71 to 76 percent range. Posture reaches 97 percent accuracy and 98 percent macro AUC because it is the only model that receives real observation inputs (the 11 RULA components and 8 QEC scores) on top of the survey features.</w:t>
+        <w:t xml:space="preserve">The five survey-derived factors land between 58 and 62 percent cross-validation accuracy with </w:t>
+      </w:r>
+      <w:proofErr w:type="gramStart"/>
+      <w:r>
+        <w:rPr>
+          <w:rFonts w:eastAsia="Times New Roman" w:cs="Times New Roman"/>
+        </w:rPr>
+        <w:t>macro AUC</w:t>
+      </w:r>
+      <w:proofErr w:type="gramEnd"/>
+      <w:r>
+        <w:rPr>
+          <w:rFonts w:eastAsia="Times New Roman" w:cs="Times New Roman"/>
+        </w:rPr>
+        <w:t xml:space="preserve"> in the 71 to 76 percent range. Posture reaches 97 percent accuracy and 98 percent </w:t>
+      </w:r>
+      <w:proofErr w:type="gramStart"/>
+      <w:r>
+        <w:rPr>
+          <w:rFonts w:eastAsia="Times New Roman" w:cs="Times New Roman"/>
+        </w:rPr>
+        <w:t>macro AUC</w:t>
+      </w:r>
+      <w:proofErr w:type="gramEnd"/>
+      <w:r>
+        <w:rPr>
+          <w:rFonts w:eastAsia="Times New Roman" w:cs="Times New Roman"/>
+        </w:rPr>
+        <w:t xml:space="preserve"> because it is the only model that receives real observation inputs (the 11 RULA components and 8 QEC scores) on top of the survey features.</w:t>
       </w:r>
     </w:p>
     <w:p>
@@ -11438,6 +13134,7 @@
             <w:pPr>
               <w:spacing w:before="20" w:after="20"/>
             </w:pPr>
+            <w:proofErr w:type="spellStart"/>
             <w:r>
               <w:rPr>
                 <w:rFonts w:eastAsia="Times New Roman" w:cs="Times New Roman"/>
@@ -11445,6 +13142,7 @@
               </w:rPr>
               <w:t>HistGBM</w:t>
             </w:r>
+            <w:proofErr w:type="spellEnd"/>
           </w:p>
         </w:tc>
         <w:tc>
@@ -11455,12 +13153,37 @@
             <w:pPr>
               <w:spacing w:before="20" w:after="20"/>
             </w:pPr>
-            <w:r>
-              <w:rPr>
-                <w:rFonts w:eastAsia="Times New Roman" w:cs="Times New Roman"/>
-                <w:sz w:val="20"/>
-              </w:rPr>
-              <w:t>max_depth=None, learning_rate=0.05</w:t>
+            <w:proofErr w:type="spellStart"/>
+            <w:r>
+              <w:rPr>
+                <w:rFonts w:eastAsia="Times New Roman" w:cs="Times New Roman"/>
+                <w:sz w:val="20"/>
+              </w:rPr>
+              <w:t>max_depth</w:t>
+            </w:r>
+            <w:proofErr w:type="spellEnd"/>
+            <w:r>
+              <w:rPr>
+                <w:rFonts w:eastAsia="Times New Roman" w:cs="Times New Roman"/>
+                <w:sz w:val="20"/>
+              </w:rPr>
+              <w:t xml:space="preserve">=None, </w:t>
+            </w:r>
+            <w:proofErr w:type="spellStart"/>
+            <w:r>
+              <w:rPr>
+                <w:rFonts w:eastAsia="Times New Roman" w:cs="Times New Roman"/>
+                <w:sz w:val="20"/>
+              </w:rPr>
+              <w:t>learning_rate</w:t>
+            </w:r>
+            <w:proofErr w:type="spellEnd"/>
+            <w:r>
+              <w:rPr>
+                <w:rFonts w:eastAsia="Times New Roman" w:cs="Times New Roman"/>
+                <w:sz w:val="20"/>
+              </w:rPr>
+              <w:t>=0.05</w:t>
             </w:r>
           </w:p>
         </w:tc>
@@ -11513,6 +13236,7 @@
             <w:pPr>
               <w:spacing w:before="20" w:after="20"/>
             </w:pPr>
+            <w:proofErr w:type="spellStart"/>
             <w:r>
               <w:rPr>
                 <w:rFonts w:eastAsia="Times New Roman" w:cs="Times New Roman"/>
@@ -11520,6 +13244,7 @@
               </w:rPr>
               <w:t>RandomForest</w:t>
             </w:r>
+            <w:proofErr w:type="spellEnd"/>
           </w:p>
         </w:tc>
         <w:tc>
@@ -11530,12 +13255,37 @@
             <w:pPr>
               <w:spacing w:before="20" w:after="20"/>
             </w:pPr>
-            <w:r>
-              <w:rPr>
-                <w:rFonts w:eastAsia="Times New Roman" w:cs="Times New Roman"/>
-                <w:sz w:val="20"/>
-              </w:rPr>
-              <w:t>n_estimators=300, max_depth=None</w:t>
+            <w:proofErr w:type="spellStart"/>
+            <w:r>
+              <w:rPr>
+                <w:rFonts w:eastAsia="Times New Roman" w:cs="Times New Roman"/>
+                <w:sz w:val="20"/>
+              </w:rPr>
+              <w:t>n_estimators</w:t>
+            </w:r>
+            <w:proofErr w:type="spellEnd"/>
+            <w:r>
+              <w:rPr>
+                <w:rFonts w:eastAsia="Times New Roman" w:cs="Times New Roman"/>
+                <w:sz w:val="20"/>
+              </w:rPr>
+              <w:t xml:space="preserve">=300, </w:t>
+            </w:r>
+            <w:proofErr w:type="spellStart"/>
+            <w:r>
+              <w:rPr>
+                <w:rFonts w:eastAsia="Times New Roman" w:cs="Times New Roman"/>
+                <w:sz w:val="20"/>
+              </w:rPr>
+              <w:t>max_depth</w:t>
+            </w:r>
+            <w:proofErr w:type="spellEnd"/>
+            <w:r>
+              <w:rPr>
+                <w:rFonts w:eastAsia="Times New Roman" w:cs="Times New Roman"/>
+                <w:sz w:val="20"/>
+              </w:rPr>
+              <w:t>=None</w:t>
             </w:r>
           </w:p>
         </w:tc>
@@ -11588,6 +13338,7 @@
             <w:pPr>
               <w:spacing w:before="20" w:after="20"/>
             </w:pPr>
+            <w:proofErr w:type="spellStart"/>
             <w:r>
               <w:rPr>
                 <w:rFonts w:eastAsia="Times New Roman" w:cs="Times New Roman"/>
@@ -11595,6 +13346,7 @@
               </w:rPr>
               <w:t>RandomForest</w:t>
             </w:r>
+            <w:proofErr w:type="spellEnd"/>
           </w:p>
         </w:tc>
         <w:tc>
@@ -11605,12 +13357,37 @@
             <w:pPr>
               <w:spacing w:before="20" w:after="20"/>
             </w:pPr>
-            <w:r>
-              <w:rPr>
-                <w:rFonts w:eastAsia="Times New Roman" w:cs="Times New Roman"/>
-                <w:sz w:val="20"/>
-              </w:rPr>
-              <w:t>n_estimators=500, max_depth=5</w:t>
+            <w:proofErr w:type="spellStart"/>
+            <w:r>
+              <w:rPr>
+                <w:rFonts w:eastAsia="Times New Roman" w:cs="Times New Roman"/>
+                <w:sz w:val="20"/>
+              </w:rPr>
+              <w:t>n_estimators</w:t>
+            </w:r>
+            <w:proofErr w:type="spellEnd"/>
+            <w:r>
+              <w:rPr>
+                <w:rFonts w:eastAsia="Times New Roman" w:cs="Times New Roman"/>
+                <w:sz w:val="20"/>
+              </w:rPr>
+              <w:t xml:space="preserve">=500, </w:t>
+            </w:r>
+            <w:proofErr w:type="spellStart"/>
+            <w:r>
+              <w:rPr>
+                <w:rFonts w:eastAsia="Times New Roman" w:cs="Times New Roman"/>
+                <w:sz w:val="20"/>
+              </w:rPr>
+              <w:t>max_depth</w:t>
+            </w:r>
+            <w:proofErr w:type="spellEnd"/>
+            <w:r>
+              <w:rPr>
+                <w:rFonts w:eastAsia="Times New Roman" w:cs="Times New Roman"/>
+                <w:sz w:val="20"/>
+              </w:rPr>
+              <w:t>=5</w:t>
             </w:r>
           </w:p>
         </w:tc>
@@ -11663,6 +13440,7 @@
             <w:pPr>
               <w:spacing w:before="20" w:after="20"/>
             </w:pPr>
+            <w:proofErr w:type="spellStart"/>
             <w:r>
               <w:rPr>
                 <w:rFonts w:eastAsia="Times New Roman" w:cs="Times New Roman"/>
@@ -11670,6 +13448,7 @@
               </w:rPr>
               <w:t>ExtraTrees</w:t>
             </w:r>
+            <w:proofErr w:type="spellEnd"/>
           </w:p>
         </w:tc>
         <w:tc>
@@ -11680,12 +13459,37 @@
             <w:pPr>
               <w:spacing w:before="20" w:after="20"/>
             </w:pPr>
-            <w:r>
-              <w:rPr>
-                <w:rFonts w:eastAsia="Times New Roman" w:cs="Times New Roman"/>
-                <w:sz w:val="20"/>
-              </w:rPr>
-              <w:t>n_estimators=300, max_depth=None</w:t>
+            <w:proofErr w:type="spellStart"/>
+            <w:r>
+              <w:rPr>
+                <w:rFonts w:eastAsia="Times New Roman" w:cs="Times New Roman"/>
+                <w:sz w:val="20"/>
+              </w:rPr>
+              <w:t>n_estimators</w:t>
+            </w:r>
+            <w:proofErr w:type="spellEnd"/>
+            <w:r>
+              <w:rPr>
+                <w:rFonts w:eastAsia="Times New Roman" w:cs="Times New Roman"/>
+                <w:sz w:val="20"/>
+              </w:rPr>
+              <w:t xml:space="preserve">=300, </w:t>
+            </w:r>
+            <w:proofErr w:type="spellStart"/>
+            <w:r>
+              <w:rPr>
+                <w:rFonts w:eastAsia="Times New Roman" w:cs="Times New Roman"/>
+                <w:sz w:val="20"/>
+              </w:rPr>
+              <w:t>max_depth</w:t>
+            </w:r>
+            <w:proofErr w:type="spellEnd"/>
+            <w:r>
+              <w:rPr>
+                <w:rFonts w:eastAsia="Times New Roman" w:cs="Times New Roman"/>
+                <w:sz w:val="20"/>
+              </w:rPr>
+              <w:t>=None</w:t>
             </w:r>
           </w:p>
         </w:tc>
@@ -11738,6 +13542,7 @@
             <w:pPr>
               <w:spacing w:before="20" w:after="20"/>
             </w:pPr>
+            <w:proofErr w:type="spellStart"/>
             <w:r>
               <w:rPr>
                 <w:rFonts w:eastAsia="Times New Roman" w:cs="Times New Roman"/>
@@ -11745,6 +13550,7 @@
               </w:rPr>
               <w:t>RandomForest</w:t>
             </w:r>
+            <w:proofErr w:type="spellEnd"/>
           </w:p>
         </w:tc>
         <w:tc>
@@ -11755,12 +13561,37 @@
             <w:pPr>
               <w:spacing w:before="20" w:after="20"/>
             </w:pPr>
-            <w:r>
-              <w:rPr>
-                <w:rFonts w:eastAsia="Times New Roman" w:cs="Times New Roman"/>
-                <w:sz w:val="20"/>
-              </w:rPr>
-              <w:t>n_estimators=500, max_depth=None</w:t>
+            <w:proofErr w:type="spellStart"/>
+            <w:r>
+              <w:rPr>
+                <w:rFonts w:eastAsia="Times New Roman" w:cs="Times New Roman"/>
+                <w:sz w:val="20"/>
+              </w:rPr>
+              <w:t>n_estimators</w:t>
+            </w:r>
+            <w:proofErr w:type="spellEnd"/>
+            <w:r>
+              <w:rPr>
+                <w:rFonts w:eastAsia="Times New Roman" w:cs="Times New Roman"/>
+                <w:sz w:val="20"/>
+              </w:rPr>
+              <w:t xml:space="preserve">=500, </w:t>
+            </w:r>
+            <w:proofErr w:type="spellStart"/>
+            <w:r>
+              <w:rPr>
+                <w:rFonts w:eastAsia="Times New Roman" w:cs="Times New Roman"/>
+                <w:sz w:val="20"/>
+              </w:rPr>
+              <w:t>max_depth</w:t>
+            </w:r>
+            <w:proofErr w:type="spellEnd"/>
+            <w:r>
+              <w:rPr>
+                <w:rFonts w:eastAsia="Times New Roman" w:cs="Times New Roman"/>
+                <w:sz w:val="20"/>
+              </w:rPr>
+              <w:t>=None</w:t>
             </w:r>
           </w:p>
         </w:tc>
@@ -11813,6 +13644,7 @@
             <w:pPr>
               <w:spacing w:before="20" w:after="20"/>
             </w:pPr>
+            <w:proofErr w:type="spellStart"/>
             <w:r>
               <w:rPr>
                 <w:rFonts w:eastAsia="Times New Roman" w:cs="Times New Roman"/>
@@ -11820,6 +13652,7 @@
               </w:rPr>
               <w:t>HistGBM</w:t>
             </w:r>
+            <w:proofErr w:type="spellEnd"/>
           </w:p>
         </w:tc>
         <w:tc>
@@ -11830,12 +13663,37 @@
             <w:pPr>
               <w:spacing w:before="20" w:after="20"/>
             </w:pPr>
-            <w:r>
-              <w:rPr>
-                <w:rFonts w:eastAsia="Times New Roman" w:cs="Times New Roman"/>
-                <w:sz w:val="20"/>
-              </w:rPr>
-              <w:t>max_depth=5, learning_rate=0.05</w:t>
+            <w:proofErr w:type="spellStart"/>
+            <w:r>
+              <w:rPr>
+                <w:rFonts w:eastAsia="Times New Roman" w:cs="Times New Roman"/>
+                <w:sz w:val="20"/>
+              </w:rPr>
+              <w:t>max_depth</w:t>
+            </w:r>
+            <w:proofErr w:type="spellEnd"/>
+            <w:r>
+              <w:rPr>
+                <w:rFonts w:eastAsia="Times New Roman" w:cs="Times New Roman"/>
+                <w:sz w:val="20"/>
+              </w:rPr>
+              <w:t xml:space="preserve">=5, </w:t>
+            </w:r>
+            <w:proofErr w:type="spellStart"/>
+            <w:r>
+              <w:rPr>
+                <w:rFonts w:eastAsia="Times New Roman" w:cs="Times New Roman"/>
+                <w:sz w:val="20"/>
+              </w:rPr>
+              <w:t>learning_rate</w:t>
+            </w:r>
+            <w:proofErr w:type="spellEnd"/>
+            <w:r>
+              <w:rPr>
+                <w:rFonts w:eastAsia="Times New Roman" w:cs="Times New Roman"/>
+                <w:sz w:val="20"/>
+              </w:rPr>
+              <w:t>=0.05</w:t>
             </w:r>
           </w:p>
         </w:tc>
@@ -11875,7 +13733,27 @@
           <w:color w:val="000000"/>
           <w:sz w:val="18"/>
         </w:rPr>
-        <w:t>Table 4.8: Winning hyperparameters per target after GridSearchCV.</w:t>
+        <w:t xml:space="preserve">Table 4.8: Winning hyperparameters per target after </w:t>
+      </w:r>
+      <w:proofErr w:type="spellStart"/>
+      <w:r>
+        <w:rPr>
+          <w:rFonts w:eastAsia="Times New Roman" w:cs="Times New Roman"/>
+          <w:i/>
+          <w:color w:val="000000"/>
+          <w:sz w:val="18"/>
+        </w:rPr>
+        <w:t>GridSearchCV</w:t>
+      </w:r>
+      <w:proofErr w:type="spellEnd"/>
+      <w:r>
+        <w:rPr>
+          <w:rFonts w:eastAsia="Times New Roman" w:cs="Times New Roman"/>
+          <w:i/>
+          <w:color w:val="000000"/>
+          <w:sz w:val="18"/>
+        </w:rPr>
+        <w:t>.</w:t>
       </w:r>
     </w:p>
     <w:p>
@@ -12214,7 +14092,25 @@
           <w:i/>
           <w:sz w:val="18"/>
         </w:rPr>
-        <w:t>Figure 4.13: Web app: predicted risk profile output with colour-coded level cards, radar chart, tabular result, and per-factor recommendations.</w:t>
+        <w:t xml:space="preserve">Figure 4.13: Web app: predicted risk profile output with </w:t>
+      </w:r>
+      <w:proofErr w:type="spellStart"/>
+      <w:r>
+        <w:rPr>
+          <w:rFonts w:eastAsia="Times New Roman" w:cs="Times New Roman"/>
+          <w:i/>
+          <w:sz w:val="18"/>
+        </w:rPr>
+        <w:t>colour</w:t>
+      </w:r>
+      <w:proofErr w:type="spellEnd"/>
+      <w:r>
+        <w:rPr>
+          <w:rFonts w:eastAsia="Times New Roman" w:cs="Times New Roman"/>
+          <w:i/>
+          <w:sz w:val="18"/>
+        </w:rPr>
+        <w:t>-coded level cards, radar chart, tabular result, and per-factor recommendations.</w:t>
       </w:r>
     </w:p>
     <w:p>
@@ -12242,7 +14138,35 @@
         <w:rPr>
           <w:rFonts w:eastAsia="Times New Roman" w:cs="Times New Roman"/>
         </w:rPr>
-        <w:t>This project designed, implemented, and deployed a per-rider ergonomic risk screening pipeline for last-mile quick-commerce delivery workers, turning a 36-item self-report questionnaire and a RULA + QEC observation record into six standardised risk levels across Force, Repetition, Posture, Duration, Contact Stress, and Vibration. The five survey-derived factors land at 58-62 percent cross-validation accuracy with macro AUC between 71 and 76 percent; the Posture model, which receives the RULA and QEC observation inputs directly, reaches 97 percent accuracy and 98 percent AUC. Chi-square identifies Posture, Repetition, and Force as the risk factors significantly associated with self-reported discomfort, and multivariable logistic regression flags age (OR 3.58 per band), job duration (OR 2.89), workload score, and fatigue score as the strongest individual predictors.</w:t>
+        <w:t xml:space="preserve">This project designed, implemented, and deployed a per-rider ergonomic risk screening pipeline for last-mile quick-commerce delivery workers, turning a 36-item self-report questionnaire and a RULA + QEC observation record into six </w:t>
+      </w:r>
+      <w:proofErr w:type="spellStart"/>
+      <w:r>
+        <w:rPr>
+          <w:rFonts w:eastAsia="Times New Roman" w:cs="Times New Roman"/>
+        </w:rPr>
+        <w:t>standardised</w:t>
+      </w:r>
+      <w:proofErr w:type="spellEnd"/>
+      <w:r>
+        <w:rPr>
+          <w:rFonts w:eastAsia="Times New Roman" w:cs="Times New Roman"/>
+        </w:rPr>
+        <w:t xml:space="preserve"> risk levels across Force, Repetition, Posture, Duration, Contact Stress, and Vibration. The five survey-derived factors land at 58-62 percent cross-validation accuracy with </w:t>
+      </w:r>
+      <w:proofErr w:type="gramStart"/>
+      <w:r>
+        <w:rPr>
+          <w:rFonts w:eastAsia="Times New Roman" w:cs="Times New Roman"/>
+        </w:rPr>
+        <w:t>macro AUC</w:t>
+      </w:r>
+      <w:proofErr w:type="gramEnd"/>
+      <w:r>
+        <w:rPr>
+          <w:rFonts w:eastAsia="Times New Roman" w:cs="Times New Roman"/>
+        </w:rPr>
+        <w:t xml:space="preserve"> between 71 and 76 percent; the Posture model, which receives the RULA and QEC observation inputs directly, reaches 97 percent accuracy and 98 percent AUC. Chi-square identifies Posture, Repetition, and Force as the risk factors significantly associated with self-reported discomfort, and multivariable logistic regression flags age (OR 3.58 per band), job duration (OR 2.89), workload score, and fatigue score as the strongest individual predictors.</w:t>
       </w:r>
     </w:p>
     <w:p>
@@ -12254,7 +14178,35 @@
         <w:rPr>
           <w:rFonts w:eastAsia="Times New Roman" w:cs="Times New Roman"/>
         </w:rPr>
-        <w:t>The main limitations are the self-report nature of most input variables, the severity-rank merge used to pair the identifier-less posture xlsx with the survey, and the small sample (n = 182) that keeps ML variance visible. Two methodological corrections were made and openly documented: Repetition binning moved from qcut to fixed cuts to remove a boundary tie that hid the worst real schedule, and vibration_index was added to the Duration exclusion list to remove indirect leakage.</w:t>
+        <w:t xml:space="preserve">The main limitations are the self-report nature of most input variables, the severity-rank merge used to pair the identifier-less posture xlsx with the survey, and the small sample (n = 182) that keeps ML variance visible. Two methodological corrections were made and openly documented: Repetition binning moved from </w:t>
+      </w:r>
+      <w:proofErr w:type="spellStart"/>
+      <w:r>
+        <w:rPr>
+          <w:rFonts w:eastAsia="Times New Roman" w:cs="Times New Roman"/>
+        </w:rPr>
+        <w:t>qcut</w:t>
+      </w:r>
+      <w:proofErr w:type="spellEnd"/>
+      <w:r>
+        <w:rPr>
+          <w:rFonts w:eastAsia="Times New Roman" w:cs="Times New Roman"/>
+        </w:rPr>
+        <w:t xml:space="preserve"> to fixed cuts to remove a boundary tie that hid the worst real schedule, and </w:t>
+      </w:r>
+      <w:proofErr w:type="spellStart"/>
+      <w:r>
+        <w:rPr>
+          <w:rFonts w:eastAsia="Times New Roman" w:cs="Times New Roman"/>
+        </w:rPr>
+        <w:t>vibration_index</w:t>
+      </w:r>
+      <w:proofErr w:type="spellEnd"/>
+      <w:r>
+        <w:rPr>
+          <w:rFonts w:eastAsia="Times New Roman" w:cs="Times New Roman"/>
+        </w:rPr>
+        <w:t xml:space="preserve"> was added to the Duration exclusion list to remove indirect leakage.</w:t>
       </w:r>
     </w:p>
     <w:p>
@@ -12266,7 +14218,21 @@
         <w:rPr>
           <w:rFonts w:eastAsia="Times New Roman" w:cs="Times New Roman"/>
         </w:rPr>
-        <w:t>Five interventions for a delivery-platform operator follow directly from the results: (i) cap daily hours (49 percent of the sample exceeds 8 hours per day); (ii) invest in posture-focused equipment and training (84 percent of observed postures at RULA grand score 5 or above, corresponding to action level 3 or 4); (iii) encourage bike-storage-box carrying over handheld bags; (iv) age-targeted MSD screening for the 36-and-above cohort; and (v) platform-level workload management to reduce the NASA-TLX component of the workload score, a significant discomfort predictor at p = 0.0005.</w:t>
+        <w:t>Five interventions for a delivery-platform operator follow directly from the results: (</w:t>
+      </w:r>
+      <w:proofErr w:type="spellStart"/>
+      <w:r>
+        <w:rPr>
+          <w:rFonts w:eastAsia="Times New Roman" w:cs="Times New Roman"/>
+        </w:rPr>
+        <w:t>i</w:t>
+      </w:r>
+      <w:proofErr w:type="spellEnd"/>
+      <w:r>
+        <w:rPr>
+          <w:rFonts w:eastAsia="Times New Roman" w:cs="Times New Roman"/>
+        </w:rPr>
+        <w:t>) cap daily hours (49 percent of the sample exceeds 8 hours per day); (ii) invest in posture-focused equipment and training (84 percent of observed postures at RULA grand score 5 or above, corresponding to action level 3 or 4); (iii) encourage bike-storage-box carrying over handheld bags; (iv) age-targeted MSD screening for the 36-and-above cohort; and (v) platform-level workload management to reduce the NASA-TLX component of the workload score, a significant discomfort predictor at p = 0.0005.</w:t>
       </w:r>
     </w:p>
     <w:p>
@@ -12305,7 +14271,23 @@
         <w:jc w:val="both"/>
       </w:pPr>
       <w:r>
-        <w:t>[1] Benson TM, Sathiyarajeswaran NS, Radhakrishnan R, Gafoor AA, Krupalakshme M, Samal J (2025). Factors and prevalence of musculoskeletal pain among the app-based food delivery riders in Tamil Nadu: a community-based cross-sectional study. Cureus, 17(3), e56132.</w:t>
+        <w:t xml:space="preserve">[1] Benson TM, </w:t>
+      </w:r>
+      <w:proofErr w:type="spellStart"/>
+      <w:r>
+        <w:t>Sathiyarajeswaran</w:t>
+      </w:r>
+      <w:proofErr w:type="spellEnd"/>
+      <w:r>
+        <w:t xml:space="preserve"> NS, Radhakrishnan R, Gafoor AA, </w:t>
+      </w:r>
+      <w:proofErr w:type="spellStart"/>
+      <w:r>
+        <w:t>Krupalakshme</w:t>
+      </w:r>
+      <w:proofErr w:type="spellEnd"/>
+      <w:r>
+        <w:t xml:space="preserve"> M, Samal J (2025). Factors and prevalence of musculoskeletal pain among the app-based food delivery riders in Tamil Nadu: a community-based cross-sectional study. Cureus, 17(3), e56132.</w:t>
       </w:r>
     </w:p>
     <w:p>
@@ -12345,7 +14327,23 @@
         <w:jc w:val="both"/>
       </w:pPr>
       <w:r>
-        <w:t>[5] Kuorinka I, Jonsson B, Kilbom A, Vinterberg H, Biering-Sorensen F, Andersson G, Jorgensen K (1987). Standardised Nordic questionnaires for the analysis of musculoskeletal symptoms. Applied Ergonomics, 18(3), 233-237.</w:t>
+        <w:t xml:space="preserve">[5] </w:t>
+      </w:r>
+      <w:proofErr w:type="spellStart"/>
+      <w:r>
+        <w:t>Kuorinka</w:t>
+      </w:r>
+      <w:proofErr w:type="spellEnd"/>
+      <w:r>
+        <w:t xml:space="preserve"> I, Jonsson B, Kilbom A, Vinterberg H, Biering-Sorensen F, Andersson G, Jorgensen K (1987). </w:t>
+      </w:r>
+      <w:proofErr w:type="spellStart"/>
+      <w:r>
+        <w:t>Standardised</w:t>
+      </w:r>
+      <w:proofErr w:type="spellEnd"/>
+      <w:r>
+        <w:t xml:space="preserve"> Nordic questionnaires for the analysis of musculoskeletal symptoms. Applied Ergonomics, 18(3), 233-237.</w:t>
       </w:r>
     </w:p>
     <w:p>
@@ -12355,7 +14353,15 @@
         <w:jc w:val="both"/>
       </w:pPr>
       <w:r>
-        <w:t>[6] Hart SG, Staveland LE (1988). Development of NASA-TLX (Task Load Index): Results of empirical and theoretical research. Advances in Psychology, 52, 139-183.</w:t>
+        <w:t xml:space="preserve">[6] Hart SG, </w:t>
+      </w:r>
+      <w:proofErr w:type="spellStart"/>
+      <w:r>
+        <w:t>Staveland</w:t>
+      </w:r>
+      <w:proofErr w:type="spellEnd"/>
+      <w:r>
+        <w:t xml:space="preserve"> LE (1988). Development of NASA-TLX (Task Load Index): Results of empirical and theoretical research. Advances in Psychology, 52, 139-183.</w:t>
       </w:r>
     </w:p>
     <w:p>
@@ -12375,7 +14381,15 @@
         <w:jc w:val="both"/>
       </w:pPr>
       <w:r>
-        <w:t>[8] Chawla NV, Bowyer KW, Hall LO, Kegelmeyer WP (2002). SMOTE: Synthetic Minority Over-sampling Technique. Journal of Artificial Intelligence Research, 16, 321-357.</w:t>
+        <w:t xml:space="preserve">[8] Chawla NV, Bowyer KW, Hall LO, </w:t>
+      </w:r>
+      <w:proofErr w:type="spellStart"/>
+      <w:r>
+        <w:t>Kegelmeyer</w:t>
+      </w:r>
+      <w:proofErr w:type="spellEnd"/>
+      <w:r>
+        <w:t xml:space="preserve"> WP (2002). SMOTE: Synthetic Minority Over-sampling Technique. Journal of Artificial Intelligence Research, 16, 321-357.</w:t>
       </w:r>
     </w:p>
     <w:p>
@@ -12395,7 +14409,15 @@
         <w:jc w:val="both"/>
       </w:pPr>
       <w:r>
-        <w:t>[10] Breiman L (2001). Random Forests. Machine Learning, 45(1), 5-32.</w:t>
+        <w:t xml:space="preserve">[10] </w:t>
+      </w:r>
+      <w:proofErr w:type="spellStart"/>
+      <w:r>
+        <w:t>Breiman</w:t>
+      </w:r>
+      <w:proofErr w:type="spellEnd"/>
+      <w:r>
+        <w:t xml:space="preserve"> L (2001). Random Forests. Machine Learning, 45(1), 5-32.</w:t>
       </w:r>
     </w:p>
     <w:p>
@@ -12405,7 +14427,15 @@
         <w:jc w:val="both"/>
       </w:pPr>
       <w:r>
-        <w:t>[11] Geurts P, Ernst D, Wehenkel L (2006). Extremely randomized trees. Machine Learning, 63(1), 3-42.</w:t>
+        <w:t xml:space="preserve">[11] Geurts P, Ernst D, </w:t>
+      </w:r>
+      <w:proofErr w:type="spellStart"/>
+      <w:r>
+        <w:t>Wehenkel</w:t>
+      </w:r>
+      <w:proofErr w:type="spellEnd"/>
+      <w:r>
+        <w:t xml:space="preserve"> L (2006). Extremely randomized trees. Machine Learning, 63(1), 3-42.</w:t>
       </w:r>
     </w:p>
     <w:p>
@@ -12415,7 +14445,23 @@
         <w:jc w:val="both"/>
       </w:pPr>
       <w:r>
-        <w:t>[12] Chen T, Guestrin C (2016). XGBoost: A Scalable Tree Boosting System. Proceedings of the 22nd ACM SIGKDD International Conference on Knowledge Discovery and Data Mining, 785-794.</w:t>
+        <w:t xml:space="preserve">[12] Chen T, </w:t>
+      </w:r>
+      <w:proofErr w:type="spellStart"/>
+      <w:r>
+        <w:t>Guestrin</w:t>
+      </w:r>
+      <w:proofErr w:type="spellEnd"/>
+      <w:r>
+        <w:t xml:space="preserve"> C (2016). </w:t>
+      </w:r>
+      <w:proofErr w:type="spellStart"/>
+      <w:r>
+        <w:t>XGBoost</w:t>
+      </w:r>
+      <w:proofErr w:type="spellEnd"/>
+      <w:r>
+        <w:t>: A Scalable Tree Boosting System. Proceedings of the 22nd ACM SIGKDD International Conference on Knowledge Discovery and Data Mining, 785-794.</w:t>
       </w:r>
     </w:p>
     <w:p>
@@ -12435,7 +14481,23 @@
         <w:jc w:val="both"/>
       </w:pPr>
       <w:r>
-        <w:t>[14] Pedregosa F, Varoquaux G, Gramfort A, et al. (2011). Scikit-learn: Machine Learning in Python. Journal of Machine Learning Research, 12, 2825-2830.</w:t>
+        <w:t xml:space="preserve">[14] Pedregosa F, </w:t>
+      </w:r>
+      <w:proofErr w:type="spellStart"/>
+      <w:r>
+        <w:t>Varoquaux</w:t>
+      </w:r>
+      <w:proofErr w:type="spellEnd"/>
+      <w:r>
+        <w:t xml:space="preserve"> G, </w:t>
+      </w:r>
+      <w:proofErr w:type="spellStart"/>
+      <w:r>
+        <w:t>Gramfort</w:t>
+      </w:r>
+      <w:proofErr w:type="spellEnd"/>
+      <w:r>
+        <w:t xml:space="preserve"> A, et al. (2011). Scikit-learn: Machine Learning in Python. Journal of Machine Learning Research, 12, 2825-2830.</w:t>
       </w:r>
     </w:p>
     <w:sectPr>

</xml_diff>

<commit_message>
report.docx: fix "multivariable" -> "per-predictor (univariable)" logistic regression wording
Code (notebooks/05_stats.ipynb Step 5) loops sm.Logit one predictor at
a time - these are univariable regressions, not a multivariable model.
Report was calling them "multivariable ... controlling for the others"
which mis-describes what the code actually does.

Updated in five locations:
- Table 4.3 caption (both LoT entry and body caption)
- section 4.2 methods paragraph
- section 4.3 results paragraph before Table 4.3
- Chapter 5 conclusion paragraph

All OR/CI/p values preserved; only the univariable-vs-multivariable
wording changed. Verified 0 remaining "multivariable" or "controlling
for" mentions in the doc.
</commit_message>
<xml_diff>
--- a/docs/report.docx
+++ b/docs/report.docx
@@ -2255,7 +2255,7 @@
           <w:rFonts w:eastAsia="Times New Roman" w:cs="Times New Roman"/>
         </w:rPr>
         <w:tab/>
-        <w:t>Significant predictors of discomfort from multivariable logistic regression.</w:t>
+        <w:t>Significant predictors of discomfort from per-predictor (univariable) logistic regression.</w:t>
       </w:r>
       <w:r>
         <w:rPr>
@@ -5976,7 +5976,7 @@
         <w:rPr>
           <w:rFonts w:eastAsia="Times New Roman" w:cs="Times New Roman"/>
         </w:rPr>
-        <w:t xml:space="preserve">Two independent statistical analyses were run in 05_stats on the model-ready CSV. First, six chi-square tests of independence checked whether each Stage-1 risk-factor band was associated with a binary discomfort outcome; the tests reported chi2, degrees of freedom, and a raw p-value. Second, a multivariable logistic regression fitted with </w:t>
+        <w:t xml:space="preserve">Two independent statistical analyses were run in 05_stats on the model-ready CSV. First, six chi-square tests of independence checked whether each Stage-1 risk-factor band was associated with a binary discomfort outcome; the tests reported chi2, degrees of freedom, and a raw p-value. Second, a per-predictor (univariable) logistic regression fitted with </w:t>
       </w:r>
       <w:proofErr w:type="spellStart"/>
       <w:r>
@@ -7985,8 +7985,7 @@
         <w:rPr>
           <w:rFonts w:eastAsia="Times New Roman" w:cs="Times New Roman"/>
         </w:rPr>
-        <w:lastRenderedPageBreak/>
-        <w:t>The multivariable logistic regression identifies seven significant individual predictors of discomfort while controlling for the others. Age is the strongest: each step up in the age band multiplies the odds of discomfort by 3.58 (95 percent CI 1.70 to 7.56, p = 0.0008).</w:t>
+        <w:t>The per-predictor (univariable) logistic regressions identify seven predictors as individually significant. Age is the strongest: each step up in the age band multiplies the odds of discomfort by 3.58 (95 percent CI 1.70 to 7.56, p = 0.0008).</w:t>
       </w:r>
     </w:p>
     <w:tbl>
@@ -8628,7 +8627,7 @@
           <w:color w:val="000000"/>
           <w:sz w:val="18"/>
         </w:rPr>
-        <w:t>Table 4.3: Significant predictors of discomfort from multivariable logistic regression.</w:t>
+        <w:t>Table 4.3: Significant predictors of discomfort from per-predictor (univariable) logistic regression.</w:t>
       </w:r>
     </w:p>
     <w:p>
@@ -14166,7 +14165,7 @@
         <w:rPr>
           <w:rFonts w:eastAsia="Times New Roman" w:cs="Times New Roman"/>
         </w:rPr>
-        <w:t xml:space="preserve"> between 71 and 76 percent; the Posture model, which receives the RULA and QEC observation inputs directly, reaches 97 percent accuracy and 98 percent AUC. Chi-square identifies Posture, Repetition, and Force as the risk factors significantly associated with self-reported discomfort, and multivariable logistic regression flags age (OR 3.58 per band), job duration (OR 2.89), workload score, and fatigue score as the strongest individual predictors.</w:t>
+        <w:t xml:space="preserve"> between 71 and 76 percent; the Posture model, which receives the RULA and QEC observation inputs directly, reaches 97 percent accuracy and 98 percent AUC. Chi-square identifies Posture, Repetition, and Force as the risk factors significantly associated with self-reported discomfort, and per-predictor (univariable) logistic regression flags age (OR 3.58 per band), job duration (OR 2.89), workload score, and fatigue score as the strongest individual predictors.</w:t>
       </w:r>
     </w:p>
     <w:p>

</xml_diff>